<commit_message>
Update na documetação (correção dos valores em "Recursos")
</commit_message>
<xml_diff>
--- a/Documentação/documentacao/documentacao_vooh.docx
+++ b/Documentação/documentacao/documentacao_vooh.docx
@@ -1,11 +1,12 @@
 
 <file path=word/document.xml><?xml version="1.0" encoding="utf-8"?>
-<w:document xmlns:wpc="http://schemas.microsoft.com/office/word/2010/wordprocessingCanvas" xmlns:cx="http://schemas.microsoft.com/office/drawing/2014/chartex" xmlns:cx1="http://schemas.microsoft.com/office/drawing/2015/9/8/chartex" xmlns:cx2="http://schemas.microsoft.com/office/drawing/2015/10/21/chartex" xmlns:cx3="http://schemas.microsoft.com/office/drawing/2016/5/9/chartex" xmlns:cx4="http://schemas.microsoft.com/office/drawing/2016/5/10/chartex" xmlns:cx5="http://schemas.microsoft.com/office/drawing/2016/5/11/chartex" xmlns:cx6="http://schemas.microsoft.com/office/drawing/2016/5/12/chartex" xmlns:cx7="http://schemas.microsoft.com/office/drawing/2016/5/13/chartex" xmlns:cx8="http://schemas.microsoft.com/office/drawing/2016/5/14/chartex" xmlns:mc="http://schemas.openxmlformats.org/markup-compatibility/2006" xmlns:aink="http://schemas.microsoft.com/office/drawing/2016/ink" xmlns:am3d="http://schemas.microsoft.com/office/drawing/2017/model3d" xmlns:o="urn:schemas-microsoft-com:office:office" xmlns:r="http://schemas.openxmlformats.org/officeDocument/2006/relationships" xmlns:m="http://schemas.openxmlformats.org/officeDocument/2006/math" xmlns:v="urn:schemas-microsoft-com:vml" xmlns:wp14="http://schemas.microsoft.com/office/word/2010/wordprocessingDrawing" xmlns:wp="http://schemas.openxmlformats.org/drawingml/2006/wordprocessingDrawing" xmlns:w10="urn:schemas-microsoft-com:office:word" xmlns:w="http://schemas.openxmlformats.org/wordprocessingml/2006/main" xmlns:w14="http://schemas.microsoft.com/office/word/2010/wordml" xmlns:w15="http://schemas.microsoft.com/office/word/2012/wordml" xmlns:w16cex="http://schemas.microsoft.com/office/word/2018/wordml/cex" xmlns:w16cid="http://schemas.microsoft.com/office/word/2016/wordml/cid" xmlns:w16="http://schemas.microsoft.com/office/word/2018/wordml" xmlns:w16sdtdh="http://schemas.microsoft.com/office/word/2020/wordml/sdtdatahash" xmlns:w16se="http://schemas.microsoft.com/office/word/2015/wordml/symex" xmlns:wpg="http://schemas.microsoft.com/office/word/2010/wordprocessingGroup" xmlns:wpi="http://schemas.microsoft.com/office/word/2010/wordprocessingInk" xmlns:wne="http://schemas.microsoft.com/office/word/2006/wordml" xmlns:wps="http://schemas.microsoft.com/office/word/2010/wordprocessingShape" mc:Ignorable="w14 w15 w16se w16cid w16 w16cex w16sdtdh wp14">
+<w:document xmlns:wpc="http://schemas.microsoft.com/office/word/2010/wordprocessingCanvas" xmlns:cx="http://schemas.microsoft.com/office/drawing/2014/chartex" xmlns:cx1="http://schemas.microsoft.com/office/drawing/2015/9/8/chartex" xmlns:cx2="http://schemas.microsoft.com/office/drawing/2015/10/21/chartex" xmlns:cx3="http://schemas.microsoft.com/office/drawing/2016/5/9/chartex" xmlns:cx4="http://schemas.microsoft.com/office/drawing/2016/5/10/chartex" xmlns:cx5="http://schemas.microsoft.com/office/drawing/2016/5/11/chartex" xmlns:cx6="http://schemas.microsoft.com/office/drawing/2016/5/12/chartex" xmlns:cx7="http://schemas.microsoft.com/office/drawing/2016/5/13/chartex" xmlns:cx8="http://schemas.microsoft.com/office/drawing/2016/5/14/chartex" xmlns:mc="http://schemas.openxmlformats.org/markup-compatibility/2006" xmlns:aink="http://schemas.microsoft.com/office/drawing/2016/ink" xmlns:am3d="http://schemas.microsoft.com/office/drawing/2017/model3d" xmlns:o="urn:schemas-microsoft-com:office:office" xmlns:oel="http://schemas.microsoft.com/office/2019/extlst" xmlns:r="http://schemas.openxmlformats.org/officeDocument/2006/relationships" xmlns:m="http://schemas.openxmlformats.org/officeDocument/2006/math" xmlns:v="urn:schemas-microsoft-com:vml" xmlns:wp14="http://schemas.microsoft.com/office/word/2010/wordprocessingDrawing" xmlns:wp="http://schemas.openxmlformats.org/drawingml/2006/wordprocessingDrawing" xmlns:w10="urn:schemas-microsoft-com:office:word" xmlns:w="http://schemas.openxmlformats.org/wordprocessingml/2006/main" xmlns:w14="http://schemas.microsoft.com/office/word/2010/wordml" xmlns:w15="http://schemas.microsoft.com/office/word/2012/wordml" xmlns:w16cex="http://schemas.microsoft.com/office/word/2018/wordml/cex" xmlns:w16cid="http://schemas.microsoft.com/office/word/2016/wordml/cid" xmlns:w16="http://schemas.microsoft.com/office/word/2018/wordml" xmlns:w16sdtdh="http://schemas.microsoft.com/office/word/2020/wordml/sdtdatahash" xmlns:w16se="http://schemas.microsoft.com/office/word/2015/wordml/symex" xmlns:wpg="http://schemas.microsoft.com/office/word/2010/wordprocessingGroup" xmlns:wpi="http://schemas.microsoft.com/office/word/2010/wordprocessingInk" xmlns:wne="http://schemas.microsoft.com/office/word/2006/wordml" xmlns:wps="http://schemas.microsoft.com/office/word/2010/wordprocessingShape" mc:Ignorable="w14 w15 w16se w16cid w16 w16cex w16sdtdh wp14">
   <w:body>
     <w:p>
       <w:pPr>
         <w:jc w:val="center"/>
         <w:rPr>
+          <w:rFonts w:hint="eastAsia"/>
           <w:color w:val="000000" w:themeColor="text1"/>
           <w:sz w:val="44"/>
           <w:szCs w:val="44"/>
@@ -86,6 +87,7 @@
       <w:pPr>
         <w:jc w:val="center"/>
         <w:rPr>
+          <w:rFonts w:hint="eastAsia"/>
           <w:color w:val="000000" w:themeColor="text1"/>
           <w:sz w:val="44"/>
           <w:szCs w:val="44"/>
@@ -126,6 +128,7 @@
       <w:pPr>
         <w:jc w:val="center"/>
         <w:rPr>
+          <w:rFonts w:hint="eastAsia"/>
           <w:color w:val="000000" w:themeColor="text1"/>
           <w:sz w:val="44"/>
           <w:szCs w:val="44"/>
@@ -136,6 +139,7 @@
       <w:pPr>
         <w:jc w:val="center"/>
         <w:rPr>
+          <w:rFonts w:hint="eastAsia"/>
           <w:color w:val="000000" w:themeColor="text1"/>
           <w:sz w:val="44"/>
           <w:szCs w:val="44"/>
@@ -146,6 +150,7 @@
       <w:pPr>
         <w:jc w:val="center"/>
         <w:rPr>
+          <w:rFonts w:hint="eastAsia"/>
           <w:color w:val="000000" w:themeColor="text1"/>
           <w:sz w:val="44"/>
           <w:szCs w:val="44"/>
@@ -156,6 +161,7 @@
       <w:pPr>
         <w:jc w:val="center"/>
         <w:rPr>
+          <w:rFonts w:hint="eastAsia"/>
           <w:color w:val="000000" w:themeColor="text1"/>
           <w:sz w:val="44"/>
           <w:szCs w:val="44"/>
@@ -166,6 +172,7 @@
       <w:pPr>
         <w:jc w:val="center"/>
         <w:rPr>
+          <w:rFonts w:hint="eastAsia"/>
           <w:color w:val="000000" w:themeColor="text1"/>
           <w:sz w:val="44"/>
           <w:szCs w:val="44"/>
@@ -177,6 +184,7 @@
         <w:spacing w:line="279" w:lineRule="auto"/>
         <w:jc w:val="center"/>
         <w:rPr>
+          <w:rFonts w:hint="eastAsia"/>
           <w:b/>
           <w:bCs/>
           <w:color w:val="000000" w:themeColor="text1"/>
@@ -199,6 +207,7 @@
       <w:pPr>
         <w:jc w:val="center"/>
         <w:rPr>
+          <w:rFonts w:hint="eastAsia"/>
           <w:color w:val="000000" w:themeColor="text1"/>
           <w:sz w:val="28"/>
           <w:szCs w:val="28"/>
@@ -217,6 +226,7 @@
       <w:pPr>
         <w:jc w:val="center"/>
         <w:rPr>
+          <w:rFonts w:hint="eastAsia"/>
           <w:color w:val="000000" w:themeColor="text1"/>
         </w:rPr>
       </w:pPr>
@@ -225,6 +235,7 @@
       <w:pPr>
         <w:jc w:val="center"/>
         <w:rPr>
+          <w:rFonts w:hint="eastAsia"/>
           <w:color w:val="000000" w:themeColor="text1"/>
         </w:rPr>
       </w:pPr>
@@ -233,6 +244,7 @@
       <w:pPr>
         <w:jc w:val="center"/>
         <w:rPr>
+          <w:rFonts w:hint="eastAsia"/>
           <w:color w:val="000000" w:themeColor="text1"/>
         </w:rPr>
       </w:pPr>
@@ -241,6 +253,7 @@
       <w:pPr>
         <w:jc w:val="center"/>
         <w:rPr>
+          <w:rFonts w:hint="eastAsia"/>
           <w:color w:val="000000" w:themeColor="text1"/>
           <w:sz w:val="32"/>
           <w:szCs w:val="32"/>
@@ -259,6 +272,7 @@
       <w:pPr>
         <w:jc w:val="center"/>
         <w:rPr>
+          <w:rFonts w:hint="eastAsia"/>
           <w:color w:val="000000" w:themeColor="text1"/>
           <w:sz w:val="32"/>
           <w:szCs w:val="32"/>
@@ -301,6 +315,7 @@
       <w:pPr>
         <w:jc w:val="center"/>
         <w:rPr>
+          <w:rFonts w:hint="eastAsia"/>
           <w:color w:val="000000" w:themeColor="text1"/>
           <w:sz w:val="32"/>
           <w:szCs w:val="32"/>
@@ -335,6 +350,7 @@
       <w:pPr>
         <w:jc w:val="center"/>
         <w:rPr>
+          <w:rFonts w:hint="eastAsia"/>
           <w:color w:val="000000" w:themeColor="text1"/>
           <w:sz w:val="32"/>
           <w:szCs w:val="32"/>
@@ -377,6 +393,7 @@
       <w:pPr>
         <w:jc w:val="center"/>
         <w:rPr>
+          <w:rFonts w:hint="eastAsia"/>
           <w:sz w:val="32"/>
           <w:szCs w:val="32"/>
         </w:rPr>
@@ -393,6 +410,7 @@
       <w:pPr>
         <w:jc w:val="center"/>
         <w:rPr>
+          <w:rFonts w:hint="eastAsia"/>
           <w:color w:val="000000" w:themeColor="text1"/>
           <w:sz w:val="32"/>
           <w:szCs w:val="32"/>
@@ -411,6 +429,7 @@
       <w:pPr>
         <w:jc w:val="center"/>
         <w:rPr>
+          <w:rFonts w:hint="eastAsia"/>
           <w:color w:val="000000" w:themeColor="text1"/>
           <w:sz w:val="32"/>
           <w:szCs w:val="32"/>
@@ -421,6 +440,7 @@
       <w:pPr>
         <w:jc w:val="center"/>
         <w:rPr>
+          <w:rFonts w:hint="eastAsia"/>
           <w:color w:val="000000" w:themeColor="text1"/>
         </w:rPr>
       </w:pPr>
@@ -437,6 +457,7 @@
       <w:pPr>
         <w:jc w:val="center"/>
         <w:rPr>
+          <w:rFonts w:hint="eastAsia"/>
           <w:b/>
           <w:bCs/>
           <w:color w:val="000000" w:themeColor="text1"/>
@@ -462,8 +483,12 @@
     <w:p>
       <w:pPr>
         <w:jc w:val="both"/>
-      </w:pPr>
-      <w:r>
+        <w:rPr>
+          <w:rFonts w:hint="eastAsia"/>
+        </w:rPr>
+      </w:pPr>
+      <w:r>
+        <w:lastRenderedPageBreak/>
         <w:br w:type="page"/>
       </w:r>
     </w:p>
@@ -471,6 +496,7 @@
       <w:pPr>
         <w:jc w:val="both"/>
         <w:rPr>
+          <w:rFonts w:hint="eastAsia"/>
           <w:b/>
           <w:bCs/>
           <w:sz w:val="36"/>
@@ -492,6 +518,7 @@
       <w:pPr>
         <w:jc w:val="both"/>
         <w:rPr>
+          <w:rFonts w:hint="eastAsia"/>
           <w:b/>
           <w:bCs/>
           <w:sz w:val="28"/>
@@ -512,6 +539,9 @@
       <w:pPr>
         <w:ind w:firstLine="708"/>
         <w:jc w:val="both"/>
+        <w:rPr>
+          <w:rFonts w:hint="eastAsia"/>
+        </w:rPr>
       </w:pPr>
       <w:r>
         <w:t xml:space="preserve">Digital </w:t>
@@ -547,6 +577,7 @@
       <w:pPr>
         <w:jc w:val="both"/>
         <w:rPr>
+          <w:rFonts w:hint="eastAsia"/>
           <w:b/>
           <w:bCs/>
           <w:sz w:val="28"/>
@@ -567,6 +598,9 @@
       <w:pPr>
         <w:ind w:firstLine="708"/>
         <w:jc w:val="both"/>
+        <w:rPr>
+          <w:rFonts w:hint="eastAsia"/>
+        </w:rPr>
       </w:pPr>
       <w:r>
         <w:t>O Digital Out-of-Home (DOOH) está em</w:t>
@@ -591,6 +625,9 @@
       <w:pPr>
         <w:ind w:firstLine="708"/>
         <w:jc w:val="both"/>
+        <w:rPr>
+          <w:rFonts w:hint="eastAsia"/>
+        </w:rPr>
       </w:pPr>
       <w:r>
         <w:t xml:space="preserve">Dados do mesmo levantamento indicam que o DOOH aumenta a confiança na marca em 13%. Quando o conteúdo publicitário é contextualmente relevante, a eficácia do anúncio cresce em 17%. Além disso, </w:t>
@@ -614,6 +651,9 @@
       <w:pPr>
         <w:ind w:firstLine="708"/>
         <w:jc w:val="both"/>
+        <w:rPr>
+          <w:rFonts w:hint="eastAsia"/>
+        </w:rPr>
       </w:pPr>
       <w:r>
         <w:t>Esses indicadores reforçam que o DOOH deixou de ser um formato complementar e passou a ocupar posição estratégica no ecossistema de mídia.</w:t>
@@ -623,6 +663,7 @@
       <w:pPr>
         <w:jc w:val="both"/>
         <w:rPr>
+          <w:rFonts w:hint="eastAsia"/>
           <w:b/>
           <w:bCs/>
           <w:sz w:val="28"/>
@@ -643,6 +684,9 @@
       <w:pPr>
         <w:ind w:firstLine="708"/>
         <w:jc w:val="both"/>
+        <w:rPr>
+          <w:rFonts w:hint="eastAsia"/>
+        </w:rPr>
       </w:pPr>
       <w:r>
         <w:t>Apesar do crescimento acelerado, a operação de redes DOOH envolve desafios significativos. Entre eles estão o alto investimento inicial, a necessidade de infraestrutura tecnológica robusta e questões regulatórias relacionadas à publicidade em espaços públicos.</w:t>
@@ -652,6 +696,9 @@
       <w:pPr>
         <w:ind w:firstLine="708"/>
         <w:jc w:val="both"/>
+        <w:rPr>
+          <w:rFonts w:hint="eastAsia"/>
+        </w:rPr>
       </w:pPr>
       <w:r>
         <w:t>Conforme destaca o InforChannel (2026), o LED deixou de ser apenas uma tela e passou a ser infraestrutura crítica integrada ao ambiente de TI (AV/IT convergence). Nesse cenário, gestão remota, telemetria e monitoramento centralizado não são mais diferenciais competitivos — são exigências operacionais.</w:t>
@@ -660,11 +707,17 @@
     <w:p>
       <w:pPr>
         <w:jc w:val="both"/>
+        <w:rPr>
+          <w:rFonts w:hint="eastAsia"/>
+        </w:rPr>
       </w:pPr>
     </w:p>
     <w:p>
       <w:pPr>
         <w:jc w:val="both"/>
+        <w:rPr>
+          <w:rFonts w:hint="eastAsia"/>
+        </w:rPr>
       </w:pPr>
       <w:r>
         <w:br w:type="page"/>
@@ -674,6 +727,9 @@
       <w:pPr>
         <w:ind w:firstLine="708"/>
         <w:jc w:val="both"/>
+        <w:rPr>
+          <w:rFonts w:hint="eastAsia"/>
+        </w:rPr>
       </w:pPr>
       <w:r>
         <w:lastRenderedPageBreak/>
@@ -688,6 +744,9 @@
           <w:numId w:val="14"/>
         </w:numPr>
         <w:jc w:val="both"/>
+        <w:rPr>
+          <w:rFonts w:hint="eastAsia"/>
+        </w:rPr>
       </w:pPr>
       <w:r>
         <w:t>Falhas técnicas não identificadas em tempo hábil</w:t>
@@ -701,6 +760,9 @@
           <w:numId w:val="14"/>
         </w:numPr>
         <w:jc w:val="both"/>
+        <w:rPr>
+          <w:rFonts w:hint="eastAsia"/>
+        </w:rPr>
       </w:pPr>
       <w:r>
         <w:t>Interrupção na exibição de campanhas contratadas</w:t>
@@ -714,6 +776,9 @@
           <w:numId w:val="14"/>
         </w:numPr>
         <w:jc w:val="both"/>
+        <w:rPr>
+          <w:rFonts w:hint="eastAsia"/>
+        </w:rPr>
       </w:pPr>
       <w:r>
         <w:t>Perda de receita publicitária</w:t>
@@ -727,6 +792,9 @@
           <w:numId w:val="14"/>
         </w:numPr>
         <w:jc w:val="both"/>
+        <w:rPr>
+          <w:rFonts w:hint="eastAsia"/>
+        </w:rPr>
       </w:pPr>
       <w:r>
         <w:t>Quebra de SLAs com anunciantes</w:t>
@@ -740,6 +808,9 @@
           <w:numId w:val="14"/>
         </w:numPr>
         <w:jc w:val="both"/>
+        <w:rPr>
+          <w:rFonts w:hint="eastAsia"/>
+        </w:rPr>
       </w:pPr>
       <w:r>
         <w:t>Impacto negativo na credibilidade da marca</w:t>
@@ -750,6 +821,9 @@
         <w:spacing w:line="257" w:lineRule="auto"/>
         <w:ind w:firstLine="708"/>
         <w:jc w:val="both"/>
+        <w:rPr>
+          <w:rFonts w:hint="eastAsia"/>
+        </w:rPr>
       </w:pPr>
       <w:r>
         <w:t>Dessa forma, à medida que o setor se expande e se torna mais dependente de tecnologia, cresce também a necessidade de controle, visibilidade e confiabilidade operacional nas redes de mídia digital.</w:t>
@@ -763,6 +837,7 @@
         <w:spacing w:line="257" w:lineRule="auto"/>
         <w:jc w:val="both"/>
         <w:rPr>
+          <w:rFonts w:hint="eastAsia"/>
           <w:b/>
           <w:bCs/>
           <w:sz w:val="36"/>
@@ -1169,6 +1244,7 @@
         <w:spacing w:line="257" w:lineRule="auto"/>
         <w:jc w:val="both"/>
         <w:rPr>
+          <w:rFonts w:hint="eastAsia"/>
           <w:b/>
           <w:bCs/>
           <w:sz w:val="28"/>
@@ -1202,6 +1278,9 @@
         <w:spacing w:after="0" w:line="360" w:lineRule="auto"/>
         <w:ind w:firstLine="709"/>
         <w:jc w:val="both"/>
+        <w:rPr>
+          <w:rFonts w:hint="eastAsia"/>
+        </w:rPr>
       </w:pPr>
       <w:r>
         <w:t>O mercado de DOOH (Digital Out Of Home) exige alta disponibilidade e confiabilidade operacional</w:t>
@@ -1310,6 +1389,9 @@
         <w:spacing w:after="0" w:line="360" w:lineRule="auto"/>
         <w:ind w:firstLine="709"/>
         <w:jc w:val="both"/>
+        <w:rPr>
+          <w:rFonts w:hint="eastAsia"/>
+        </w:rPr>
       </w:pPr>
       <w:r>
         <w:t xml:space="preserve">Diante desse cenário, torna-se necessária a implementação de uma solução tecnológica capaz de realizar o monitoramento contínuo e automatizado dos componentes físicos das telas DOOH. O acompanhamento em </w:t>
@@ -1342,6 +1424,9 @@
         <w:spacing w:after="0" w:line="360" w:lineRule="auto"/>
         <w:ind w:firstLine="709"/>
         <w:jc w:val="both"/>
+        <w:rPr>
+          <w:rFonts w:hint="eastAsia"/>
+        </w:rPr>
       </w:pPr>
       <w:r>
         <w:t>Além de contribuir para a redução de falhas e custos operacionais, o projeto também promove maior controle por meio de relatórios técnicos, indicadores de desempenho e registros de ocorrências. Isso fortalece a tomada de decisão estratégica e amplia a capacidade da empresa em garantir níveis adequados de serviço (SLA).</w:t>
@@ -1352,6 +1437,9 @@
         <w:spacing w:after="0" w:line="360" w:lineRule="auto"/>
         <w:ind w:firstLine="709"/>
         <w:jc w:val="both"/>
+        <w:rPr>
+          <w:rFonts w:hint="eastAsia"/>
+        </w:rPr>
       </w:pPr>
     </w:p>
     <w:p>
@@ -1359,6 +1447,9 @@
         <w:spacing w:after="0" w:line="360" w:lineRule="auto"/>
         <w:ind w:firstLine="709"/>
         <w:jc w:val="both"/>
+        <w:rPr>
+          <w:rFonts w:hint="eastAsia"/>
+        </w:rPr>
       </w:pPr>
     </w:p>
     <w:p>
@@ -1366,6 +1457,9 @@
         <w:spacing w:after="0" w:line="360" w:lineRule="auto"/>
         <w:ind w:firstLine="709"/>
         <w:jc w:val="both"/>
+        <w:rPr>
+          <w:rFonts w:hint="eastAsia"/>
+        </w:rPr>
       </w:pPr>
     </w:p>
     <w:p>
@@ -1373,6 +1467,9 @@
         <w:spacing w:after="0" w:line="360" w:lineRule="auto"/>
         <w:ind w:firstLine="709"/>
         <w:jc w:val="both"/>
+        <w:rPr>
+          <w:rFonts w:hint="eastAsia"/>
+        </w:rPr>
       </w:pPr>
     </w:p>
     <w:p>
@@ -1380,6 +1477,9 @@
         <w:spacing w:after="0" w:line="360" w:lineRule="auto"/>
         <w:ind w:firstLine="709"/>
         <w:jc w:val="both"/>
+        <w:rPr>
+          <w:rFonts w:hint="eastAsia"/>
+        </w:rPr>
       </w:pPr>
     </w:p>
     <w:p>
@@ -1387,6 +1487,9 @@
         <w:spacing w:after="0" w:line="360" w:lineRule="auto"/>
         <w:ind w:firstLine="709"/>
         <w:jc w:val="both"/>
+        <w:rPr>
+          <w:rFonts w:hint="eastAsia"/>
+        </w:rPr>
       </w:pPr>
     </w:p>
     <w:p>
@@ -1394,12 +1497,18 @@
         <w:spacing w:after="0" w:line="360" w:lineRule="auto"/>
         <w:ind w:firstLine="709"/>
         <w:jc w:val="both"/>
+        <w:rPr>
+          <w:rFonts w:hint="eastAsia"/>
+        </w:rPr>
       </w:pPr>
     </w:p>
     <w:p>
       <w:pPr>
         <w:spacing w:after="0" w:line="360" w:lineRule="auto"/>
         <w:jc w:val="both"/>
+        <w:rPr>
+          <w:rFonts w:hint="eastAsia"/>
+        </w:rPr>
       </w:pPr>
       <w:r>
         <w:rPr>
@@ -1416,6 +1525,7 @@
         <w:spacing w:before="240" w:after="240"/>
         <w:jc w:val="both"/>
         <w:rPr>
+          <w:rFonts w:hint="eastAsia"/>
           <w:color w:val="000000" w:themeColor="text1"/>
           <w:sz w:val="28"/>
           <w:szCs w:val="28"/>
@@ -1429,6 +1539,7 @@
           <w:sz w:val="28"/>
           <w:szCs w:val="28"/>
         </w:rPr>
+        <w:lastRenderedPageBreak/>
         <w:t>Descrição do projeto</w:t>
       </w:r>
     </w:p>
@@ -1438,13 +1549,15 @@
         <w:spacing w:after="0"/>
         <w:ind w:firstLine="708"/>
         <w:jc w:val="both"/>
+        <w:rPr>
+          <w:rFonts w:hint="eastAsia"/>
+        </w:rPr>
       </w:pPr>
       <w:r>
         <w:rPr>
           <w:rFonts w:ascii="Aptos" w:eastAsia="Aptos" w:hAnsi="Aptos" w:cs="Aptos"/>
           <w:color w:val="212121"/>
         </w:rPr>
-        <w:lastRenderedPageBreak/>
         <w:t>O projeto da V-OOH tem como objetivo desenvolver e implementar uma solução tecnológica voltada ao monitoramento contínuo do hardware de displays e telas DOOH (Digital Out Of Home), garantindo alta disponibilidade, desempenho e confiabilidade operacional dos equipamentos instalados em campo.</w:t>
       </w:r>
     </w:p>
@@ -1492,6 +1605,9 @@
         <w:spacing w:after="0"/>
         <w:ind w:firstLine="708"/>
         <w:jc w:val="both"/>
+        <w:rPr>
+          <w:rFonts w:hint="eastAsia"/>
+        </w:rPr>
       </w:pPr>
       <w:r>
         <w:rPr>
@@ -1532,6 +1648,9 @@
         <w:shd w:val="clear" w:color="auto" w:fill="FFFFFF" w:themeFill="background1"/>
         <w:spacing w:after="0"/>
         <w:jc w:val="both"/>
+        <w:rPr>
+          <w:rFonts w:hint="eastAsia"/>
+        </w:rPr>
       </w:pPr>
       <w:r>
         <w:rPr>
@@ -1546,6 +1665,7 @@
         <w:spacing w:before="240" w:after="240"/>
         <w:jc w:val="both"/>
         <w:rPr>
+          <w:rFonts w:hint="eastAsia"/>
           <w:b/>
           <w:bCs/>
           <w:color w:val="000000" w:themeColor="text1"/>
@@ -1559,6 +1679,7 @@
         <w:spacing w:before="240" w:after="240"/>
         <w:jc w:val="both"/>
         <w:rPr>
+          <w:rFonts w:hint="eastAsia"/>
           <w:color w:val="000000" w:themeColor="text1"/>
           <w:sz w:val="28"/>
           <w:szCs w:val="28"/>
@@ -1581,6 +1702,7 @@
         <w:ind w:firstLine="708"/>
         <w:jc w:val="both"/>
         <w:rPr>
+          <w:rFonts w:hint="eastAsia"/>
           <w:color w:val="000000" w:themeColor="text1"/>
           <w:sz w:val="28"/>
           <w:szCs w:val="28"/>
@@ -1599,6 +1721,9 @@
     <w:p>
       <w:pPr>
         <w:jc w:val="both"/>
+        <w:rPr>
+          <w:rFonts w:hint="eastAsia"/>
+        </w:rPr>
       </w:pPr>
       <w:r>
         <w:br w:type="page"/>
@@ -1609,6 +1734,7 @@
         <w:spacing w:before="240" w:after="240"/>
         <w:jc w:val="both"/>
         <w:rPr>
+          <w:rFonts w:hint="eastAsia"/>
           <w:color w:val="000000" w:themeColor="text1"/>
           <w:sz w:val="28"/>
           <w:szCs w:val="28"/>
@@ -1629,6 +1755,9 @@
     <w:p>
       <w:pPr>
         <w:jc w:val="both"/>
+        <w:rPr>
+          <w:rFonts w:hint="eastAsia"/>
+        </w:rPr>
       </w:pPr>
       <w:hyperlink r:id="rId10">
         <w:r>
@@ -1645,6 +1774,7 @@
         <w:spacing w:before="240" w:after="240"/>
         <w:jc w:val="both"/>
         <w:rPr>
+          <w:rFonts w:hint="eastAsia"/>
           <w:color w:val="000000" w:themeColor="text1"/>
           <w:sz w:val="28"/>
           <w:szCs w:val="28"/>
@@ -1665,6 +1795,7 @@
       <w:pPr>
         <w:jc w:val="both"/>
         <w:rPr>
+          <w:rFonts w:hint="eastAsia"/>
           <w:sz w:val="26"/>
           <w:szCs w:val="26"/>
         </w:rPr>
@@ -1687,6 +1818,7 @@
         <w:spacing w:line="257" w:lineRule="auto"/>
         <w:jc w:val="both"/>
         <w:rPr>
+          <w:rFonts w:hint="eastAsia"/>
           <w:sz w:val="26"/>
           <w:szCs w:val="26"/>
         </w:rPr>
@@ -1815,6 +1947,7 @@
         <w:spacing w:line="257" w:lineRule="auto"/>
         <w:jc w:val="both"/>
         <w:rPr>
+          <w:rFonts w:hint="eastAsia"/>
           <w:sz w:val="26"/>
           <w:szCs w:val="26"/>
         </w:rPr>
@@ -1955,6 +2088,9 @@
         </w:numPr>
         <w:spacing w:line="257" w:lineRule="auto"/>
         <w:jc w:val="both"/>
+        <w:rPr>
+          <w:rFonts w:hint="eastAsia"/>
+        </w:rPr>
       </w:pPr>
       <w:r>
         <w:rPr>
@@ -1997,6 +2133,7 @@
         <w:spacing w:line="257" w:lineRule="auto"/>
         <w:jc w:val="both"/>
         <w:rPr>
+          <w:rFonts w:hint="eastAsia"/>
           <w:sz w:val="26"/>
           <w:szCs w:val="26"/>
         </w:rPr>
@@ -2054,6 +2191,7 @@
         <w:spacing w:line="257" w:lineRule="auto"/>
         <w:jc w:val="both"/>
         <w:rPr>
+          <w:rFonts w:hint="eastAsia"/>
           <w:sz w:val="26"/>
           <w:szCs w:val="26"/>
         </w:rPr>
@@ -2071,6 +2209,7 @@
         <w:spacing w:line="257" w:lineRule="auto"/>
         <w:jc w:val="both"/>
         <w:rPr>
+          <w:rFonts w:hint="eastAsia"/>
           <w:sz w:val="26"/>
           <w:szCs w:val="26"/>
         </w:rPr>
@@ -2093,6 +2232,7 @@
         <w:spacing w:line="257" w:lineRule="auto"/>
         <w:jc w:val="both"/>
         <w:rPr>
+          <w:rFonts w:hint="eastAsia"/>
           <w:sz w:val="26"/>
           <w:szCs w:val="26"/>
         </w:rPr>
@@ -2115,6 +2255,7 @@
         <w:spacing w:line="257" w:lineRule="auto"/>
         <w:jc w:val="both"/>
         <w:rPr>
+          <w:rFonts w:hint="eastAsia"/>
           <w:sz w:val="26"/>
           <w:szCs w:val="26"/>
         </w:rPr>
@@ -2140,6 +2281,7 @@
         <w:spacing w:line="257" w:lineRule="auto"/>
         <w:jc w:val="both"/>
         <w:rPr>
+          <w:rFonts w:hint="eastAsia"/>
           <w:sz w:val="26"/>
           <w:szCs w:val="26"/>
         </w:rPr>
@@ -2165,6 +2307,7 @@
         <w:spacing w:line="257" w:lineRule="auto"/>
         <w:jc w:val="both"/>
         <w:rPr>
+          <w:rFonts w:hint="eastAsia"/>
           <w:sz w:val="26"/>
           <w:szCs w:val="26"/>
         </w:rPr>
@@ -2182,6 +2325,7 @@
         <w:spacing w:before="240" w:after="240"/>
         <w:jc w:val="both"/>
         <w:rPr>
+          <w:rFonts w:hint="eastAsia"/>
           <w:b/>
           <w:bCs/>
           <w:color w:val="000000" w:themeColor="text1"/>
@@ -2193,6 +2337,9 @@
     <w:p>
       <w:pPr>
         <w:jc w:val="both"/>
+        <w:rPr>
+          <w:rFonts w:hint="eastAsia"/>
+        </w:rPr>
       </w:pPr>
       <w:r>
         <w:br w:type="page"/>
@@ -2203,6 +2350,7 @@
         <w:spacing w:before="240" w:after="240"/>
         <w:jc w:val="both"/>
         <w:rPr>
+          <w:rFonts w:hint="eastAsia"/>
           <w:b/>
           <w:bCs/>
           <w:color w:val="000000" w:themeColor="text1"/>
@@ -2832,6 +2980,7 @@
         <w:spacing w:before="240" w:after="240"/>
         <w:jc w:val="both"/>
         <w:rPr>
+          <w:rFonts w:hint="eastAsia"/>
           <w:b/>
           <w:bCs/>
           <w:color w:val="000000" w:themeColor="text1"/>
@@ -2844,6 +2993,7 @@
       <w:pPr>
         <w:jc w:val="both"/>
         <w:rPr>
+          <w:rFonts w:hint="eastAsia"/>
           <w:color w:val="000000" w:themeColor="text1"/>
           <w:sz w:val="28"/>
           <w:szCs w:val="28"/>
@@ -2864,6 +3014,7 @@
       <w:pPr>
         <w:jc w:val="both"/>
         <w:rPr>
+          <w:rFonts w:hint="eastAsia"/>
           <w:b/>
           <w:bCs/>
           <w:color w:val="000000" w:themeColor="text1"/>
@@ -2887,6 +3038,9 @@
         <w:spacing w:after="0" w:line="360" w:lineRule="auto"/>
         <w:ind w:firstLine="262"/>
         <w:jc w:val="both"/>
+        <w:rPr>
+          <w:rFonts w:hint="eastAsia"/>
+        </w:rPr>
       </w:pPr>
       <w:r>
         <w:rPr>
@@ -3174,6 +3328,7 @@
       <w:pPr>
         <w:jc w:val="both"/>
         <w:rPr>
+          <w:rFonts w:hint="eastAsia"/>
           <w:b/>
           <w:bCs/>
           <w:color w:val="000000" w:themeColor="text1"/>
@@ -3186,6 +3341,7 @@
       <w:pPr>
         <w:jc w:val="both"/>
         <w:rPr>
+          <w:rFonts w:hint="eastAsia"/>
           <w:b/>
           <w:bCs/>
           <w:color w:val="000000" w:themeColor="text1"/>
@@ -3209,6 +3365,9 @@
         <w:spacing w:after="0" w:line="360" w:lineRule="auto"/>
         <w:ind w:left="262" w:firstLine="359"/>
         <w:jc w:val="both"/>
+        <w:rPr>
+          <w:rFonts w:hint="eastAsia"/>
+        </w:rPr>
       </w:pPr>
       <w:r>
         <w:rPr>
@@ -3445,12 +3604,16 @@
     <w:p>
       <w:pPr>
         <w:jc w:val="both"/>
+        <w:rPr>
+          <w:rFonts w:hint="eastAsia"/>
+        </w:rPr>
       </w:pPr>
     </w:p>
     <w:p>
       <w:pPr>
         <w:jc w:val="both"/>
         <w:rPr>
+          <w:rFonts w:hint="eastAsia"/>
           <w:color w:val="000000" w:themeColor="text1"/>
           <w:sz w:val="28"/>
           <w:szCs w:val="28"/>
@@ -3471,6 +3634,9 @@
       <w:pPr>
         <w:spacing w:line="257" w:lineRule="auto"/>
         <w:jc w:val="both"/>
+        <w:rPr>
+          <w:rFonts w:hint="eastAsia"/>
+        </w:rPr>
       </w:pPr>
       <w:r>
         <w:rPr>
@@ -3637,6 +3803,7 @@
       <w:pPr>
         <w:jc w:val="both"/>
         <w:rPr>
+          <w:rFonts w:hint="eastAsia"/>
           <w:b/>
           <w:bCs/>
           <w:color w:val="000000" w:themeColor="text1"/>
@@ -3649,6 +3816,7 @@
       <w:pPr>
         <w:jc w:val="both"/>
         <w:rPr>
+          <w:rFonts w:hint="eastAsia"/>
           <w:b/>
           <w:bCs/>
           <w:color w:val="000000" w:themeColor="text1"/>
@@ -3661,6 +3829,7 @@
       <w:pPr>
         <w:jc w:val="both"/>
         <w:rPr>
+          <w:rFonts w:hint="eastAsia"/>
           <w:b/>
           <w:bCs/>
           <w:color w:val="000000" w:themeColor="text1"/>
@@ -3673,6 +3842,7 @@
       <w:pPr>
         <w:jc w:val="both"/>
         <w:rPr>
+          <w:rFonts w:hint="eastAsia"/>
           <w:b/>
           <w:bCs/>
           <w:color w:val="000000" w:themeColor="text1"/>
@@ -3685,6 +3855,7 @@
       <w:pPr>
         <w:jc w:val="both"/>
         <w:rPr>
+          <w:rFonts w:hint="eastAsia"/>
           <w:b/>
           <w:bCs/>
           <w:color w:val="000000" w:themeColor="text1"/>
@@ -3698,6 +3869,7 @@
         <w:spacing w:line="360" w:lineRule="auto"/>
         <w:jc w:val="both"/>
         <w:rPr>
+          <w:rFonts w:hint="eastAsia"/>
           <w:color w:val="000000" w:themeColor="text1"/>
         </w:rPr>
       </w:pPr>
@@ -3716,6 +3888,7 @@
     <w:tbl>
       <w:tblPr>
         <w:tblW w:w="0" w:type="auto"/>
+        <w:tblInd w:w="-30" w:type="dxa"/>
         <w:tblBorders>
           <w:top w:val="single" w:sz="12" w:space="0" w:color="000000" w:themeColor="text1"/>
           <w:left w:val="single" w:sz="12" w:space="0" w:color="000000" w:themeColor="text1"/>
@@ -3727,23 +3900,21 @@
         <w:tblLook w:val="06A0" w:firstRow="1" w:lastRow="0" w:firstColumn="1" w:lastColumn="0" w:noHBand="1" w:noVBand="1"/>
       </w:tblPr>
       <w:tblGrid>
-        <w:gridCol w:w="2190"/>
+        <w:gridCol w:w="2220"/>
         <w:gridCol w:w="27"/>
-        <w:gridCol w:w="2220"/>
+        <w:gridCol w:w="2192"/>
+        <w:gridCol w:w="27"/>
         <w:gridCol w:w="799"/>
-        <w:gridCol w:w="1410"/>
-        <w:gridCol w:w="2365"/>
-        <w:gridCol w:w="30"/>
+        <w:gridCol w:w="1525"/>
+        <w:gridCol w:w="2281"/>
       </w:tblGrid>
       <w:tr>
         <w:trPr>
-          <w:gridAfter w:val="1"/>
-          <w:wAfter w:w="30" w:type="dxa"/>
           <w:trHeight w:val="735"/>
         </w:trPr>
         <w:tc>
           <w:tcPr>
-            <w:tcW w:w="2225" w:type="dxa"/>
+            <w:tcW w:w="2247" w:type="dxa"/>
             <w:gridSpan w:val="2"/>
             <w:shd w:val="clear" w:color="auto" w:fill="8064A2"/>
             <w:tcMar>
@@ -3757,6 +3928,9 @@
             <w:pPr>
               <w:spacing w:after="0"/>
               <w:jc w:val="center"/>
+              <w:rPr>
+                <w:rFonts w:hint="eastAsia"/>
+              </w:rPr>
             </w:pPr>
             <w:r>
               <w:rPr>
@@ -3771,34 +3945,7 @@
         </w:tc>
         <w:tc>
           <w:tcPr>
-            <w:tcW w:w="2229" w:type="dxa"/>
-            <w:shd w:val="clear" w:color="auto" w:fill="8064A2"/>
-            <w:tcMar>
-              <w:top w:w="15" w:type="dxa"/>
-              <w:left w:w="15" w:type="dxa"/>
-              <w:right w:w="15" w:type="dxa"/>
-            </w:tcMar>
-            <w:vAlign w:val="center"/>
-          </w:tcPr>
-          <w:p>
-            <w:pPr>
-              <w:spacing w:after="0"/>
-              <w:jc w:val="center"/>
-            </w:pPr>
-            <w:r>
-              <w:rPr>
-                <w:rFonts w:ascii="Arial" w:eastAsia="Arial" w:hAnsi="Arial" w:cs="Arial"/>
-                <w:b/>
-                <w:bCs/>
-                <w:color w:val="FFFFFF" w:themeColor="background1"/>
-              </w:rPr>
-              <w:t>Descrição</w:t>
-            </w:r>
-          </w:p>
-        </w:tc>
-        <w:tc>
-          <w:tcPr>
-            <w:tcW w:w="2225" w:type="dxa"/>
+            <w:tcW w:w="2219" w:type="dxa"/>
             <w:gridSpan w:val="2"/>
             <w:shd w:val="clear" w:color="auto" w:fill="8064A2"/>
             <w:tcMar>
@@ -3812,6 +3959,9 @@
             <w:pPr>
               <w:spacing w:after="0"/>
               <w:jc w:val="center"/>
+              <w:rPr>
+                <w:rFonts w:hint="eastAsia"/>
+              </w:rPr>
             </w:pPr>
             <w:r>
               <w:rPr>
@@ -3820,13 +3970,14 @@
                 <w:bCs/>
                 <w:color w:val="FFFFFF" w:themeColor="background1"/>
               </w:rPr>
-              <w:t>Serviço AWS</w:t>
+              <w:t>Descrição</w:t>
             </w:r>
           </w:p>
         </w:tc>
         <w:tc>
           <w:tcPr>
-            <w:tcW w:w="2381" w:type="dxa"/>
+            <w:tcW w:w="2324" w:type="dxa"/>
+            <w:gridSpan w:val="2"/>
             <w:shd w:val="clear" w:color="auto" w:fill="8064A2"/>
             <w:tcMar>
               <w:top w:w="15" w:type="dxa"/>
@@ -3839,6 +3990,39 @@
             <w:pPr>
               <w:spacing w:after="0"/>
               <w:jc w:val="center"/>
+              <w:rPr>
+                <w:rFonts w:hint="eastAsia"/>
+              </w:rPr>
+            </w:pPr>
+            <w:r>
+              <w:rPr>
+                <w:rFonts w:ascii="Arial" w:eastAsia="Arial" w:hAnsi="Arial" w:cs="Arial"/>
+                <w:b/>
+                <w:bCs/>
+                <w:color w:val="FFFFFF" w:themeColor="background1"/>
+              </w:rPr>
+              <w:t>Serviço AWS</w:t>
+            </w:r>
+          </w:p>
+        </w:tc>
+        <w:tc>
+          <w:tcPr>
+            <w:tcW w:w="2281" w:type="dxa"/>
+            <w:shd w:val="clear" w:color="auto" w:fill="8064A2"/>
+            <w:tcMar>
+              <w:top w:w="15" w:type="dxa"/>
+              <w:left w:w="15" w:type="dxa"/>
+              <w:right w:w="15" w:type="dxa"/>
+            </w:tcMar>
+            <w:vAlign w:val="center"/>
+          </w:tcPr>
+          <w:p>
+            <w:pPr>
+              <w:spacing w:after="0"/>
+              <w:jc w:val="center"/>
+              <w:rPr>
+                <w:rFonts w:hint="eastAsia"/>
+              </w:rPr>
             </w:pPr>
             <w:r>
               <w:rPr>
@@ -3854,13 +4038,11 @@
       </w:tr>
       <w:tr>
         <w:trPr>
-          <w:gridAfter w:val="1"/>
-          <w:wAfter w:w="30" w:type="dxa"/>
           <w:trHeight w:val="300"/>
         </w:trPr>
         <w:tc>
           <w:tcPr>
-            <w:tcW w:w="2225" w:type="dxa"/>
+            <w:tcW w:w="2247" w:type="dxa"/>
             <w:gridSpan w:val="2"/>
             <w:shd w:val="clear" w:color="auto" w:fill="F2F2F2" w:themeFill="background1" w:themeFillShade="F2"/>
             <w:tcMar>
@@ -3874,44 +4056,31 @@
             <w:pPr>
               <w:spacing w:after="0"/>
               <w:jc w:val="center"/>
+              <w:rPr>
+                <w:rFonts w:hint="eastAsia"/>
+              </w:rPr>
             </w:pPr>
             <w:r>
               <w:rPr>
                 <w:rFonts w:ascii="Arial" w:eastAsia="Arial" w:hAnsi="Arial" w:cs="Arial"/>
                 <w:color w:val="000000" w:themeColor="text1"/>
               </w:rPr>
-              <w:t>Server Host Backend</w:t>
+              <w:t xml:space="preserve">Server Host </w:t>
             </w:r>
+            <w:proofErr w:type="spellStart"/>
+            <w:r>
+              <w:rPr>
+                <w:rFonts w:ascii="Arial" w:eastAsia="Arial" w:hAnsi="Arial" w:cs="Arial"/>
+                <w:color w:val="000000" w:themeColor="text1"/>
+              </w:rPr>
+              <w:t>Backend</w:t>
+            </w:r>
+            <w:proofErr w:type="spellEnd"/>
           </w:p>
         </w:tc>
         <w:tc>
           <w:tcPr>
-            <w:tcW w:w="2229" w:type="dxa"/>
-            <w:shd w:val="clear" w:color="auto" w:fill="F2F2F2" w:themeFill="background1" w:themeFillShade="F2"/>
-            <w:tcMar>
-              <w:top w:w="15" w:type="dxa"/>
-              <w:left w:w="15" w:type="dxa"/>
-              <w:right w:w="15" w:type="dxa"/>
-            </w:tcMar>
-            <w:vAlign w:val="center"/>
-          </w:tcPr>
-          <w:p>
-            <w:pPr>
-              <w:spacing w:after="0"/>
-              <w:jc w:val="center"/>
-            </w:pPr>
-            <w:r>
-              <w:rPr>
-                <w:rFonts w:ascii="Arial" w:eastAsia="Arial" w:hAnsi="Arial" w:cs="Arial"/>
-                <w:color w:val="000000" w:themeColor="text1"/>
-              </w:rPr>
-              <w:t>Hospedagem da API (acho)</w:t>
-            </w:r>
-          </w:p>
-        </w:tc>
-        <w:tc>
-          <w:tcPr>
-            <w:tcW w:w="2225" w:type="dxa"/>
+            <w:tcW w:w="2219" w:type="dxa"/>
             <w:gridSpan w:val="2"/>
             <w:shd w:val="clear" w:color="auto" w:fill="F2F2F2" w:themeFill="background1" w:themeFillShade="F2"/>
             <w:tcMar>
@@ -3925,51 +4094,22 @@
             <w:pPr>
               <w:spacing w:after="0"/>
               <w:jc w:val="center"/>
+              <w:rPr>
+                <w:rFonts w:hint="eastAsia"/>
+              </w:rPr>
             </w:pPr>
             <w:r>
               <w:rPr>
                 <w:rFonts w:ascii="Arial" w:eastAsia="Arial" w:hAnsi="Arial" w:cs="Arial"/>
                 <w:color w:val="000000" w:themeColor="text1"/>
               </w:rPr>
-              <w:t>XXXXXX</w:t>
+              <w:t>Hospedagem da API (acho)</w:t>
             </w:r>
           </w:p>
         </w:tc>
         <w:tc>
           <w:tcPr>
-            <w:tcW w:w="2381" w:type="dxa"/>
-            <w:shd w:val="clear" w:color="auto" w:fill="F2F2F2" w:themeFill="background1" w:themeFillShade="F2"/>
-            <w:tcMar>
-              <w:top w:w="15" w:type="dxa"/>
-              <w:left w:w="15" w:type="dxa"/>
-              <w:right w:w="15" w:type="dxa"/>
-            </w:tcMar>
-            <w:vAlign w:val="center"/>
-          </w:tcPr>
-          <w:p>
-            <w:pPr>
-              <w:spacing w:after="0"/>
-              <w:jc w:val="center"/>
-            </w:pPr>
-            <w:r>
-              <w:rPr>
-                <w:rFonts w:ascii="Arial" w:eastAsia="Arial" w:hAnsi="Arial" w:cs="Arial"/>
-                <w:color w:val="000000" w:themeColor="text1"/>
-              </w:rPr>
-              <w:t>XXXXXX</w:t>
-            </w:r>
-          </w:p>
-        </w:tc>
-      </w:tr>
-      <w:tr>
-        <w:trPr>
-          <w:gridAfter w:val="1"/>
-          <w:wAfter w:w="30" w:type="dxa"/>
-          <w:trHeight w:val="300"/>
-        </w:trPr>
-        <w:tc>
-          <w:tcPr>
-            <w:tcW w:w="2225" w:type="dxa"/>
+            <w:tcW w:w="2324" w:type="dxa"/>
             <w:gridSpan w:val="2"/>
             <w:shd w:val="clear" w:color="auto" w:fill="F2F2F2" w:themeFill="background1" w:themeFillShade="F2"/>
             <w:tcMar>
@@ -3983,19 +4123,22 @@
             <w:pPr>
               <w:spacing w:after="0"/>
               <w:jc w:val="center"/>
+              <w:rPr>
+                <w:rFonts w:hint="eastAsia"/>
+              </w:rPr>
             </w:pPr>
             <w:r>
               <w:rPr>
                 <w:rFonts w:ascii="Arial" w:eastAsia="Arial" w:hAnsi="Arial" w:cs="Arial"/>
                 <w:color w:val="000000" w:themeColor="text1"/>
               </w:rPr>
-              <w:t>Web Server</w:t>
+              <w:t>XXXXXX</w:t>
             </w:r>
           </w:p>
         </w:tc>
         <w:tc>
           <w:tcPr>
-            <w:tcW w:w="2229" w:type="dxa"/>
+            <w:tcW w:w="2281" w:type="dxa"/>
             <w:shd w:val="clear" w:color="auto" w:fill="F2F2F2" w:themeFill="background1" w:themeFillShade="F2"/>
             <w:tcMar>
               <w:top w:w="15" w:type="dxa"/>
@@ -4008,19 +4151,27 @@
             <w:pPr>
               <w:spacing w:after="0"/>
               <w:jc w:val="center"/>
+              <w:rPr>
+                <w:rFonts w:hint="eastAsia"/>
+              </w:rPr>
             </w:pPr>
             <w:r>
               <w:rPr>
                 <w:rFonts w:ascii="Arial" w:eastAsia="Arial" w:hAnsi="Arial" w:cs="Arial"/>
                 <w:color w:val="000000" w:themeColor="text1"/>
               </w:rPr>
-              <w:t>Servidor HTTP (acho)</w:t>
+              <w:t>XXXXXX</w:t>
             </w:r>
           </w:p>
         </w:tc>
+      </w:tr>
+      <w:tr>
+        <w:trPr>
+          <w:trHeight w:val="300"/>
+        </w:trPr>
         <w:tc>
           <w:tcPr>
-            <w:tcW w:w="2225" w:type="dxa"/>
+            <w:tcW w:w="2247" w:type="dxa"/>
             <w:gridSpan w:val="2"/>
             <w:shd w:val="clear" w:color="auto" w:fill="F2F2F2" w:themeFill="background1" w:themeFillShade="F2"/>
             <w:tcMar>
@@ -4034,51 +4185,22 @@
             <w:pPr>
               <w:spacing w:after="0"/>
               <w:jc w:val="center"/>
+              <w:rPr>
+                <w:rFonts w:hint="eastAsia"/>
+              </w:rPr>
             </w:pPr>
             <w:r>
               <w:rPr>
                 <w:rFonts w:ascii="Arial" w:eastAsia="Arial" w:hAnsi="Arial" w:cs="Arial"/>
                 <w:color w:val="000000" w:themeColor="text1"/>
               </w:rPr>
-              <w:t>XXXXXX</w:t>
+              <w:t>Web Server</w:t>
             </w:r>
           </w:p>
         </w:tc>
         <w:tc>
           <w:tcPr>
-            <w:tcW w:w="2381" w:type="dxa"/>
-            <w:shd w:val="clear" w:color="auto" w:fill="F2F2F2" w:themeFill="background1" w:themeFillShade="F2"/>
-            <w:tcMar>
-              <w:top w:w="15" w:type="dxa"/>
-              <w:left w:w="15" w:type="dxa"/>
-              <w:right w:w="15" w:type="dxa"/>
-            </w:tcMar>
-            <w:vAlign w:val="center"/>
-          </w:tcPr>
-          <w:p>
-            <w:pPr>
-              <w:spacing w:after="0"/>
-              <w:jc w:val="center"/>
-            </w:pPr>
-            <w:r>
-              <w:rPr>
-                <w:rFonts w:ascii="Arial" w:eastAsia="Arial" w:hAnsi="Arial" w:cs="Arial"/>
-                <w:color w:val="000000" w:themeColor="text1"/>
-              </w:rPr>
-              <w:t>XXXXXX</w:t>
-            </w:r>
-          </w:p>
-        </w:tc>
-      </w:tr>
-      <w:tr>
-        <w:trPr>
-          <w:gridAfter w:val="1"/>
-          <w:wAfter w:w="30" w:type="dxa"/>
-          <w:trHeight w:val="615"/>
-        </w:trPr>
-        <w:tc>
-          <w:tcPr>
-            <w:tcW w:w="2225" w:type="dxa"/>
+            <w:tcW w:w="2219" w:type="dxa"/>
             <w:gridSpan w:val="2"/>
             <w:shd w:val="clear" w:color="auto" w:fill="F2F2F2" w:themeFill="background1" w:themeFillShade="F2"/>
             <w:tcMar>
@@ -4092,44 +4214,22 @@
             <w:pPr>
               <w:spacing w:after="0"/>
               <w:jc w:val="center"/>
+              <w:rPr>
+                <w:rFonts w:hint="eastAsia"/>
+              </w:rPr>
             </w:pPr>
             <w:r>
               <w:rPr>
                 <w:rFonts w:ascii="Arial" w:eastAsia="Arial" w:hAnsi="Arial" w:cs="Arial"/>
                 <w:color w:val="000000" w:themeColor="text1"/>
               </w:rPr>
-              <w:t>Banco MySQL</w:t>
+              <w:t>Servidor HTTP (acho)</w:t>
             </w:r>
           </w:p>
         </w:tc>
         <w:tc>
           <w:tcPr>
-            <w:tcW w:w="2229" w:type="dxa"/>
-            <w:shd w:val="clear" w:color="auto" w:fill="F2F2F2" w:themeFill="background1" w:themeFillShade="F2"/>
-            <w:tcMar>
-              <w:top w:w="15" w:type="dxa"/>
-              <w:left w:w="15" w:type="dxa"/>
-              <w:right w:w="15" w:type="dxa"/>
-            </w:tcMar>
-            <w:vAlign w:val="center"/>
-          </w:tcPr>
-          <w:p>
-            <w:pPr>
-              <w:spacing w:after="0"/>
-              <w:jc w:val="center"/>
-            </w:pPr>
-            <w:r>
-              <w:rPr>
-                <w:rFonts w:ascii="Arial" w:eastAsia="Arial" w:hAnsi="Arial" w:cs="Arial"/>
-                <w:color w:val="000000" w:themeColor="text1"/>
-              </w:rPr>
-              <w:t>Banco de dados relacional (espero)</w:t>
-            </w:r>
-          </w:p>
-        </w:tc>
-        <w:tc>
-          <w:tcPr>
-            <w:tcW w:w="2225" w:type="dxa"/>
+            <w:tcW w:w="2324" w:type="dxa"/>
             <w:gridSpan w:val="2"/>
             <w:shd w:val="clear" w:color="auto" w:fill="F2F2F2" w:themeFill="background1" w:themeFillShade="F2"/>
             <w:tcMar>
@@ -4143,6 +4243,9 @@
             <w:pPr>
               <w:spacing w:after="0"/>
               <w:jc w:val="center"/>
+              <w:rPr>
+                <w:rFonts w:hint="eastAsia"/>
+              </w:rPr>
             </w:pPr>
             <w:r>
               <w:rPr>
@@ -4155,7 +4258,7 @@
         </w:tc>
         <w:tc>
           <w:tcPr>
-            <w:tcW w:w="2381" w:type="dxa"/>
+            <w:tcW w:w="2281" w:type="dxa"/>
             <w:shd w:val="clear" w:color="auto" w:fill="F2F2F2" w:themeFill="background1" w:themeFillShade="F2"/>
             <w:tcMar>
               <w:top w:w="15" w:type="dxa"/>
@@ -4168,6 +4271,9 @@
             <w:pPr>
               <w:spacing w:after="0"/>
               <w:jc w:val="center"/>
+              <w:rPr>
+                <w:rFonts w:hint="eastAsia"/>
+              </w:rPr>
             </w:pPr>
             <w:r>
               <w:rPr>
@@ -4181,13 +4287,161 @@
       </w:tr>
       <w:tr>
         <w:trPr>
-          <w:gridAfter w:val="1"/>
-          <w:wAfter w:w="29" w:type="dxa"/>
+          <w:trHeight w:val="615"/>
+        </w:trPr>
+        <w:tc>
+          <w:tcPr>
+            <w:tcW w:w="2247" w:type="dxa"/>
+            <w:gridSpan w:val="2"/>
+            <w:shd w:val="clear" w:color="auto" w:fill="F2F2F2" w:themeFill="background1" w:themeFillShade="F2"/>
+            <w:tcMar>
+              <w:top w:w="15" w:type="dxa"/>
+              <w:left w:w="15" w:type="dxa"/>
+              <w:right w:w="15" w:type="dxa"/>
+            </w:tcMar>
+            <w:vAlign w:val="center"/>
+          </w:tcPr>
+          <w:p>
+            <w:pPr>
+              <w:spacing w:after="0"/>
+              <w:jc w:val="center"/>
+              <w:rPr>
+                <w:rFonts w:hint="eastAsia"/>
+              </w:rPr>
+            </w:pPr>
+            <w:r>
+              <w:rPr>
+                <w:rFonts w:ascii="Arial" w:eastAsia="Arial" w:hAnsi="Arial" w:cs="Arial"/>
+                <w:color w:val="000000" w:themeColor="text1"/>
+              </w:rPr>
+              <w:t>Banco MySQL</w:t>
+            </w:r>
+          </w:p>
+        </w:tc>
+        <w:tc>
+          <w:tcPr>
+            <w:tcW w:w="2219" w:type="dxa"/>
+            <w:gridSpan w:val="2"/>
+            <w:shd w:val="clear" w:color="auto" w:fill="F2F2F2" w:themeFill="background1" w:themeFillShade="F2"/>
+            <w:tcMar>
+              <w:top w:w="15" w:type="dxa"/>
+              <w:left w:w="15" w:type="dxa"/>
+              <w:right w:w="15" w:type="dxa"/>
+            </w:tcMar>
+            <w:vAlign w:val="center"/>
+          </w:tcPr>
+          <w:p>
+            <w:pPr>
+              <w:spacing w:after="0"/>
+              <w:jc w:val="center"/>
+              <w:rPr>
+                <w:rFonts w:hint="eastAsia"/>
+              </w:rPr>
+            </w:pPr>
+            <w:r>
+              <w:rPr>
+                <w:rFonts w:ascii="Arial" w:eastAsia="Arial" w:hAnsi="Arial" w:cs="Arial"/>
+                <w:color w:val="000000" w:themeColor="text1"/>
+              </w:rPr>
+              <w:t>Banco de dados relacional (espero)</w:t>
+            </w:r>
+          </w:p>
+        </w:tc>
+        <w:tc>
+          <w:tcPr>
+            <w:tcW w:w="2324" w:type="dxa"/>
+            <w:gridSpan w:val="2"/>
+            <w:shd w:val="clear" w:color="auto" w:fill="F2F2F2" w:themeFill="background1" w:themeFillShade="F2"/>
+            <w:tcMar>
+              <w:top w:w="15" w:type="dxa"/>
+              <w:left w:w="15" w:type="dxa"/>
+              <w:right w:w="15" w:type="dxa"/>
+            </w:tcMar>
+            <w:vAlign w:val="center"/>
+          </w:tcPr>
+          <w:p>
+            <w:pPr>
+              <w:spacing w:after="0"/>
+              <w:jc w:val="center"/>
+              <w:rPr>
+                <w:rFonts w:hint="eastAsia"/>
+              </w:rPr>
+            </w:pPr>
+            <w:r>
+              <w:rPr>
+                <w:rFonts w:ascii="Arial" w:eastAsia="Arial" w:hAnsi="Arial" w:cs="Arial"/>
+                <w:color w:val="000000" w:themeColor="text1"/>
+              </w:rPr>
+              <w:t>XXXXXX</w:t>
+            </w:r>
+          </w:p>
+        </w:tc>
+        <w:tc>
+          <w:tcPr>
+            <w:tcW w:w="2281" w:type="dxa"/>
+            <w:shd w:val="clear" w:color="auto" w:fill="F2F2F2" w:themeFill="background1" w:themeFillShade="F2"/>
+            <w:tcMar>
+              <w:top w:w="15" w:type="dxa"/>
+              <w:left w:w="15" w:type="dxa"/>
+              <w:right w:w="15" w:type="dxa"/>
+            </w:tcMar>
+            <w:vAlign w:val="center"/>
+          </w:tcPr>
+          <w:p>
+            <w:pPr>
+              <w:spacing w:after="0"/>
+              <w:jc w:val="center"/>
+              <w:rPr>
+                <w:rFonts w:hint="eastAsia"/>
+              </w:rPr>
+            </w:pPr>
+            <w:r>
+              <w:rPr>
+                <w:rFonts w:ascii="Arial" w:eastAsia="Arial" w:hAnsi="Arial" w:cs="Arial"/>
+                <w:color w:val="000000" w:themeColor="text1"/>
+              </w:rPr>
+              <w:t>XXXXXX</w:t>
+            </w:r>
+          </w:p>
+        </w:tc>
+      </w:tr>
+      <w:tr>
+        <w:trPr>
           <w:trHeight w:val="300"/>
         </w:trPr>
         <w:tc>
           <w:tcPr>
-            <w:tcW w:w="2225" w:type="dxa"/>
+            <w:tcW w:w="2220" w:type="dxa"/>
+            <w:shd w:val="clear" w:color="auto" w:fill="9BBB59"/>
+            <w:tcMar>
+              <w:top w:w="15" w:type="dxa"/>
+              <w:left w:w="15" w:type="dxa"/>
+              <w:right w:w="15" w:type="dxa"/>
+            </w:tcMar>
+            <w:vAlign w:val="center"/>
+          </w:tcPr>
+          <w:p>
+            <w:pPr>
+              <w:spacing w:after="0"/>
+              <w:jc w:val="center"/>
+              <w:rPr>
+                <w:rFonts w:hint="eastAsia"/>
+              </w:rPr>
+            </w:pPr>
+            <w:r>
+              <w:rPr>
+                <w:rFonts w:ascii="Arial" w:eastAsia="Arial" w:hAnsi="Arial" w:cs="Arial"/>
+                <w:b/>
+                <w:bCs/>
+                <w:color w:val="FFFFFF" w:themeColor="background1"/>
+              </w:rPr>
+              <w:t>Função</w:t>
+            </w:r>
+          </w:p>
+        </w:tc>
+        <w:tc>
+          <w:tcPr>
+            <w:tcW w:w="2219" w:type="dxa"/>
             <w:gridSpan w:val="2"/>
             <w:shd w:val="clear" w:color="auto" w:fill="9BBB59"/>
             <w:tcMar>
@@ -4201,6 +4455,9 @@
             <w:pPr>
               <w:spacing w:after="0"/>
               <w:jc w:val="center"/>
+              <w:rPr>
+                <w:rFonts w:hint="eastAsia"/>
+              </w:rPr>
             </w:pPr>
             <w:r>
               <w:rPr>
@@ -4209,13 +4466,14 @@
                 <w:bCs/>
                 <w:color w:val="FFFFFF" w:themeColor="background1"/>
               </w:rPr>
-              <w:t>Função</w:t>
+              <w:t>Quantidade</w:t>
             </w:r>
           </w:p>
         </w:tc>
         <w:tc>
           <w:tcPr>
-            <w:tcW w:w="2230" w:type="dxa"/>
+            <w:tcW w:w="4632" w:type="dxa"/>
+            <w:gridSpan w:val="4"/>
             <w:shd w:val="clear" w:color="auto" w:fill="9BBB59"/>
             <w:tcMar>
               <w:top w:w="15" w:type="dxa"/>
@@ -4228,23 +4486,31 @@
             <w:pPr>
               <w:spacing w:after="0"/>
               <w:jc w:val="center"/>
+              <w:rPr>
+                <w:rFonts w:hint="eastAsia"/>
+                <w:color w:val="FF0000"/>
+              </w:rPr>
             </w:pPr>
             <w:r>
               <w:rPr>
                 <w:rFonts w:ascii="Arial" w:eastAsia="Arial" w:hAnsi="Arial" w:cs="Arial"/>
                 <w:b/>
                 <w:bCs/>
-                <w:color w:val="FFFFFF" w:themeColor="background1"/>
-              </w:rPr>
-              <w:t>Quantidade</w:t>
+                <w:color w:val="FF0000"/>
+              </w:rPr>
+              <w:t>Salário Médio BRL</w:t>
             </w:r>
           </w:p>
         </w:tc>
+      </w:tr>
+      <w:tr>
+        <w:trPr>
+          <w:trHeight w:val="315"/>
+        </w:trPr>
         <w:tc>
           <w:tcPr>
-            <w:tcW w:w="2224" w:type="dxa"/>
-            <w:gridSpan w:val="2"/>
-            <w:shd w:val="clear" w:color="auto" w:fill="9BBB59"/>
+            <w:tcW w:w="2220" w:type="dxa"/>
+            <w:shd w:val="clear" w:color="auto" w:fill="F2F2F2" w:themeFill="background1" w:themeFillShade="F2"/>
             <w:tcMar>
               <w:top w:w="15" w:type="dxa"/>
               <w:left w:w="15" w:type="dxa"/>
@@ -4256,55 +4522,22 @@
             <w:pPr>
               <w:spacing w:after="0"/>
               <w:jc w:val="center"/>
+              <w:rPr>
+                <w:rFonts w:hint="eastAsia"/>
+              </w:rPr>
             </w:pPr>
             <w:r>
               <w:rPr>
                 <w:rFonts w:ascii="Arial" w:eastAsia="Arial" w:hAnsi="Arial" w:cs="Arial"/>
-                <w:b/>
-                <w:bCs/>
-                <w:color w:val="FFFFFF" w:themeColor="background1"/>
-              </w:rPr>
-              <w:t>Salário Médio BRL</w:t>
+                <w:color w:val="000000" w:themeColor="text1"/>
+              </w:rPr>
+              <w:t>Gerente de Projeto</w:t>
             </w:r>
           </w:p>
         </w:tc>
         <w:tc>
           <w:tcPr>
-            <w:tcW w:w="2382" w:type="dxa"/>
-            <w:shd w:val="clear" w:color="auto" w:fill="9BBB59"/>
-            <w:tcMar>
-              <w:top w:w="15" w:type="dxa"/>
-              <w:left w:w="15" w:type="dxa"/>
-              <w:right w:w="15" w:type="dxa"/>
-            </w:tcMar>
-            <w:vAlign w:val="center"/>
-          </w:tcPr>
-          <w:p>
-            <w:pPr>
-              <w:spacing w:after="0"/>
-              <w:jc w:val="center"/>
-            </w:pPr>
-            <w:r>
-              <w:rPr>
-                <w:rFonts w:ascii="Arial" w:eastAsia="Arial" w:hAnsi="Arial" w:cs="Arial"/>
-                <w:b/>
-                <w:bCs/>
-                <w:color w:val="FFFFFF" w:themeColor="background1"/>
-              </w:rPr>
-              <w:t>Custo Total Estimado (BRL)</w:t>
-            </w:r>
-          </w:p>
-        </w:tc>
-      </w:tr>
-      <w:tr>
-        <w:trPr>
-          <w:gridAfter w:val="1"/>
-          <w:wAfter w:w="29" w:type="dxa"/>
-          <w:trHeight w:val="315"/>
-        </w:trPr>
-        <w:tc>
-          <w:tcPr>
-            <w:tcW w:w="2225" w:type="dxa"/>
+            <w:tcW w:w="2219" w:type="dxa"/>
             <w:gridSpan w:val="2"/>
             <w:shd w:val="clear" w:color="auto" w:fill="F2F2F2" w:themeFill="background1" w:themeFillShade="F2"/>
             <w:tcMar>
@@ -4318,19 +4551,23 @@
             <w:pPr>
               <w:spacing w:after="0"/>
               <w:jc w:val="center"/>
+              <w:rPr>
+                <w:rFonts w:hint="eastAsia"/>
+              </w:rPr>
             </w:pPr>
             <w:r>
               <w:rPr>
                 <w:rFonts w:ascii="Arial" w:eastAsia="Arial" w:hAnsi="Arial" w:cs="Arial"/>
                 <w:color w:val="000000" w:themeColor="text1"/>
               </w:rPr>
-              <w:t>Gerente de Projeto</w:t>
+              <w:t>1</w:t>
             </w:r>
           </w:p>
         </w:tc>
         <w:tc>
           <w:tcPr>
-            <w:tcW w:w="2230" w:type="dxa"/>
+            <w:tcW w:w="4632" w:type="dxa"/>
+            <w:gridSpan w:val="4"/>
             <w:shd w:val="clear" w:color="auto" w:fill="F2F2F2" w:themeFill="background1" w:themeFillShade="F2"/>
             <w:tcMar>
               <w:top w:w="15" w:type="dxa"/>
@@ -4343,19 +4580,73 @@
             <w:pPr>
               <w:spacing w:after="0"/>
               <w:jc w:val="center"/>
+              <w:rPr>
+                <w:rFonts w:hint="eastAsia"/>
+                <w:color w:val="FF0000"/>
+              </w:rPr>
             </w:pPr>
             <w:r>
               <w:rPr>
+                <w:color w:val="FF0000"/>
+              </w:rPr>
+              <w:t>13000 – 27000</w:t>
+            </w:r>
+          </w:p>
+        </w:tc>
+      </w:tr>
+      <w:tr>
+        <w:trPr>
+          <w:trHeight w:val="300"/>
+        </w:trPr>
+        <w:tc>
+          <w:tcPr>
+            <w:tcW w:w="2220" w:type="dxa"/>
+            <w:shd w:val="clear" w:color="auto" w:fill="F2F2F2" w:themeFill="background1" w:themeFillShade="F2"/>
+            <w:tcMar>
+              <w:top w:w="15" w:type="dxa"/>
+              <w:left w:w="15" w:type="dxa"/>
+              <w:right w:w="15" w:type="dxa"/>
+            </w:tcMar>
+            <w:vAlign w:val="center"/>
+          </w:tcPr>
+          <w:p>
+            <w:pPr>
+              <w:spacing w:after="0"/>
+              <w:jc w:val="center"/>
+              <w:rPr>
+                <w:rFonts w:hint="eastAsia"/>
+              </w:rPr>
+            </w:pPr>
+            <w:proofErr w:type="spellStart"/>
+            <w:r>
+              <w:rPr>
                 <w:rFonts w:ascii="Arial" w:eastAsia="Arial" w:hAnsi="Arial" w:cs="Arial"/>
                 <w:color w:val="000000" w:themeColor="text1"/>
               </w:rPr>
-              <w:t>1</w:t>
+              <w:t>Dev</w:t>
             </w:r>
+            <w:proofErr w:type="spellEnd"/>
+            <w:r>
+              <w:rPr>
+                <w:rFonts w:ascii="Arial" w:eastAsia="Arial" w:hAnsi="Arial" w:cs="Arial"/>
+                <w:color w:val="000000" w:themeColor="text1"/>
+              </w:rPr>
+              <w:t xml:space="preserve"> </w:t>
+            </w:r>
+            <w:proofErr w:type="spellStart"/>
+            <w:r>
+              <w:rPr>
+                <w:rFonts w:ascii="Arial" w:eastAsia="Arial" w:hAnsi="Arial" w:cs="Arial"/>
+                <w:color w:val="000000" w:themeColor="text1"/>
+              </w:rPr>
+              <w:t>Backend</w:t>
+            </w:r>
+            <w:proofErr w:type="spellEnd"/>
           </w:p>
         </w:tc>
         <w:tc>
           <w:tcPr>
-            <w:tcW w:w="2224" w:type="dxa"/>
+            <w:tcW w:w="2219" w:type="dxa"/>
             <w:gridSpan w:val="2"/>
             <w:shd w:val="clear" w:color="auto" w:fill="F2F2F2" w:themeFill="background1" w:themeFillShade="F2"/>
             <w:tcMar>
@@ -4369,19 +4660,23 @@
             <w:pPr>
               <w:spacing w:after="0"/>
               <w:jc w:val="center"/>
+              <w:rPr>
+                <w:rFonts w:hint="eastAsia"/>
+              </w:rPr>
             </w:pPr>
             <w:r>
               <w:rPr>
                 <w:rFonts w:ascii="Arial" w:eastAsia="Arial" w:hAnsi="Arial" w:cs="Arial"/>
                 <w:color w:val="000000" w:themeColor="text1"/>
               </w:rPr>
-              <w:t>2500 - 4000</w:t>
+              <w:t>1</w:t>
             </w:r>
           </w:p>
         </w:tc>
         <w:tc>
           <w:tcPr>
-            <w:tcW w:w="2382" w:type="dxa"/>
+            <w:tcW w:w="4632" w:type="dxa"/>
+            <w:gridSpan w:val="4"/>
             <w:shd w:val="clear" w:color="auto" w:fill="F2F2F2" w:themeFill="background1" w:themeFillShade="F2"/>
             <w:tcMar>
               <w:top w:w="15" w:type="dxa"/>
@@ -4394,26 +4689,73 @@
             <w:pPr>
               <w:spacing w:after="0"/>
               <w:jc w:val="center"/>
+              <w:rPr>
+                <w:rFonts w:hint="eastAsia"/>
+                <w:color w:val="FF0000"/>
+              </w:rPr>
             </w:pPr>
             <w:r>
               <w:rPr>
-                <w:rFonts w:ascii="Arial" w:eastAsia="Arial" w:hAnsi="Arial" w:cs="Arial"/>
-                <w:color w:val="000000" w:themeColor="text1"/>
-              </w:rPr>
-              <w:t>2500 - 4000</w:t>
+                <w:color w:val="FF0000"/>
+              </w:rPr>
+              <w:t>5700 – 15000</w:t>
             </w:r>
           </w:p>
         </w:tc>
       </w:tr>
       <w:tr>
         <w:trPr>
-          <w:gridAfter w:val="1"/>
-          <w:wAfter w:w="29" w:type="dxa"/>
           <w:trHeight w:val="300"/>
         </w:trPr>
         <w:tc>
           <w:tcPr>
-            <w:tcW w:w="2225" w:type="dxa"/>
+            <w:tcW w:w="2220" w:type="dxa"/>
+            <w:shd w:val="clear" w:color="auto" w:fill="F2F2F2" w:themeFill="background1" w:themeFillShade="F2"/>
+            <w:tcMar>
+              <w:top w:w="15" w:type="dxa"/>
+              <w:left w:w="15" w:type="dxa"/>
+              <w:right w:w="15" w:type="dxa"/>
+            </w:tcMar>
+            <w:vAlign w:val="center"/>
+          </w:tcPr>
+          <w:p>
+            <w:pPr>
+              <w:spacing w:after="0"/>
+              <w:jc w:val="center"/>
+              <w:rPr>
+                <w:rFonts w:hint="eastAsia"/>
+              </w:rPr>
+            </w:pPr>
+            <w:proofErr w:type="spellStart"/>
+            <w:r>
+              <w:rPr>
+                <w:rFonts w:ascii="Arial" w:eastAsia="Arial" w:hAnsi="Arial" w:cs="Arial"/>
+                <w:color w:val="000000" w:themeColor="text1"/>
+              </w:rPr>
+              <w:t>Dev</w:t>
+            </w:r>
+            <w:proofErr w:type="spellEnd"/>
+            <w:r>
+              <w:rPr>
+                <w:rFonts w:ascii="Arial" w:eastAsia="Arial" w:hAnsi="Arial" w:cs="Arial"/>
+                <w:color w:val="000000" w:themeColor="text1"/>
+              </w:rPr>
+              <w:t xml:space="preserve"> </w:t>
+            </w:r>
+            <w:proofErr w:type="spellStart"/>
+            <w:r>
+              <w:rPr>
+                <w:rFonts w:ascii="Arial" w:eastAsia="Arial" w:hAnsi="Arial" w:cs="Arial"/>
+                <w:color w:val="000000" w:themeColor="text1"/>
+              </w:rPr>
+              <w:t>Frontend</w:t>
+            </w:r>
+            <w:proofErr w:type="spellEnd"/>
+          </w:p>
+        </w:tc>
+        <w:tc>
+          <w:tcPr>
+            <w:tcW w:w="2219" w:type="dxa"/>
             <w:gridSpan w:val="2"/>
             <w:shd w:val="clear" w:color="auto" w:fill="F2F2F2" w:themeFill="background1" w:themeFillShade="F2"/>
             <w:tcMar>
@@ -4427,19 +4769,23 @@
             <w:pPr>
               <w:spacing w:after="0"/>
               <w:jc w:val="center"/>
+              <w:rPr>
+                <w:rFonts w:hint="eastAsia"/>
+              </w:rPr>
             </w:pPr>
             <w:r>
               <w:rPr>
                 <w:rFonts w:ascii="Arial" w:eastAsia="Arial" w:hAnsi="Arial" w:cs="Arial"/>
                 <w:color w:val="000000" w:themeColor="text1"/>
               </w:rPr>
-              <w:t>Dev Backend</w:t>
+              <w:t>1</w:t>
             </w:r>
           </w:p>
         </w:tc>
         <w:tc>
           <w:tcPr>
-            <w:tcW w:w="2230" w:type="dxa"/>
+            <w:tcW w:w="4632" w:type="dxa"/>
+            <w:gridSpan w:val="4"/>
             <w:shd w:val="clear" w:color="auto" w:fill="F2F2F2" w:themeFill="background1" w:themeFillShade="F2"/>
             <w:tcMar>
               <w:top w:w="15" w:type="dxa"/>
@@ -4452,19 +4798,57 @@
             <w:pPr>
               <w:spacing w:after="0"/>
               <w:jc w:val="center"/>
+              <w:rPr>
+                <w:rFonts w:hint="eastAsia"/>
+                <w:color w:val="FF0000"/>
+              </w:rPr>
             </w:pPr>
             <w:r>
               <w:rPr>
+                <w:color w:val="FF0000"/>
+              </w:rPr>
+              <w:t>4500 – 20000</w:t>
+            </w:r>
+          </w:p>
+        </w:tc>
+      </w:tr>
+      <w:tr>
+        <w:trPr>
+          <w:trHeight w:val="300"/>
+        </w:trPr>
+        <w:tc>
+          <w:tcPr>
+            <w:tcW w:w="2220" w:type="dxa"/>
+            <w:shd w:val="clear" w:color="auto" w:fill="F2F2F2" w:themeFill="background1" w:themeFillShade="F2"/>
+            <w:tcMar>
+              <w:top w:w="15" w:type="dxa"/>
+              <w:left w:w="15" w:type="dxa"/>
+              <w:right w:w="15" w:type="dxa"/>
+            </w:tcMar>
+            <w:vAlign w:val="center"/>
+          </w:tcPr>
+          <w:p>
+            <w:pPr>
+              <w:spacing w:after="0"/>
+              <w:jc w:val="center"/>
+              <w:rPr>
+                <w:rFonts w:hint="eastAsia"/>
+              </w:rPr>
+            </w:pPr>
+            <w:proofErr w:type="spellStart"/>
+            <w:r>
+              <w:rPr>
                 <w:rFonts w:ascii="Arial" w:eastAsia="Arial" w:hAnsi="Arial" w:cs="Arial"/>
                 <w:color w:val="000000" w:themeColor="text1"/>
               </w:rPr>
-              <w:t>1</w:t>
+              <w:t>DevOps</w:t>
             </w:r>
+            <w:proofErr w:type="spellEnd"/>
           </w:p>
         </w:tc>
         <w:tc>
           <w:tcPr>
-            <w:tcW w:w="2224" w:type="dxa"/>
+            <w:tcW w:w="2219" w:type="dxa"/>
             <w:gridSpan w:val="2"/>
             <w:shd w:val="clear" w:color="auto" w:fill="F2F2F2" w:themeFill="background1" w:themeFillShade="F2"/>
             <w:tcMar>
@@ -4478,19 +4862,23 @@
             <w:pPr>
               <w:spacing w:after="0"/>
               <w:jc w:val="center"/>
+              <w:rPr>
+                <w:rFonts w:hint="eastAsia"/>
+              </w:rPr>
             </w:pPr>
             <w:r>
               <w:rPr>
                 <w:rFonts w:ascii="Arial" w:eastAsia="Arial" w:hAnsi="Arial" w:cs="Arial"/>
                 <w:color w:val="000000" w:themeColor="text1"/>
               </w:rPr>
-              <w:t>2000 - 3500</w:t>
+              <w:t>1</w:t>
             </w:r>
           </w:p>
         </w:tc>
         <w:tc>
           <w:tcPr>
-            <w:tcW w:w="2382" w:type="dxa"/>
+            <w:tcW w:w="4632" w:type="dxa"/>
+            <w:gridSpan w:val="4"/>
             <w:shd w:val="clear" w:color="auto" w:fill="F2F2F2" w:themeFill="background1" w:themeFillShade="F2"/>
             <w:tcMar>
               <w:top w:w="15" w:type="dxa"/>
@@ -4503,26 +4891,55 @@
             <w:pPr>
               <w:spacing w:after="0"/>
               <w:jc w:val="center"/>
+              <w:rPr>
+                <w:rFonts w:hint="eastAsia"/>
+                <w:color w:val="FF0000"/>
+              </w:rPr>
             </w:pPr>
             <w:r>
               <w:rPr>
-                <w:rFonts w:ascii="Arial" w:eastAsia="Arial" w:hAnsi="Arial" w:cs="Arial"/>
-                <w:color w:val="000000" w:themeColor="text1"/>
-              </w:rPr>
-              <w:t>2000 - 3500</w:t>
+                <w:color w:val="FF0000"/>
+              </w:rPr>
+              <w:t>7000 – 32000</w:t>
             </w:r>
           </w:p>
         </w:tc>
       </w:tr>
       <w:tr>
         <w:trPr>
-          <w:gridAfter w:val="1"/>
-          <w:wAfter w:w="29" w:type="dxa"/>
           <w:trHeight w:val="300"/>
         </w:trPr>
         <w:tc>
           <w:tcPr>
-            <w:tcW w:w="2225" w:type="dxa"/>
+            <w:tcW w:w="2220" w:type="dxa"/>
+            <w:shd w:val="clear" w:color="auto" w:fill="F2F2F2" w:themeFill="background1" w:themeFillShade="F2"/>
+            <w:tcMar>
+              <w:top w:w="15" w:type="dxa"/>
+              <w:left w:w="15" w:type="dxa"/>
+              <w:right w:w="15" w:type="dxa"/>
+            </w:tcMar>
+            <w:vAlign w:val="center"/>
+          </w:tcPr>
+          <w:p>
+            <w:pPr>
+              <w:spacing w:after="0"/>
+              <w:jc w:val="center"/>
+              <w:rPr>
+                <w:rFonts w:hint="eastAsia"/>
+              </w:rPr>
+            </w:pPr>
+            <w:r>
+              <w:rPr>
+                <w:rFonts w:ascii="Arial" w:eastAsia="Arial" w:hAnsi="Arial" w:cs="Arial"/>
+                <w:color w:val="000000" w:themeColor="text1"/>
+              </w:rPr>
+              <w:t>QA</w:t>
+            </w:r>
+          </w:p>
+        </w:tc>
+        <w:tc>
+          <w:tcPr>
+            <w:tcW w:w="2219" w:type="dxa"/>
             <w:gridSpan w:val="2"/>
             <w:shd w:val="clear" w:color="auto" w:fill="F2F2F2" w:themeFill="background1" w:themeFillShade="F2"/>
             <w:tcMar>
@@ -4536,19 +4953,23 @@
             <w:pPr>
               <w:spacing w:after="0"/>
               <w:jc w:val="center"/>
+              <w:rPr>
+                <w:rFonts w:hint="eastAsia"/>
+              </w:rPr>
             </w:pPr>
             <w:r>
               <w:rPr>
                 <w:rFonts w:ascii="Arial" w:eastAsia="Arial" w:hAnsi="Arial" w:cs="Arial"/>
                 <w:color w:val="000000" w:themeColor="text1"/>
               </w:rPr>
-              <w:t>Dev Frontend</w:t>
+              <w:t>1</w:t>
             </w:r>
           </w:p>
         </w:tc>
         <w:tc>
           <w:tcPr>
-            <w:tcW w:w="2230" w:type="dxa"/>
+            <w:tcW w:w="4632" w:type="dxa"/>
+            <w:gridSpan w:val="4"/>
             <w:shd w:val="clear" w:color="auto" w:fill="F2F2F2" w:themeFill="background1" w:themeFillShade="F2"/>
             <w:tcMar>
               <w:top w:w="15" w:type="dxa"/>
@@ -4561,19 +4982,55 @@
             <w:pPr>
               <w:spacing w:after="0"/>
               <w:jc w:val="center"/>
+              <w:rPr>
+                <w:rFonts w:hint="eastAsia"/>
+                <w:color w:val="FF0000"/>
+              </w:rPr>
             </w:pPr>
             <w:r>
               <w:rPr>
+                <w:color w:val="FF0000"/>
+              </w:rPr>
+              <w:t>4000 – 11000</w:t>
+            </w:r>
+          </w:p>
+        </w:tc>
+      </w:tr>
+      <w:tr>
+        <w:trPr>
+          <w:trHeight w:val="300"/>
+        </w:trPr>
+        <w:tc>
+          <w:tcPr>
+            <w:tcW w:w="2220" w:type="dxa"/>
+            <w:shd w:val="clear" w:color="auto" w:fill="F2F2F2" w:themeFill="background1" w:themeFillShade="F2"/>
+            <w:tcMar>
+              <w:top w:w="15" w:type="dxa"/>
+              <w:left w:w="15" w:type="dxa"/>
+              <w:right w:w="15" w:type="dxa"/>
+            </w:tcMar>
+            <w:vAlign w:val="center"/>
+          </w:tcPr>
+          <w:p>
+            <w:pPr>
+              <w:spacing w:after="0"/>
+              <w:jc w:val="center"/>
+              <w:rPr>
+                <w:rFonts w:hint="eastAsia"/>
+              </w:rPr>
+            </w:pPr>
+            <w:r>
+              <w:rPr>
                 <w:rFonts w:ascii="Arial" w:eastAsia="Arial" w:hAnsi="Arial" w:cs="Arial"/>
                 <w:color w:val="000000" w:themeColor="text1"/>
               </w:rPr>
-              <w:t>1</w:t>
+              <w:t>Analista NOC</w:t>
             </w:r>
           </w:p>
         </w:tc>
         <w:tc>
           <w:tcPr>
-            <w:tcW w:w="2224" w:type="dxa"/>
+            <w:tcW w:w="2219" w:type="dxa"/>
             <w:gridSpan w:val="2"/>
             <w:shd w:val="clear" w:color="auto" w:fill="F2F2F2" w:themeFill="background1" w:themeFillShade="F2"/>
             <w:tcMar>
@@ -4587,19 +5044,23 @@
             <w:pPr>
               <w:spacing w:after="0"/>
               <w:jc w:val="center"/>
+              <w:rPr>
+                <w:rFonts w:hint="eastAsia"/>
+              </w:rPr>
             </w:pPr>
             <w:r>
               <w:rPr>
                 <w:rFonts w:ascii="Arial" w:eastAsia="Arial" w:hAnsi="Arial" w:cs="Arial"/>
                 <w:color w:val="000000" w:themeColor="text1"/>
               </w:rPr>
-              <w:t>1800 - 3000</w:t>
+              <w:t>1</w:t>
             </w:r>
           </w:p>
         </w:tc>
         <w:tc>
           <w:tcPr>
-            <w:tcW w:w="2382" w:type="dxa"/>
+            <w:tcW w:w="4632" w:type="dxa"/>
+            <w:gridSpan w:val="4"/>
             <w:shd w:val="clear" w:color="auto" w:fill="F2F2F2" w:themeFill="background1" w:themeFillShade="F2"/>
             <w:tcMar>
               <w:top w:w="15" w:type="dxa"/>
@@ -4612,26 +5073,181 @@
             <w:pPr>
               <w:spacing w:after="0"/>
               <w:jc w:val="center"/>
+              <w:rPr>
+                <w:rFonts w:hint="eastAsia"/>
+                <w:color w:val="FF0000"/>
+              </w:rPr>
             </w:pPr>
             <w:r>
               <w:rPr>
-                <w:rFonts w:ascii="Arial" w:eastAsia="Arial" w:hAnsi="Arial" w:cs="Arial"/>
-                <w:color w:val="000000" w:themeColor="text1"/>
-              </w:rPr>
-              <w:t>1800 - 3000</w:t>
+                <w:color w:val="FF0000"/>
+              </w:rPr>
+              <w:t>2000 – 5000</w:t>
             </w:r>
           </w:p>
         </w:tc>
       </w:tr>
       <w:tr>
         <w:trPr>
-          <w:gridAfter w:val="1"/>
-          <w:wAfter w:w="29" w:type="dxa"/>
           <w:trHeight w:val="300"/>
         </w:trPr>
         <w:tc>
           <w:tcPr>
-            <w:tcW w:w="2225" w:type="dxa"/>
+            <w:tcW w:w="2220" w:type="dxa"/>
+            <w:shd w:val="clear" w:color="auto" w:fill="4F81BD"/>
+            <w:tcMar>
+              <w:top w:w="15" w:type="dxa"/>
+              <w:left w:w="15" w:type="dxa"/>
+              <w:right w:w="15" w:type="dxa"/>
+            </w:tcMar>
+            <w:vAlign w:val="center"/>
+          </w:tcPr>
+          <w:p>
+            <w:pPr>
+              <w:spacing w:after="0"/>
+              <w:jc w:val="center"/>
+              <w:rPr>
+                <w:rFonts w:hint="eastAsia"/>
+              </w:rPr>
+            </w:pPr>
+            <w:r>
+              <w:rPr>
+                <w:rFonts w:ascii="Arial" w:eastAsia="Arial" w:hAnsi="Arial" w:cs="Arial"/>
+                <w:b/>
+                <w:bCs/>
+                <w:color w:val="FFFFFF" w:themeColor="background1"/>
+              </w:rPr>
+              <w:t>Recurso</w:t>
+            </w:r>
+          </w:p>
+        </w:tc>
+        <w:tc>
+          <w:tcPr>
+            <w:tcW w:w="3045" w:type="dxa"/>
+            <w:gridSpan w:val="4"/>
+            <w:shd w:val="clear" w:color="auto" w:fill="4F81BD"/>
+            <w:tcMar>
+              <w:top w:w="15" w:type="dxa"/>
+              <w:left w:w="15" w:type="dxa"/>
+              <w:right w:w="15" w:type="dxa"/>
+            </w:tcMar>
+            <w:vAlign w:val="center"/>
+          </w:tcPr>
+          <w:p>
+            <w:pPr>
+              <w:spacing w:after="0"/>
+              <w:jc w:val="center"/>
+              <w:rPr>
+                <w:rFonts w:hint="eastAsia"/>
+              </w:rPr>
+            </w:pPr>
+            <w:r>
+              <w:rPr>
+                <w:rFonts w:ascii="Arial" w:eastAsia="Arial" w:hAnsi="Arial" w:cs="Arial"/>
+                <w:b/>
+                <w:bCs/>
+                <w:color w:val="FFFFFF" w:themeColor="background1"/>
+              </w:rPr>
+              <w:t>Descrição</w:t>
+            </w:r>
+          </w:p>
+        </w:tc>
+        <w:tc>
+          <w:tcPr>
+            <w:tcW w:w="3806" w:type="dxa"/>
+            <w:gridSpan w:val="2"/>
+            <w:shd w:val="clear" w:color="auto" w:fill="4F81BD"/>
+            <w:tcMar>
+              <w:top w:w="15" w:type="dxa"/>
+              <w:left w:w="15" w:type="dxa"/>
+              <w:right w:w="15" w:type="dxa"/>
+            </w:tcMar>
+            <w:vAlign w:val="center"/>
+          </w:tcPr>
+          <w:p>
+            <w:pPr>
+              <w:spacing w:after="0"/>
+              <w:jc w:val="center"/>
+              <w:rPr>
+                <w:rFonts w:hint="eastAsia"/>
+              </w:rPr>
+            </w:pPr>
+            <w:r>
+              <w:rPr>
+                <w:rFonts w:ascii="Arial" w:eastAsia="Arial" w:hAnsi="Arial" w:cs="Arial"/>
+                <w:b/>
+                <w:bCs/>
+                <w:color w:val="FFFFFF" w:themeColor="background1"/>
+              </w:rPr>
+              <w:t>Custo Estimado (USD)</w:t>
+            </w:r>
+          </w:p>
+        </w:tc>
+      </w:tr>
+      <w:tr>
+        <w:trPr>
+          <w:trHeight w:val="615"/>
+        </w:trPr>
+        <w:tc>
+          <w:tcPr>
+            <w:tcW w:w="2220" w:type="dxa"/>
+            <w:shd w:val="clear" w:color="auto" w:fill="F2F2F2" w:themeFill="background1" w:themeFillShade="F2"/>
+            <w:tcMar>
+              <w:top w:w="15" w:type="dxa"/>
+              <w:left w:w="15" w:type="dxa"/>
+              <w:right w:w="15" w:type="dxa"/>
+            </w:tcMar>
+            <w:vAlign w:val="center"/>
+          </w:tcPr>
+          <w:p>
+            <w:pPr>
+              <w:spacing w:after="0"/>
+              <w:jc w:val="center"/>
+              <w:rPr>
+                <w:rFonts w:hint="eastAsia"/>
+              </w:rPr>
+            </w:pPr>
+            <w:r>
+              <w:rPr>
+                <w:rFonts w:ascii="Arial" w:eastAsia="Arial" w:hAnsi="Arial" w:cs="Arial"/>
+                <w:color w:val="000000" w:themeColor="text1"/>
+              </w:rPr>
+              <w:t>Notebook Desenvolvedor</w:t>
+            </w:r>
+          </w:p>
+        </w:tc>
+        <w:tc>
+          <w:tcPr>
+            <w:tcW w:w="3045" w:type="dxa"/>
+            <w:gridSpan w:val="4"/>
+            <w:shd w:val="clear" w:color="auto" w:fill="F2F2F2" w:themeFill="background1" w:themeFillShade="F2"/>
+            <w:tcMar>
+              <w:top w:w="15" w:type="dxa"/>
+              <w:left w:w="15" w:type="dxa"/>
+              <w:right w:w="15" w:type="dxa"/>
+            </w:tcMar>
+            <w:vAlign w:val="center"/>
+          </w:tcPr>
+          <w:p>
+            <w:pPr>
+              <w:spacing w:after="0"/>
+              <w:jc w:val="center"/>
+              <w:rPr>
+                <w:rFonts w:hint="eastAsia"/>
+              </w:rPr>
+            </w:pPr>
+            <w:r>
+              <w:rPr>
+                <w:rFonts w:ascii="Arial" w:eastAsia="Arial" w:hAnsi="Arial" w:cs="Arial"/>
+                <w:color w:val="000000" w:themeColor="text1"/>
+              </w:rPr>
+              <w:t>Máquina própria para desenvolvimento</w:t>
+            </w:r>
+          </w:p>
+        </w:tc>
+        <w:tc>
+          <w:tcPr>
+            <w:tcW w:w="3806" w:type="dxa"/>
             <w:gridSpan w:val="2"/>
             <w:shd w:val="clear" w:color="auto" w:fill="F2F2F2" w:themeFill="background1" w:themeFillShade="F2"/>
             <w:tcMar>
@@ -4645,19 +5261,27 @@
             <w:pPr>
               <w:spacing w:after="0"/>
               <w:jc w:val="center"/>
+              <w:rPr>
+                <w:rFonts w:hint="eastAsia"/>
+              </w:rPr>
             </w:pPr>
             <w:r>
               <w:rPr>
                 <w:rFonts w:ascii="Arial" w:eastAsia="Arial" w:hAnsi="Arial" w:cs="Arial"/>
                 <w:color w:val="000000" w:themeColor="text1"/>
               </w:rPr>
-              <w:t>DevOps</w:t>
+              <w:t>1000 - 1500 (único)</w:t>
             </w:r>
           </w:p>
         </w:tc>
+      </w:tr>
+      <w:tr>
+        <w:trPr>
+          <w:trHeight w:val="300"/>
+        </w:trPr>
         <w:tc>
           <w:tcPr>
-            <w:tcW w:w="2230" w:type="dxa"/>
+            <w:tcW w:w="2220" w:type="dxa"/>
             <w:shd w:val="clear" w:color="auto" w:fill="F2F2F2" w:themeFill="background1" w:themeFillShade="F2"/>
             <w:tcMar>
               <w:top w:w="15" w:type="dxa"/>
@@ -4670,19 +5294,51 @@
             <w:pPr>
               <w:spacing w:after="0"/>
               <w:jc w:val="center"/>
+              <w:rPr>
+                <w:rFonts w:hint="eastAsia"/>
+              </w:rPr>
             </w:pPr>
             <w:r>
               <w:rPr>
                 <w:rFonts w:ascii="Arial" w:eastAsia="Arial" w:hAnsi="Arial" w:cs="Arial"/>
                 <w:color w:val="000000" w:themeColor="text1"/>
               </w:rPr>
-              <w:t>1</w:t>
+              <w:t>Energia</w:t>
             </w:r>
           </w:p>
         </w:tc>
         <w:tc>
           <w:tcPr>
-            <w:tcW w:w="2224" w:type="dxa"/>
+            <w:tcW w:w="3045" w:type="dxa"/>
+            <w:gridSpan w:val="4"/>
+            <w:shd w:val="clear" w:color="auto" w:fill="F2F2F2" w:themeFill="background1" w:themeFillShade="F2"/>
+            <w:tcMar>
+              <w:top w:w="15" w:type="dxa"/>
+              <w:left w:w="15" w:type="dxa"/>
+              <w:right w:w="15" w:type="dxa"/>
+            </w:tcMar>
+            <w:vAlign w:val="center"/>
+          </w:tcPr>
+          <w:p>
+            <w:pPr>
+              <w:spacing w:after="0"/>
+              <w:jc w:val="center"/>
+              <w:rPr>
+                <w:rFonts w:hint="eastAsia"/>
+              </w:rPr>
+            </w:pPr>
+            <w:r>
+              <w:rPr>
+                <w:rFonts w:ascii="Arial" w:eastAsia="Arial" w:hAnsi="Arial" w:cs="Arial"/>
+                <w:color w:val="000000" w:themeColor="text1"/>
+              </w:rPr>
+              <w:t>Consumo mensal</w:t>
+            </w:r>
+          </w:p>
+        </w:tc>
+        <w:tc>
+          <w:tcPr>
+            <w:tcW w:w="3806" w:type="dxa"/>
             <w:gridSpan w:val="2"/>
             <w:shd w:val="clear" w:color="auto" w:fill="F2F2F2" w:themeFill="background1" w:themeFillShade="F2"/>
             <w:tcMar>
@@ -4696,19 +5352,27 @@
             <w:pPr>
               <w:spacing w:after="0"/>
               <w:jc w:val="center"/>
+              <w:rPr>
+                <w:rFonts w:hint="eastAsia"/>
+              </w:rPr>
             </w:pPr>
             <w:r>
               <w:rPr>
                 <w:rFonts w:ascii="Arial" w:eastAsia="Arial" w:hAnsi="Arial" w:cs="Arial"/>
                 <w:color w:val="000000" w:themeColor="text1"/>
               </w:rPr>
-              <w:t>2500 - 4000</w:t>
+              <w:t>XXXXXX</w:t>
             </w:r>
           </w:p>
         </w:tc>
+      </w:tr>
+      <w:tr>
+        <w:trPr>
+          <w:trHeight w:val="300"/>
+        </w:trPr>
         <w:tc>
           <w:tcPr>
-            <w:tcW w:w="2382" w:type="dxa"/>
+            <w:tcW w:w="2220" w:type="dxa"/>
             <w:shd w:val="clear" w:color="auto" w:fill="F2F2F2" w:themeFill="background1" w:themeFillShade="F2"/>
             <w:tcMar>
               <w:top w:w="15" w:type="dxa"/>
@@ -4721,26 +5385,51 @@
             <w:pPr>
               <w:spacing w:after="0"/>
               <w:jc w:val="center"/>
+              <w:rPr>
+                <w:rFonts w:hint="eastAsia"/>
+              </w:rPr>
             </w:pPr>
             <w:r>
               <w:rPr>
                 <w:rFonts w:ascii="Arial" w:eastAsia="Arial" w:hAnsi="Arial" w:cs="Arial"/>
                 <w:color w:val="000000" w:themeColor="text1"/>
               </w:rPr>
-              <w:t>2500 - 4000</w:t>
+              <w:t>Internet</w:t>
             </w:r>
           </w:p>
         </w:tc>
-      </w:tr>
-      <w:tr>
-        <w:trPr>
-          <w:gridAfter w:val="1"/>
-          <w:wAfter w:w="29" w:type="dxa"/>
-          <w:trHeight w:val="300"/>
-        </w:trPr>
         <w:tc>
           <w:tcPr>
-            <w:tcW w:w="2225" w:type="dxa"/>
+            <w:tcW w:w="3045" w:type="dxa"/>
+            <w:gridSpan w:val="4"/>
+            <w:shd w:val="clear" w:color="auto" w:fill="F2F2F2" w:themeFill="background1" w:themeFillShade="F2"/>
+            <w:tcMar>
+              <w:top w:w="15" w:type="dxa"/>
+              <w:left w:w="15" w:type="dxa"/>
+              <w:right w:w="15" w:type="dxa"/>
+            </w:tcMar>
+            <w:vAlign w:val="center"/>
+          </w:tcPr>
+          <w:p>
+            <w:pPr>
+              <w:spacing w:after="0"/>
+              <w:jc w:val="center"/>
+              <w:rPr>
+                <w:rFonts w:hint="eastAsia"/>
+              </w:rPr>
+            </w:pPr>
+            <w:r>
+              <w:rPr>
+                <w:rFonts w:ascii="Arial" w:eastAsia="Arial" w:hAnsi="Arial" w:cs="Arial"/>
+                <w:color w:val="000000" w:themeColor="text1"/>
+              </w:rPr>
+              <w:t>Conectividade</w:t>
+            </w:r>
+          </w:p>
+        </w:tc>
+        <w:tc>
+          <w:tcPr>
+            <w:tcW w:w="3806" w:type="dxa"/>
             <w:gridSpan w:val="2"/>
             <w:shd w:val="clear" w:color="auto" w:fill="F2F2F2" w:themeFill="background1" w:themeFillShade="F2"/>
             <w:tcMar>
@@ -4754,19 +5443,27 @@
             <w:pPr>
               <w:spacing w:after="0"/>
               <w:jc w:val="center"/>
+              <w:rPr>
+                <w:rFonts w:hint="eastAsia"/>
+              </w:rPr>
             </w:pPr>
             <w:r>
               <w:rPr>
                 <w:rFonts w:ascii="Arial" w:eastAsia="Arial" w:hAnsi="Arial" w:cs="Arial"/>
                 <w:color w:val="000000" w:themeColor="text1"/>
               </w:rPr>
-              <w:t>QA</w:t>
+              <w:t>XXXXXX</w:t>
             </w:r>
           </w:p>
         </w:tc>
+      </w:tr>
+      <w:tr>
+        <w:trPr>
+          <w:trHeight w:val="300"/>
+        </w:trPr>
         <w:tc>
           <w:tcPr>
-            <w:tcW w:w="2230" w:type="dxa"/>
+            <w:tcW w:w="2220" w:type="dxa"/>
             <w:shd w:val="clear" w:color="auto" w:fill="F2F2F2" w:themeFill="background1" w:themeFillShade="F2"/>
             <w:tcMar>
               <w:top w:w="15" w:type="dxa"/>
@@ -4779,19 +5476,51 @@
             <w:pPr>
               <w:spacing w:after="0"/>
               <w:jc w:val="center"/>
+              <w:rPr>
+                <w:rFonts w:hint="eastAsia"/>
+              </w:rPr>
             </w:pPr>
             <w:r>
               <w:rPr>
                 <w:rFonts w:ascii="Arial" w:eastAsia="Arial" w:hAnsi="Arial" w:cs="Arial"/>
                 <w:color w:val="000000" w:themeColor="text1"/>
               </w:rPr>
-              <w:t>1</w:t>
+              <w:t>Ambiente Teste AWS</w:t>
             </w:r>
           </w:p>
         </w:tc>
         <w:tc>
           <w:tcPr>
-            <w:tcW w:w="2224" w:type="dxa"/>
+            <w:tcW w:w="3045" w:type="dxa"/>
+            <w:gridSpan w:val="4"/>
+            <w:shd w:val="clear" w:color="auto" w:fill="F2F2F2" w:themeFill="background1" w:themeFillShade="F2"/>
+            <w:tcMar>
+              <w:top w:w="15" w:type="dxa"/>
+              <w:left w:w="15" w:type="dxa"/>
+              <w:right w:w="15" w:type="dxa"/>
+            </w:tcMar>
+            <w:vAlign w:val="center"/>
+          </w:tcPr>
+          <w:p>
+            <w:pPr>
+              <w:spacing w:after="0"/>
+              <w:jc w:val="center"/>
+              <w:rPr>
+                <w:rFonts w:hint="eastAsia"/>
+              </w:rPr>
+            </w:pPr>
+            <w:r>
+              <w:rPr>
+                <w:rFonts w:ascii="Arial" w:eastAsia="Arial" w:hAnsi="Arial" w:cs="Arial"/>
+                <w:color w:val="000000" w:themeColor="text1"/>
+              </w:rPr>
+              <w:t>XXXXXX</w:t>
+            </w:r>
+          </w:p>
+        </w:tc>
+        <w:tc>
+          <w:tcPr>
+            <w:tcW w:w="3806" w:type="dxa"/>
             <w:gridSpan w:val="2"/>
             <w:shd w:val="clear" w:color="auto" w:fill="F2F2F2" w:themeFill="background1" w:themeFillShade="F2"/>
             <w:tcMar>
@@ -4805,19 +5534,27 @@
             <w:pPr>
               <w:spacing w:after="0"/>
               <w:jc w:val="center"/>
+              <w:rPr>
+                <w:rFonts w:hint="eastAsia"/>
+              </w:rPr>
             </w:pPr>
             <w:r>
               <w:rPr>
                 <w:rFonts w:ascii="Arial" w:eastAsia="Arial" w:hAnsi="Arial" w:cs="Arial"/>
                 <w:color w:val="000000" w:themeColor="text1"/>
               </w:rPr>
-              <w:t>1500 - 2500</w:t>
+              <w:t>XXXXXX</w:t>
             </w:r>
           </w:p>
         </w:tc>
+      </w:tr>
+      <w:tr>
+        <w:trPr>
+          <w:trHeight w:val="615"/>
+        </w:trPr>
         <w:tc>
           <w:tcPr>
-            <w:tcW w:w="2382" w:type="dxa"/>
+            <w:tcW w:w="2220" w:type="dxa"/>
             <w:shd w:val="clear" w:color="auto" w:fill="F2F2F2" w:themeFill="background1" w:themeFillShade="F2"/>
             <w:tcMar>
               <w:top w:w="15" w:type="dxa"/>
@@ -4830,26 +5567,51 @@
             <w:pPr>
               <w:spacing w:after="0"/>
               <w:jc w:val="center"/>
+              <w:rPr>
+                <w:rFonts w:hint="eastAsia"/>
+              </w:rPr>
             </w:pPr>
             <w:r>
               <w:rPr>
                 <w:rFonts w:ascii="Arial" w:eastAsia="Arial" w:hAnsi="Arial" w:cs="Arial"/>
                 <w:color w:val="000000" w:themeColor="text1"/>
               </w:rPr>
-              <w:t>1500 - 2500</w:t>
+              <w:t>Documentação</w:t>
             </w:r>
           </w:p>
         </w:tc>
-      </w:tr>
-      <w:tr>
-        <w:trPr>
-          <w:gridAfter w:val="1"/>
-          <w:wAfter w:w="29" w:type="dxa"/>
-          <w:trHeight w:val="300"/>
-        </w:trPr>
         <w:tc>
           <w:tcPr>
-            <w:tcW w:w="2225" w:type="dxa"/>
+            <w:tcW w:w="3045" w:type="dxa"/>
+            <w:gridSpan w:val="4"/>
+            <w:shd w:val="clear" w:color="auto" w:fill="F2F2F2" w:themeFill="background1" w:themeFillShade="F2"/>
+            <w:tcMar>
+              <w:top w:w="15" w:type="dxa"/>
+              <w:left w:w="15" w:type="dxa"/>
+              <w:right w:w="15" w:type="dxa"/>
+            </w:tcMar>
+            <w:vAlign w:val="center"/>
+          </w:tcPr>
+          <w:p>
+            <w:pPr>
+              <w:spacing w:after="0"/>
+              <w:jc w:val="center"/>
+              <w:rPr>
+                <w:rFonts w:hint="eastAsia"/>
+              </w:rPr>
+            </w:pPr>
+            <w:r>
+              <w:rPr>
+                <w:rFonts w:ascii="Arial" w:eastAsia="Arial" w:hAnsi="Arial" w:cs="Arial"/>
+                <w:color w:val="000000" w:themeColor="text1"/>
+              </w:rPr>
+              <w:t>Governança</w:t>
+            </w:r>
+          </w:p>
+        </w:tc>
+        <w:tc>
+          <w:tcPr>
+            <w:tcW w:w="3806" w:type="dxa"/>
             <w:gridSpan w:val="2"/>
             <w:shd w:val="clear" w:color="auto" w:fill="F2F2F2" w:themeFill="background1" w:themeFillShade="F2"/>
             <w:tcMar>
@@ -4863,19 +5625,27 @@
             <w:pPr>
               <w:spacing w:after="0"/>
               <w:jc w:val="center"/>
+              <w:rPr>
+                <w:rFonts w:hint="eastAsia"/>
+              </w:rPr>
             </w:pPr>
             <w:r>
               <w:rPr>
                 <w:rFonts w:ascii="Arial" w:eastAsia="Arial" w:hAnsi="Arial" w:cs="Arial"/>
                 <w:color w:val="000000" w:themeColor="text1"/>
               </w:rPr>
-              <w:t>Analista NOC</w:t>
+              <w:t>Gratuito/Incluso RH (recursos humanos)</w:t>
             </w:r>
           </w:p>
         </w:tc>
+      </w:tr>
+      <w:tr>
+        <w:trPr>
+          <w:trHeight w:val="300"/>
+        </w:trPr>
         <w:tc>
           <w:tcPr>
-            <w:tcW w:w="2230" w:type="dxa"/>
+            <w:tcW w:w="2220" w:type="dxa"/>
             <w:shd w:val="clear" w:color="auto" w:fill="F2F2F2" w:themeFill="background1" w:themeFillShade="F2"/>
             <w:tcMar>
               <w:top w:w="15" w:type="dxa"/>
@@ -4888,19 +5658,51 @@
             <w:pPr>
               <w:spacing w:after="0"/>
               <w:jc w:val="center"/>
+              <w:rPr>
+                <w:rFonts w:hint="eastAsia"/>
+              </w:rPr>
             </w:pPr>
             <w:r>
               <w:rPr>
                 <w:rFonts w:ascii="Arial" w:eastAsia="Arial" w:hAnsi="Arial" w:cs="Arial"/>
                 <w:color w:val="000000" w:themeColor="text1"/>
               </w:rPr>
-              <w:t>1</w:t>
+              <w:t>Aplicação Client Python</w:t>
             </w:r>
           </w:p>
         </w:tc>
         <w:tc>
           <w:tcPr>
-            <w:tcW w:w="2224" w:type="dxa"/>
+            <w:tcW w:w="3045" w:type="dxa"/>
+            <w:gridSpan w:val="4"/>
+            <w:shd w:val="clear" w:color="auto" w:fill="F2F2F2" w:themeFill="background1" w:themeFillShade="F2"/>
+            <w:tcMar>
+              <w:top w:w="15" w:type="dxa"/>
+              <w:left w:w="15" w:type="dxa"/>
+              <w:right w:w="15" w:type="dxa"/>
+            </w:tcMar>
+            <w:vAlign w:val="center"/>
+          </w:tcPr>
+          <w:p>
+            <w:pPr>
+              <w:spacing w:after="0"/>
+              <w:jc w:val="center"/>
+              <w:rPr>
+                <w:rFonts w:hint="eastAsia"/>
+              </w:rPr>
+            </w:pPr>
+            <w:r>
+              <w:rPr>
+                <w:rFonts w:ascii="Arial" w:eastAsia="Arial" w:hAnsi="Arial" w:cs="Arial"/>
+                <w:color w:val="000000" w:themeColor="text1"/>
+              </w:rPr>
+              <w:t>Agente de monitoramento</w:t>
+            </w:r>
+          </w:p>
+        </w:tc>
+        <w:tc>
+          <w:tcPr>
+            <w:tcW w:w="3806" w:type="dxa"/>
             <w:gridSpan w:val="2"/>
             <w:shd w:val="clear" w:color="auto" w:fill="F2F2F2" w:themeFill="background1" w:themeFillShade="F2"/>
             <w:tcMar>
@@ -4914,19 +5716,27 @@
             <w:pPr>
               <w:spacing w:after="0"/>
               <w:jc w:val="center"/>
+              <w:rPr>
+                <w:rFonts w:hint="eastAsia"/>
+              </w:rPr>
             </w:pPr>
             <w:r>
               <w:rPr>
                 <w:rFonts w:ascii="Arial" w:eastAsia="Arial" w:hAnsi="Arial" w:cs="Arial"/>
                 <w:color w:val="000000" w:themeColor="text1"/>
               </w:rPr>
-              <w:t>1500 - 2500</w:t>
+              <w:t>Sem custo licença</w:t>
             </w:r>
           </w:p>
         </w:tc>
+      </w:tr>
+      <w:tr>
+        <w:trPr>
+          <w:trHeight w:val="615"/>
+        </w:trPr>
         <w:tc>
           <w:tcPr>
-            <w:tcW w:w="2382" w:type="dxa"/>
+            <w:tcW w:w="2220" w:type="dxa"/>
             <w:shd w:val="clear" w:color="auto" w:fill="F2F2F2" w:themeFill="background1" w:themeFillShade="F2"/>
             <w:tcMar>
               <w:top w:w="15" w:type="dxa"/>
@@ -4939,112 +5749,24 @@
             <w:pPr>
               <w:spacing w:after="0"/>
               <w:jc w:val="center"/>
+              <w:rPr>
+                <w:rFonts w:ascii="Arial" w:eastAsia="Arial" w:hAnsi="Arial" w:cs="Arial"/>
+                <w:color w:val="000000" w:themeColor="text1"/>
+              </w:rPr>
             </w:pPr>
             <w:r>
               <w:rPr>
                 <w:rFonts w:ascii="Arial" w:eastAsia="Arial" w:hAnsi="Arial" w:cs="Arial"/>
                 <w:color w:val="000000" w:themeColor="text1"/>
               </w:rPr>
-              <w:t>1500 - 2500</w:t>
-            </w:r>
-          </w:p>
-        </w:tc>
-      </w:tr>
-      <w:tr>
-        <w:trPr>
-          <w:trHeight w:val="300"/>
-        </w:trPr>
-        <w:tc>
-          <w:tcPr>
-            <w:tcW w:w="2198" w:type="dxa"/>
-            <w:shd w:val="clear" w:color="auto" w:fill="4F81BD"/>
-            <w:tcMar>
-              <w:top w:w="15" w:type="dxa"/>
-              <w:left w:w="15" w:type="dxa"/>
-              <w:right w:w="15" w:type="dxa"/>
-            </w:tcMar>
-            <w:vAlign w:val="center"/>
-          </w:tcPr>
-          <w:p>
-            <w:pPr>
-              <w:spacing w:after="0"/>
-              <w:jc w:val="center"/>
-            </w:pPr>
-            <w:r>
-              <w:rPr>
-                <w:rFonts w:ascii="Arial" w:eastAsia="Arial" w:hAnsi="Arial" w:cs="Arial"/>
-                <w:b/>
-                <w:bCs/>
-                <w:color w:val="FFFFFF" w:themeColor="background1"/>
-              </w:rPr>
-              <w:t>Recurso</w:t>
+              <w:t>API Backend</w:t>
             </w:r>
           </w:p>
         </w:tc>
         <w:tc>
           <w:tcPr>
-            <w:tcW w:w="3060" w:type="dxa"/>
-            <w:gridSpan w:val="3"/>
-            <w:shd w:val="clear" w:color="auto" w:fill="4F81BD"/>
-            <w:tcMar>
-              <w:top w:w="15" w:type="dxa"/>
-              <w:left w:w="15" w:type="dxa"/>
-              <w:right w:w="15" w:type="dxa"/>
-            </w:tcMar>
-            <w:vAlign w:val="center"/>
-          </w:tcPr>
-          <w:p>
-            <w:pPr>
-              <w:spacing w:after="0"/>
-              <w:jc w:val="center"/>
-            </w:pPr>
-            <w:r>
-              <w:rPr>
-                <w:rFonts w:ascii="Arial" w:eastAsia="Arial" w:hAnsi="Arial" w:cs="Arial"/>
-                <w:b/>
-                <w:bCs/>
-                <w:color w:val="FFFFFF" w:themeColor="background1"/>
-              </w:rPr>
-              <w:t>Descrição</w:t>
-            </w:r>
-          </w:p>
-        </w:tc>
-        <w:tc>
-          <w:tcPr>
-            <w:tcW w:w="3832" w:type="dxa"/>
-            <w:gridSpan w:val="3"/>
-            <w:shd w:val="clear" w:color="auto" w:fill="4F81BD"/>
-            <w:tcMar>
-              <w:top w:w="15" w:type="dxa"/>
-              <w:left w:w="15" w:type="dxa"/>
-              <w:right w:w="15" w:type="dxa"/>
-            </w:tcMar>
-            <w:vAlign w:val="center"/>
-          </w:tcPr>
-          <w:p>
-            <w:pPr>
-              <w:spacing w:after="0"/>
-              <w:jc w:val="center"/>
-            </w:pPr>
-            <w:r>
-              <w:rPr>
-                <w:rFonts w:ascii="Arial" w:eastAsia="Arial" w:hAnsi="Arial" w:cs="Arial"/>
-                <w:b/>
-                <w:bCs/>
-                <w:color w:val="FFFFFF" w:themeColor="background1"/>
-              </w:rPr>
-              <w:t>Custo Estimado (USD)</w:t>
-            </w:r>
-          </w:p>
-        </w:tc>
-      </w:tr>
-      <w:tr>
-        <w:trPr>
-          <w:trHeight w:val="615"/>
-        </w:trPr>
-        <w:tc>
-          <w:tcPr>
-            <w:tcW w:w="2198" w:type="dxa"/>
+            <w:tcW w:w="3045" w:type="dxa"/>
+            <w:gridSpan w:val="4"/>
             <w:shd w:val="clear" w:color="auto" w:fill="F2F2F2" w:themeFill="background1" w:themeFillShade="F2"/>
             <w:tcMar>
               <w:top w:w="15" w:type="dxa"/>
@@ -5057,20 +5779,23 @@
             <w:pPr>
               <w:spacing w:after="0"/>
               <w:jc w:val="center"/>
+              <w:rPr>
+                <w:rFonts w:hint="eastAsia"/>
+              </w:rPr>
             </w:pPr>
             <w:r>
               <w:rPr>
                 <w:rFonts w:ascii="Arial" w:eastAsia="Arial" w:hAnsi="Arial" w:cs="Arial"/>
                 <w:color w:val="000000" w:themeColor="text1"/>
               </w:rPr>
-              <w:t>Notebook Desenvolvedor</w:t>
+              <w:t>Processamento e integração</w:t>
             </w:r>
           </w:p>
         </w:tc>
         <w:tc>
           <w:tcPr>
-            <w:tcW w:w="3060" w:type="dxa"/>
-            <w:gridSpan w:val="3"/>
+            <w:tcW w:w="3806" w:type="dxa"/>
+            <w:gridSpan w:val="2"/>
             <w:shd w:val="clear" w:color="auto" w:fill="F2F2F2" w:themeFill="background1" w:themeFillShade="F2"/>
             <w:tcMar>
               <w:top w:w="15" w:type="dxa"/>
@@ -5083,20 +5808,27 @@
             <w:pPr>
               <w:spacing w:after="0"/>
               <w:jc w:val="center"/>
+              <w:rPr>
+                <w:rFonts w:hint="eastAsia"/>
+              </w:rPr>
             </w:pPr>
             <w:r>
               <w:rPr>
                 <w:rFonts w:ascii="Arial" w:eastAsia="Arial" w:hAnsi="Arial" w:cs="Arial"/>
                 <w:color w:val="000000" w:themeColor="text1"/>
               </w:rPr>
-              <w:t>Máquina própria para desenvolvimento</w:t>
+              <w:t>Incluso RH (recursos humanos)</w:t>
             </w:r>
           </w:p>
         </w:tc>
+      </w:tr>
+      <w:tr>
+        <w:trPr>
+          <w:trHeight w:val="615"/>
+        </w:trPr>
         <w:tc>
           <w:tcPr>
-            <w:tcW w:w="3832" w:type="dxa"/>
-            <w:gridSpan w:val="3"/>
+            <w:tcW w:w="2220" w:type="dxa"/>
             <w:shd w:val="clear" w:color="auto" w:fill="F2F2F2" w:themeFill="background1" w:themeFillShade="F2"/>
             <w:tcMar>
               <w:top w:w="15" w:type="dxa"/>
@@ -5109,24 +5841,23 @@
             <w:pPr>
               <w:spacing w:after="0"/>
               <w:jc w:val="center"/>
+              <w:rPr>
+                <w:rFonts w:hint="eastAsia"/>
+              </w:rPr>
             </w:pPr>
             <w:r>
               <w:rPr>
                 <w:rFonts w:ascii="Arial" w:eastAsia="Arial" w:hAnsi="Arial" w:cs="Arial"/>
                 <w:color w:val="000000" w:themeColor="text1"/>
               </w:rPr>
-              <w:t>1000 - 1500 (único)</w:t>
+              <w:t>Frontend Web</w:t>
             </w:r>
           </w:p>
         </w:tc>
-      </w:tr>
-      <w:tr>
-        <w:trPr>
-          <w:trHeight w:val="300"/>
-        </w:trPr>
         <w:tc>
           <w:tcPr>
-            <w:tcW w:w="2198" w:type="dxa"/>
+            <w:tcW w:w="3045" w:type="dxa"/>
+            <w:gridSpan w:val="4"/>
             <w:shd w:val="clear" w:color="auto" w:fill="F2F2F2" w:themeFill="background1" w:themeFillShade="F2"/>
             <w:tcMar>
               <w:top w:w="15" w:type="dxa"/>
@@ -5139,20 +5870,23 @@
             <w:pPr>
               <w:spacing w:after="0"/>
               <w:jc w:val="center"/>
+              <w:rPr>
+                <w:rFonts w:hint="eastAsia"/>
+              </w:rPr>
             </w:pPr>
             <w:r>
               <w:rPr>
                 <w:rFonts w:ascii="Arial" w:eastAsia="Arial" w:hAnsi="Arial" w:cs="Arial"/>
                 <w:color w:val="000000" w:themeColor="text1"/>
               </w:rPr>
-              <w:t>Energia</w:t>
+              <w:t>Dashboard/Site Institucional</w:t>
             </w:r>
           </w:p>
         </w:tc>
         <w:tc>
           <w:tcPr>
-            <w:tcW w:w="3060" w:type="dxa"/>
-            <w:gridSpan w:val="3"/>
+            <w:tcW w:w="3806" w:type="dxa"/>
+            <w:gridSpan w:val="2"/>
             <w:shd w:val="clear" w:color="auto" w:fill="F2F2F2" w:themeFill="background1" w:themeFillShade="F2"/>
             <w:tcMar>
               <w:top w:w="15" w:type="dxa"/>
@@ -5165,20 +5899,27 @@
             <w:pPr>
               <w:spacing w:after="0"/>
               <w:jc w:val="center"/>
+              <w:rPr>
+                <w:rFonts w:hint="eastAsia"/>
+              </w:rPr>
             </w:pPr>
             <w:r>
               <w:rPr>
                 <w:rFonts w:ascii="Arial" w:eastAsia="Arial" w:hAnsi="Arial" w:cs="Arial"/>
                 <w:color w:val="000000" w:themeColor="text1"/>
               </w:rPr>
-              <w:t>Consumo mensal</w:t>
+              <w:t>Incluso RH (recursos humanos)</w:t>
             </w:r>
           </w:p>
         </w:tc>
+      </w:tr>
+      <w:tr>
+        <w:trPr>
+          <w:trHeight w:val="300"/>
+        </w:trPr>
         <w:tc>
           <w:tcPr>
-            <w:tcW w:w="3832" w:type="dxa"/>
-            <w:gridSpan w:val="3"/>
+            <w:tcW w:w="2220" w:type="dxa"/>
             <w:shd w:val="clear" w:color="auto" w:fill="F2F2F2" w:themeFill="background1" w:themeFillShade="F2"/>
             <w:tcMar>
               <w:top w:w="15" w:type="dxa"/>
@@ -5191,24 +5932,23 @@
             <w:pPr>
               <w:spacing w:after="0"/>
               <w:jc w:val="center"/>
+              <w:rPr>
+                <w:rFonts w:hint="eastAsia"/>
+              </w:rPr>
             </w:pPr>
             <w:r>
               <w:rPr>
                 <w:rFonts w:ascii="Arial" w:eastAsia="Arial" w:hAnsi="Arial" w:cs="Arial"/>
                 <w:color w:val="000000" w:themeColor="text1"/>
               </w:rPr>
-              <w:t>XXXXXX</w:t>
+              <w:t>MySQL Local</w:t>
             </w:r>
           </w:p>
         </w:tc>
-      </w:tr>
-      <w:tr>
-        <w:trPr>
-          <w:trHeight w:val="300"/>
-        </w:trPr>
         <w:tc>
           <w:tcPr>
-            <w:tcW w:w="2198" w:type="dxa"/>
+            <w:tcW w:w="3045" w:type="dxa"/>
+            <w:gridSpan w:val="4"/>
             <w:shd w:val="clear" w:color="auto" w:fill="F2F2F2" w:themeFill="background1" w:themeFillShade="F2"/>
             <w:tcMar>
               <w:top w:w="15" w:type="dxa"/>
@@ -5221,20 +5961,24 @@
             <w:pPr>
               <w:spacing w:after="0"/>
               <w:jc w:val="center"/>
+              <w:rPr>
+                <w:rFonts w:ascii="Arial" w:eastAsia="Arial" w:hAnsi="Arial" w:cs="Arial"/>
+                <w:color w:val="000000" w:themeColor="text1"/>
+              </w:rPr>
             </w:pPr>
             <w:r>
               <w:rPr>
                 <w:rFonts w:ascii="Arial" w:eastAsia="Arial" w:hAnsi="Arial" w:cs="Arial"/>
                 <w:color w:val="000000" w:themeColor="text1"/>
               </w:rPr>
-              <w:t>Internet</w:t>
+              <w:t>Banco ambiente dev</w:t>
             </w:r>
           </w:p>
         </w:tc>
         <w:tc>
           <w:tcPr>
-            <w:tcW w:w="3060" w:type="dxa"/>
-            <w:gridSpan w:val="3"/>
+            <w:tcW w:w="3806" w:type="dxa"/>
+            <w:gridSpan w:val="2"/>
             <w:shd w:val="clear" w:color="auto" w:fill="F2F2F2" w:themeFill="background1" w:themeFillShade="F2"/>
             <w:tcMar>
               <w:top w:w="15" w:type="dxa"/>
@@ -5247,20 +5991,27 @@
             <w:pPr>
               <w:spacing w:after="0"/>
               <w:jc w:val="center"/>
+              <w:rPr>
+                <w:rFonts w:hint="eastAsia"/>
+              </w:rPr>
             </w:pPr>
             <w:r>
               <w:rPr>
                 <w:rFonts w:ascii="Arial" w:eastAsia="Arial" w:hAnsi="Arial" w:cs="Arial"/>
                 <w:color w:val="000000" w:themeColor="text1"/>
               </w:rPr>
-              <w:t>Conectividade</w:t>
+              <w:t>Gratuito</w:t>
             </w:r>
           </w:p>
         </w:tc>
+      </w:tr>
+      <w:tr>
+        <w:trPr>
+          <w:trHeight w:val="300"/>
+        </w:trPr>
         <w:tc>
           <w:tcPr>
-            <w:tcW w:w="3832" w:type="dxa"/>
-            <w:gridSpan w:val="3"/>
+            <w:tcW w:w="2220" w:type="dxa"/>
             <w:shd w:val="clear" w:color="auto" w:fill="F2F2F2" w:themeFill="background1" w:themeFillShade="F2"/>
             <w:tcMar>
               <w:top w:w="15" w:type="dxa"/>
@@ -5273,24 +6024,23 @@
             <w:pPr>
               <w:spacing w:after="0"/>
               <w:jc w:val="center"/>
+              <w:rPr>
+                <w:rFonts w:hint="eastAsia"/>
+              </w:rPr>
             </w:pPr>
             <w:r>
               <w:rPr>
                 <w:rFonts w:ascii="Arial" w:eastAsia="Arial" w:hAnsi="Arial" w:cs="Arial"/>
                 <w:color w:val="000000" w:themeColor="text1"/>
               </w:rPr>
-              <w:t>XXXXXX</w:t>
+              <w:t>IDE</w:t>
             </w:r>
           </w:p>
         </w:tc>
-      </w:tr>
-      <w:tr>
-        <w:trPr>
-          <w:trHeight w:val="300"/>
-        </w:trPr>
         <w:tc>
           <w:tcPr>
-            <w:tcW w:w="2198" w:type="dxa"/>
+            <w:tcW w:w="3045" w:type="dxa"/>
+            <w:gridSpan w:val="4"/>
             <w:shd w:val="clear" w:color="auto" w:fill="F2F2F2" w:themeFill="background1" w:themeFillShade="F2"/>
             <w:tcMar>
               <w:top w:w="15" w:type="dxa"/>
@@ -5303,20 +6053,24 @@
             <w:pPr>
               <w:spacing w:after="0"/>
               <w:jc w:val="center"/>
+              <w:rPr>
+                <w:rFonts w:ascii="Arial" w:eastAsia="Arial" w:hAnsi="Arial" w:cs="Arial"/>
+                <w:color w:val="000000" w:themeColor="text1"/>
+              </w:rPr>
             </w:pPr>
             <w:r>
               <w:rPr>
                 <w:rFonts w:ascii="Arial" w:eastAsia="Arial" w:hAnsi="Arial" w:cs="Arial"/>
                 <w:color w:val="000000" w:themeColor="text1"/>
               </w:rPr>
-              <w:t>Ambiente Teste AWS</w:t>
+              <w:t>VSCode / IntelliJ</w:t>
             </w:r>
           </w:p>
         </w:tc>
         <w:tc>
           <w:tcPr>
-            <w:tcW w:w="3060" w:type="dxa"/>
-            <w:gridSpan w:val="3"/>
+            <w:tcW w:w="3806" w:type="dxa"/>
+            <w:gridSpan w:val="2"/>
             <w:shd w:val="clear" w:color="auto" w:fill="F2F2F2" w:themeFill="background1" w:themeFillShade="F2"/>
             <w:tcMar>
               <w:top w:w="15" w:type="dxa"/>
@@ -5329,20 +6083,27 @@
             <w:pPr>
               <w:spacing w:after="0"/>
               <w:jc w:val="center"/>
+              <w:rPr>
+                <w:rFonts w:hint="eastAsia"/>
+              </w:rPr>
             </w:pPr>
             <w:r>
               <w:rPr>
                 <w:rFonts w:ascii="Arial" w:eastAsia="Arial" w:hAnsi="Arial" w:cs="Arial"/>
                 <w:color w:val="000000" w:themeColor="text1"/>
               </w:rPr>
-              <w:t>XXXXXX</w:t>
+              <w:t>Gratuito</w:t>
             </w:r>
           </w:p>
         </w:tc>
+      </w:tr>
+      <w:tr>
+        <w:trPr>
+          <w:trHeight w:val="300"/>
+        </w:trPr>
         <w:tc>
           <w:tcPr>
-            <w:tcW w:w="3832" w:type="dxa"/>
-            <w:gridSpan w:val="3"/>
+            <w:tcW w:w="2220" w:type="dxa"/>
             <w:shd w:val="clear" w:color="auto" w:fill="F2F2F2" w:themeFill="background1" w:themeFillShade="F2"/>
             <w:tcMar>
               <w:top w:w="15" w:type="dxa"/>
@@ -5355,24 +6116,24 @@
             <w:pPr>
               <w:spacing w:after="0"/>
               <w:jc w:val="center"/>
+              <w:rPr>
+                <w:rFonts w:ascii="Arial" w:eastAsia="Arial" w:hAnsi="Arial" w:cs="Arial"/>
+                <w:color w:val="000000" w:themeColor="text1"/>
+              </w:rPr>
             </w:pPr>
             <w:r>
               <w:rPr>
                 <w:rFonts w:ascii="Arial" w:eastAsia="Arial" w:hAnsi="Arial" w:cs="Arial"/>
                 <w:color w:val="000000" w:themeColor="text1"/>
               </w:rPr>
-              <w:t>XXXXXX</w:t>
+              <w:t>Git</w:t>
             </w:r>
           </w:p>
         </w:tc>
-      </w:tr>
-      <w:tr>
-        <w:trPr>
-          <w:trHeight w:val="615"/>
-        </w:trPr>
         <w:tc>
           <w:tcPr>
-            <w:tcW w:w="2198" w:type="dxa"/>
+            <w:tcW w:w="3045" w:type="dxa"/>
+            <w:gridSpan w:val="4"/>
             <w:shd w:val="clear" w:color="auto" w:fill="F2F2F2" w:themeFill="background1" w:themeFillShade="F2"/>
             <w:tcMar>
               <w:top w:w="15" w:type="dxa"/>
@@ -5385,20 +6146,23 @@
             <w:pPr>
               <w:spacing w:after="0"/>
               <w:jc w:val="center"/>
+              <w:rPr>
+                <w:rFonts w:hint="eastAsia"/>
+              </w:rPr>
             </w:pPr>
             <w:r>
               <w:rPr>
                 <w:rFonts w:ascii="Arial" w:eastAsia="Arial" w:hAnsi="Arial" w:cs="Arial"/>
                 <w:color w:val="000000" w:themeColor="text1"/>
               </w:rPr>
-              <w:t>Documentação</w:t>
+              <w:t>Versionamento</w:t>
             </w:r>
           </w:p>
         </w:tc>
         <w:tc>
           <w:tcPr>
-            <w:tcW w:w="3060" w:type="dxa"/>
-            <w:gridSpan w:val="3"/>
+            <w:tcW w:w="3806" w:type="dxa"/>
+            <w:gridSpan w:val="2"/>
             <w:shd w:val="clear" w:color="auto" w:fill="F2F2F2" w:themeFill="background1" w:themeFillShade="F2"/>
             <w:tcMar>
               <w:top w:w="15" w:type="dxa"/>
@@ -5411,20 +6175,27 @@
             <w:pPr>
               <w:spacing w:after="0"/>
               <w:jc w:val="center"/>
+              <w:rPr>
+                <w:rFonts w:hint="eastAsia"/>
+              </w:rPr>
             </w:pPr>
             <w:r>
               <w:rPr>
                 <w:rFonts w:ascii="Arial" w:eastAsia="Arial" w:hAnsi="Arial" w:cs="Arial"/>
                 <w:color w:val="000000" w:themeColor="text1"/>
               </w:rPr>
-              <w:t>Governança</w:t>
+              <w:t>Gratuito</w:t>
             </w:r>
           </w:p>
         </w:tc>
+      </w:tr>
+      <w:tr>
+        <w:trPr>
+          <w:trHeight w:val="300"/>
+        </w:trPr>
         <w:tc>
           <w:tcPr>
-            <w:tcW w:w="3832" w:type="dxa"/>
-            <w:gridSpan w:val="3"/>
+            <w:tcW w:w="2220" w:type="dxa"/>
             <w:shd w:val="clear" w:color="auto" w:fill="F2F2F2" w:themeFill="background1" w:themeFillShade="F2"/>
             <w:tcMar>
               <w:top w:w="15" w:type="dxa"/>
@@ -5437,24 +6208,23 @@
             <w:pPr>
               <w:spacing w:after="0"/>
               <w:jc w:val="center"/>
+              <w:rPr>
+                <w:rFonts w:hint="eastAsia"/>
+              </w:rPr>
             </w:pPr>
             <w:r>
               <w:rPr>
                 <w:rFonts w:ascii="Arial" w:eastAsia="Arial" w:hAnsi="Arial" w:cs="Arial"/>
                 <w:color w:val="000000" w:themeColor="text1"/>
               </w:rPr>
-              <w:t>Gratuito/Incluso RH (recursos humanos)</w:t>
+              <w:t>GitHub</w:t>
             </w:r>
           </w:p>
         </w:tc>
-      </w:tr>
-      <w:tr>
-        <w:trPr>
-          <w:trHeight w:val="300"/>
-        </w:trPr>
         <w:tc>
           <w:tcPr>
-            <w:tcW w:w="2198" w:type="dxa"/>
+            <w:tcW w:w="3045" w:type="dxa"/>
+            <w:gridSpan w:val="4"/>
             <w:shd w:val="clear" w:color="auto" w:fill="F2F2F2" w:themeFill="background1" w:themeFillShade="F2"/>
             <w:tcMar>
               <w:top w:w="15" w:type="dxa"/>
@@ -5467,20 +6237,23 @@
             <w:pPr>
               <w:spacing w:after="0"/>
               <w:jc w:val="center"/>
+              <w:rPr>
+                <w:rFonts w:hint="eastAsia"/>
+              </w:rPr>
             </w:pPr>
             <w:r>
               <w:rPr>
                 <w:rFonts w:ascii="Arial" w:eastAsia="Arial" w:hAnsi="Arial" w:cs="Arial"/>
                 <w:color w:val="000000" w:themeColor="text1"/>
               </w:rPr>
-              <w:t>Aplicação Client Python</w:t>
+              <w:t>Repositório remoto</w:t>
             </w:r>
           </w:p>
         </w:tc>
         <w:tc>
           <w:tcPr>
-            <w:tcW w:w="3060" w:type="dxa"/>
-            <w:gridSpan w:val="3"/>
+            <w:tcW w:w="3806" w:type="dxa"/>
+            <w:gridSpan w:val="2"/>
             <w:shd w:val="clear" w:color="auto" w:fill="F2F2F2" w:themeFill="background1" w:themeFillShade="F2"/>
             <w:tcMar>
               <w:top w:w="15" w:type="dxa"/>
@@ -5493,540 +6266,9 @@
             <w:pPr>
               <w:spacing w:after="0"/>
               <w:jc w:val="center"/>
-            </w:pPr>
-            <w:r>
-              <w:rPr>
-                <w:rFonts w:ascii="Arial" w:eastAsia="Arial" w:hAnsi="Arial" w:cs="Arial"/>
-                <w:color w:val="000000" w:themeColor="text1"/>
-              </w:rPr>
-              <w:t>Agente de monitoramento</w:t>
-            </w:r>
-          </w:p>
-        </w:tc>
-        <w:tc>
-          <w:tcPr>
-            <w:tcW w:w="3832" w:type="dxa"/>
-            <w:gridSpan w:val="3"/>
-            <w:shd w:val="clear" w:color="auto" w:fill="F2F2F2" w:themeFill="background1" w:themeFillShade="F2"/>
-            <w:tcMar>
-              <w:top w:w="15" w:type="dxa"/>
-              <w:left w:w="15" w:type="dxa"/>
-              <w:right w:w="15" w:type="dxa"/>
-            </w:tcMar>
-            <w:vAlign w:val="center"/>
-          </w:tcPr>
-          <w:p>
-            <w:pPr>
-              <w:spacing w:after="0"/>
-              <w:jc w:val="center"/>
-            </w:pPr>
-            <w:r>
-              <w:rPr>
-                <w:rFonts w:ascii="Arial" w:eastAsia="Arial" w:hAnsi="Arial" w:cs="Arial"/>
-                <w:color w:val="000000" w:themeColor="text1"/>
-              </w:rPr>
-              <w:t>Sem custo licença</w:t>
-            </w:r>
-          </w:p>
-        </w:tc>
-      </w:tr>
-      <w:tr>
-        <w:trPr>
-          <w:trHeight w:val="615"/>
-        </w:trPr>
-        <w:tc>
-          <w:tcPr>
-            <w:tcW w:w="2198" w:type="dxa"/>
-            <w:shd w:val="clear" w:color="auto" w:fill="F2F2F2" w:themeFill="background1" w:themeFillShade="F2"/>
-            <w:tcMar>
-              <w:top w:w="15" w:type="dxa"/>
-              <w:left w:w="15" w:type="dxa"/>
-              <w:right w:w="15" w:type="dxa"/>
-            </w:tcMar>
-            <w:vAlign w:val="center"/>
-          </w:tcPr>
-          <w:p>
-            <w:pPr>
-              <w:spacing w:after="0"/>
-              <w:jc w:val="center"/>
-              <w:rPr>
-                <w:rFonts w:ascii="Arial" w:eastAsia="Arial" w:hAnsi="Arial" w:cs="Arial"/>
-                <w:color w:val="000000" w:themeColor="text1"/>
-              </w:rPr>
-            </w:pPr>
-            <w:r>
-              <w:rPr>
-                <w:rFonts w:ascii="Arial" w:eastAsia="Arial" w:hAnsi="Arial" w:cs="Arial"/>
-                <w:color w:val="000000" w:themeColor="text1"/>
-              </w:rPr>
-              <w:t>API Backend</w:t>
-            </w:r>
-          </w:p>
-        </w:tc>
-        <w:tc>
-          <w:tcPr>
-            <w:tcW w:w="3060" w:type="dxa"/>
-            <w:gridSpan w:val="3"/>
-            <w:shd w:val="clear" w:color="auto" w:fill="F2F2F2" w:themeFill="background1" w:themeFillShade="F2"/>
-            <w:tcMar>
-              <w:top w:w="15" w:type="dxa"/>
-              <w:left w:w="15" w:type="dxa"/>
-              <w:right w:w="15" w:type="dxa"/>
-            </w:tcMar>
-            <w:vAlign w:val="center"/>
-          </w:tcPr>
-          <w:p>
-            <w:pPr>
-              <w:spacing w:after="0"/>
-              <w:jc w:val="center"/>
-            </w:pPr>
-            <w:r>
-              <w:rPr>
-                <w:rFonts w:ascii="Arial" w:eastAsia="Arial" w:hAnsi="Arial" w:cs="Arial"/>
-                <w:color w:val="000000" w:themeColor="text1"/>
-              </w:rPr>
-              <w:t>Processamento e integração</w:t>
-            </w:r>
-          </w:p>
-        </w:tc>
-        <w:tc>
-          <w:tcPr>
-            <w:tcW w:w="3832" w:type="dxa"/>
-            <w:gridSpan w:val="3"/>
-            <w:shd w:val="clear" w:color="auto" w:fill="F2F2F2" w:themeFill="background1" w:themeFillShade="F2"/>
-            <w:tcMar>
-              <w:top w:w="15" w:type="dxa"/>
-              <w:left w:w="15" w:type="dxa"/>
-              <w:right w:w="15" w:type="dxa"/>
-            </w:tcMar>
-            <w:vAlign w:val="center"/>
-          </w:tcPr>
-          <w:p>
-            <w:pPr>
-              <w:spacing w:after="0"/>
-              <w:jc w:val="center"/>
-            </w:pPr>
-            <w:r>
-              <w:rPr>
-                <w:rFonts w:ascii="Arial" w:eastAsia="Arial" w:hAnsi="Arial" w:cs="Arial"/>
-                <w:color w:val="000000" w:themeColor="text1"/>
-              </w:rPr>
-              <w:t>Incluso RH (recursos humanos)</w:t>
-            </w:r>
-          </w:p>
-        </w:tc>
-      </w:tr>
-      <w:tr>
-        <w:trPr>
-          <w:trHeight w:val="615"/>
-        </w:trPr>
-        <w:tc>
-          <w:tcPr>
-            <w:tcW w:w="2198" w:type="dxa"/>
-            <w:shd w:val="clear" w:color="auto" w:fill="F2F2F2" w:themeFill="background1" w:themeFillShade="F2"/>
-            <w:tcMar>
-              <w:top w:w="15" w:type="dxa"/>
-              <w:left w:w="15" w:type="dxa"/>
-              <w:right w:w="15" w:type="dxa"/>
-            </w:tcMar>
-            <w:vAlign w:val="center"/>
-          </w:tcPr>
-          <w:p>
-            <w:pPr>
-              <w:spacing w:after="0"/>
-              <w:jc w:val="center"/>
-            </w:pPr>
-            <w:r>
-              <w:rPr>
-                <w:rFonts w:ascii="Arial" w:eastAsia="Arial" w:hAnsi="Arial" w:cs="Arial"/>
-                <w:color w:val="000000" w:themeColor="text1"/>
-              </w:rPr>
-              <w:t>Frontend Web</w:t>
-            </w:r>
-          </w:p>
-        </w:tc>
-        <w:tc>
-          <w:tcPr>
-            <w:tcW w:w="3060" w:type="dxa"/>
-            <w:gridSpan w:val="3"/>
-            <w:shd w:val="clear" w:color="auto" w:fill="F2F2F2" w:themeFill="background1" w:themeFillShade="F2"/>
-            <w:tcMar>
-              <w:top w:w="15" w:type="dxa"/>
-              <w:left w:w="15" w:type="dxa"/>
-              <w:right w:w="15" w:type="dxa"/>
-            </w:tcMar>
-            <w:vAlign w:val="center"/>
-          </w:tcPr>
-          <w:p>
-            <w:pPr>
-              <w:spacing w:after="0"/>
-              <w:jc w:val="center"/>
-            </w:pPr>
-            <w:r>
-              <w:rPr>
-                <w:rFonts w:ascii="Arial" w:eastAsia="Arial" w:hAnsi="Arial" w:cs="Arial"/>
-                <w:color w:val="000000" w:themeColor="text1"/>
-              </w:rPr>
-              <w:t>Dashboard/Site Institucional</w:t>
-            </w:r>
-          </w:p>
-        </w:tc>
-        <w:tc>
-          <w:tcPr>
-            <w:tcW w:w="3832" w:type="dxa"/>
-            <w:gridSpan w:val="3"/>
-            <w:shd w:val="clear" w:color="auto" w:fill="F2F2F2" w:themeFill="background1" w:themeFillShade="F2"/>
-            <w:tcMar>
-              <w:top w:w="15" w:type="dxa"/>
-              <w:left w:w="15" w:type="dxa"/>
-              <w:right w:w="15" w:type="dxa"/>
-            </w:tcMar>
-            <w:vAlign w:val="center"/>
-          </w:tcPr>
-          <w:p>
-            <w:pPr>
-              <w:spacing w:after="0"/>
-              <w:jc w:val="center"/>
-            </w:pPr>
-            <w:r>
-              <w:rPr>
-                <w:rFonts w:ascii="Arial" w:eastAsia="Arial" w:hAnsi="Arial" w:cs="Arial"/>
-                <w:color w:val="000000" w:themeColor="text1"/>
-              </w:rPr>
-              <w:t>Incluso RH (recursos humanos)</w:t>
-            </w:r>
-          </w:p>
-        </w:tc>
-      </w:tr>
-      <w:tr>
-        <w:trPr>
-          <w:trHeight w:val="300"/>
-        </w:trPr>
-        <w:tc>
-          <w:tcPr>
-            <w:tcW w:w="2198" w:type="dxa"/>
-            <w:shd w:val="clear" w:color="auto" w:fill="F2F2F2" w:themeFill="background1" w:themeFillShade="F2"/>
-            <w:tcMar>
-              <w:top w:w="15" w:type="dxa"/>
-              <w:left w:w="15" w:type="dxa"/>
-              <w:right w:w="15" w:type="dxa"/>
-            </w:tcMar>
-            <w:vAlign w:val="center"/>
-          </w:tcPr>
-          <w:p>
-            <w:pPr>
-              <w:spacing w:after="0"/>
-              <w:jc w:val="center"/>
-            </w:pPr>
-            <w:r>
-              <w:rPr>
-                <w:rFonts w:ascii="Arial" w:eastAsia="Arial" w:hAnsi="Arial" w:cs="Arial"/>
-                <w:color w:val="000000" w:themeColor="text1"/>
-              </w:rPr>
-              <w:t>MySQL Local</w:t>
-            </w:r>
-          </w:p>
-        </w:tc>
-        <w:tc>
-          <w:tcPr>
-            <w:tcW w:w="3060" w:type="dxa"/>
-            <w:gridSpan w:val="3"/>
-            <w:shd w:val="clear" w:color="auto" w:fill="F2F2F2" w:themeFill="background1" w:themeFillShade="F2"/>
-            <w:tcMar>
-              <w:top w:w="15" w:type="dxa"/>
-              <w:left w:w="15" w:type="dxa"/>
-              <w:right w:w="15" w:type="dxa"/>
-            </w:tcMar>
-            <w:vAlign w:val="center"/>
-          </w:tcPr>
-          <w:p>
-            <w:pPr>
-              <w:spacing w:after="0"/>
-              <w:jc w:val="center"/>
-              <w:rPr>
-                <w:rFonts w:ascii="Arial" w:eastAsia="Arial" w:hAnsi="Arial" w:cs="Arial"/>
-                <w:color w:val="000000" w:themeColor="text1"/>
-              </w:rPr>
-            </w:pPr>
-            <w:r>
-              <w:rPr>
-                <w:rFonts w:ascii="Arial" w:eastAsia="Arial" w:hAnsi="Arial" w:cs="Arial"/>
-                <w:color w:val="000000" w:themeColor="text1"/>
-              </w:rPr>
-              <w:t>Banco ambiente dev</w:t>
-            </w:r>
-          </w:p>
-        </w:tc>
-        <w:tc>
-          <w:tcPr>
-            <w:tcW w:w="3832" w:type="dxa"/>
-            <w:gridSpan w:val="3"/>
-            <w:shd w:val="clear" w:color="auto" w:fill="F2F2F2" w:themeFill="background1" w:themeFillShade="F2"/>
-            <w:tcMar>
-              <w:top w:w="15" w:type="dxa"/>
-              <w:left w:w="15" w:type="dxa"/>
-              <w:right w:w="15" w:type="dxa"/>
-            </w:tcMar>
-            <w:vAlign w:val="center"/>
-          </w:tcPr>
-          <w:p>
-            <w:pPr>
-              <w:spacing w:after="0"/>
-              <w:jc w:val="center"/>
-            </w:pPr>
-            <w:r>
-              <w:rPr>
-                <w:rFonts w:ascii="Arial" w:eastAsia="Arial" w:hAnsi="Arial" w:cs="Arial"/>
-                <w:color w:val="000000" w:themeColor="text1"/>
-              </w:rPr>
-              <w:t>Gratuito</w:t>
-            </w:r>
-          </w:p>
-        </w:tc>
-      </w:tr>
-      <w:tr>
-        <w:trPr>
-          <w:trHeight w:val="300"/>
-        </w:trPr>
-        <w:tc>
-          <w:tcPr>
-            <w:tcW w:w="2198" w:type="dxa"/>
-            <w:shd w:val="clear" w:color="auto" w:fill="F2F2F2" w:themeFill="background1" w:themeFillShade="F2"/>
-            <w:tcMar>
-              <w:top w:w="15" w:type="dxa"/>
-              <w:left w:w="15" w:type="dxa"/>
-              <w:right w:w="15" w:type="dxa"/>
-            </w:tcMar>
-            <w:vAlign w:val="center"/>
-          </w:tcPr>
-          <w:p>
-            <w:pPr>
-              <w:spacing w:after="0"/>
-              <w:jc w:val="center"/>
-            </w:pPr>
-            <w:r>
-              <w:rPr>
-                <w:rFonts w:ascii="Arial" w:eastAsia="Arial" w:hAnsi="Arial" w:cs="Arial"/>
-                <w:color w:val="000000" w:themeColor="text1"/>
-              </w:rPr>
-              <w:t>IDE</w:t>
-            </w:r>
-          </w:p>
-        </w:tc>
-        <w:tc>
-          <w:tcPr>
-            <w:tcW w:w="3060" w:type="dxa"/>
-            <w:gridSpan w:val="3"/>
-            <w:shd w:val="clear" w:color="auto" w:fill="F2F2F2" w:themeFill="background1" w:themeFillShade="F2"/>
-            <w:tcMar>
-              <w:top w:w="15" w:type="dxa"/>
-              <w:left w:w="15" w:type="dxa"/>
-              <w:right w:w="15" w:type="dxa"/>
-            </w:tcMar>
-            <w:vAlign w:val="center"/>
-          </w:tcPr>
-          <w:p>
-            <w:pPr>
-              <w:spacing w:after="0"/>
-              <w:jc w:val="center"/>
-              <w:rPr>
-                <w:rFonts w:ascii="Arial" w:eastAsia="Arial" w:hAnsi="Arial" w:cs="Arial"/>
-                <w:color w:val="000000" w:themeColor="text1"/>
-              </w:rPr>
-            </w:pPr>
-            <w:r>
-              <w:rPr>
-                <w:rFonts w:ascii="Arial" w:eastAsia="Arial" w:hAnsi="Arial" w:cs="Arial"/>
-                <w:color w:val="000000" w:themeColor="text1"/>
-              </w:rPr>
-              <w:t>VSCode / IntelliJ</w:t>
-            </w:r>
-          </w:p>
-        </w:tc>
-        <w:tc>
-          <w:tcPr>
-            <w:tcW w:w="3832" w:type="dxa"/>
-            <w:gridSpan w:val="3"/>
-            <w:shd w:val="clear" w:color="auto" w:fill="F2F2F2" w:themeFill="background1" w:themeFillShade="F2"/>
-            <w:tcMar>
-              <w:top w:w="15" w:type="dxa"/>
-              <w:left w:w="15" w:type="dxa"/>
-              <w:right w:w="15" w:type="dxa"/>
-            </w:tcMar>
-            <w:vAlign w:val="center"/>
-          </w:tcPr>
-          <w:p>
-            <w:pPr>
-              <w:spacing w:after="0"/>
-              <w:jc w:val="center"/>
-            </w:pPr>
-            <w:r>
-              <w:rPr>
-                <w:rFonts w:ascii="Arial" w:eastAsia="Arial" w:hAnsi="Arial" w:cs="Arial"/>
-                <w:color w:val="000000" w:themeColor="text1"/>
-              </w:rPr>
-              <w:t>Gratuito</w:t>
-            </w:r>
-          </w:p>
-        </w:tc>
-      </w:tr>
-      <w:tr>
-        <w:trPr>
-          <w:trHeight w:val="300"/>
-        </w:trPr>
-        <w:tc>
-          <w:tcPr>
-            <w:tcW w:w="2198" w:type="dxa"/>
-            <w:shd w:val="clear" w:color="auto" w:fill="F2F2F2" w:themeFill="background1" w:themeFillShade="F2"/>
-            <w:tcMar>
-              <w:top w:w="15" w:type="dxa"/>
-              <w:left w:w="15" w:type="dxa"/>
-              <w:right w:w="15" w:type="dxa"/>
-            </w:tcMar>
-            <w:vAlign w:val="center"/>
-          </w:tcPr>
-          <w:p>
-            <w:pPr>
-              <w:spacing w:after="0"/>
-              <w:jc w:val="center"/>
-              <w:rPr>
-                <w:rFonts w:ascii="Arial" w:eastAsia="Arial" w:hAnsi="Arial" w:cs="Arial"/>
-                <w:color w:val="000000" w:themeColor="text1"/>
-              </w:rPr>
-            </w:pPr>
-            <w:r>
-              <w:rPr>
-                <w:rFonts w:ascii="Arial" w:eastAsia="Arial" w:hAnsi="Arial" w:cs="Arial"/>
-                <w:color w:val="000000" w:themeColor="text1"/>
-              </w:rPr>
-              <w:t>Git</w:t>
-            </w:r>
-          </w:p>
-        </w:tc>
-        <w:tc>
-          <w:tcPr>
-            <w:tcW w:w="3060" w:type="dxa"/>
-            <w:gridSpan w:val="3"/>
-            <w:shd w:val="clear" w:color="auto" w:fill="F2F2F2" w:themeFill="background1" w:themeFillShade="F2"/>
-            <w:tcMar>
-              <w:top w:w="15" w:type="dxa"/>
-              <w:left w:w="15" w:type="dxa"/>
-              <w:right w:w="15" w:type="dxa"/>
-            </w:tcMar>
-            <w:vAlign w:val="center"/>
-          </w:tcPr>
-          <w:p>
-            <w:pPr>
-              <w:spacing w:after="0"/>
-              <w:jc w:val="center"/>
-            </w:pPr>
-            <w:r>
-              <w:rPr>
-                <w:rFonts w:ascii="Arial" w:eastAsia="Arial" w:hAnsi="Arial" w:cs="Arial"/>
-                <w:color w:val="000000" w:themeColor="text1"/>
-              </w:rPr>
-              <w:t>Versionamento</w:t>
-            </w:r>
-          </w:p>
-        </w:tc>
-        <w:tc>
-          <w:tcPr>
-            <w:tcW w:w="3832" w:type="dxa"/>
-            <w:gridSpan w:val="3"/>
-            <w:shd w:val="clear" w:color="auto" w:fill="F2F2F2" w:themeFill="background1" w:themeFillShade="F2"/>
-            <w:tcMar>
-              <w:top w:w="15" w:type="dxa"/>
-              <w:left w:w="15" w:type="dxa"/>
-              <w:right w:w="15" w:type="dxa"/>
-            </w:tcMar>
-            <w:vAlign w:val="center"/>
-          </w:tcPr>
-          <w:p>
-            <w:pPr>
-              <w:spacing w:after="0"/>
-              <w:jc w:val="center"/>
-            </w:pPr>
-            <w:r>
-              <w:rPr>
-                <w:rFonts w:ascii="Arial" w:eastAsia="Arial" w:hAnsi="Arial" w:cs="Arial"/>
-                <w:color w:val="000000" w:themeColor="text1"/>
-              </w:rPr>
-              <w:t>Gratuito</w:t>
-            </w:r>
-          </w:p>
-        </w:tc>
-      </w:tr>
-      <w:tr>
-        <w:trPr>
-          <w:trHeight w:val="300"/>
-        </w:trPr>
-        <w:tc>
-          <w:tcPr>
-            <w:tcW w:w="2198" w:type="dxa"/>
-            <w:shd w:val="clear" w:color="auto" w:fill="F2F2F2" w:themeFill="background1" w:themeFillShade="F2"/>
-            <w:tcMar>
-              <w:top w:w="15" w:type="dxa"/>
-              <w:left w:w="15" w:type="dxa"/>
-              <w:right w:w="15" w:type="dxa"/>
-            </w:tcMar>
-            <w:vAlign w:val="center"/>
-          </w:tcPr>
-          <w:p>
-            <w:pPr>
-              <w:spacing w:after="0"/>
-              <w:jc w:val="center"/>
-            </w:pPr>
-            <w:r>
-              <w:rPr>
-                <w:rFonts w:ascii="Arial" w:eastAsia="Arial" w:hAnsi="Arial" w:cs="Arial"/>
-                <w:color w:val="000000" w:themeColor="text1"/>
-              </w:rPr>
-              <w:t>GitHub</w:t>
-            </w:r>
-          </w:p>
-        </w:tc>
-        <w:tc>
-          <w:tcPr>
-            <w:tcW w:w="3060" w:type="dxa"/>
-            <w:gridSpan w:val="3"/>
-            <w:shd w:val="clear" w:color="auto" w:fill="F2F2F2" w:themeFill="background1" w:themeFillShade="F2"/>
-            <w:tcMar>
-              <w:top w:w="15" w:type="dxa"/>
-              <w:left w:w="15" w:type="dxa"/>
-              <w:right w:w="15" w:type="dxa"/>
-            </w:tcMar>
-            <w:vAlign w:val="center"/>
-          </w:tcPr>
-          <w:p>
-            <w:pPr>
-              <w:spacing w:after="0"/>
-              <w:jc w:val="center"/>
-            </w:pPr>
-            <w:r>
-              <w:rPr>
-                <w:rFonts w:ascii="Arial" w:eastAsia="Arial" w:hAnsi="Arial" w:cs="Arial"/>
-                <w:color w:val="000000" w:themeColor="text1"/>
-              </w:rPr>
-              <w:t>Repositório remoto</w:t>
-            </w:r>
-          </w:p>
-        </w:tc>
-        <w:tc>
-          <w:tcPr>
-            <w:tcW w:w="3832" w:type="dxa"/>
-            <w:gridSpan w:val="3"/>
-            <w:shd w:val="clear" w:color="auto" w:fill="F2F2F2" w:themeFill="background1" w:themeFillShade="F2"/>
-            <w:tcMar>
-              <w:top w:w="15" w:type="dxa"/>
-              <w:left w:w="15" w:type="dxa"/>
-              <w:right w:w="15" w:type="dxa"/>
-            </w:tcMar>
-            <w:vAlign w:val="center"/>
-          </w:tcPr>
-          <w:p>
-            <w:pPr>
-              <w:spacing w:after="0"/>
-              <w:jc w:val="center"/>
+              <w:rPr>
+                <w:rFonts w:hint="eastAsia"/>
+              </w:rPr>
             </w:pPr>
             <w:r>
               <w:rPr>
@@ -6043,6 +6285,9 @@
       <w:pPr>
         <w:spacing w:line="360" w:lineRule="auto"/>
         <w:jc w:val="both"/>
+        <w:rPr>
+          <w:rFonts w:hint="eastAsia"/>
+        </w:rPr>
       </w:pPr>
       <w:r>
         <w:br/>
@@ -6052,6 +6297,9 @@
       <w:pPr>
         <w:spacing w:line="360" w:lineRule="auto"/>
         <w:jc w:val="both"/>
+        <w:rPr>
+          <w:rFonts w:hint="eastAsia"/>
+        </w:rPr>
       </w:pPr>
       <w:r>
         <w:rPr>
@@ -6069,6 +6317,9 @@
       <w:pPr>
         <w:spacing w:line="360" w:lineRule="auto"/>
         <w:jc w:val="both"/>
+        <w:rPr>
+          <w:rFonts w:hint="eastAsia"/>
+        </w:rPr>
       </w:pPr>
     </w:p>
     <w:tbl>
@@ -6105,6 +6356,9 @@
             <w:pPr>
               <w:spacing w:after="0"/>
               <w:jc w:val="center"/>
+              <w:rPr>
+                <w:rFonts w:hint="eastAsia"/>
+              </w:rPr>
             </w:pPr>
             <w:r>
               <w:rPr>
@@ -6138,6 +6392,9 @@
             <w:pPr>
               <w:spacing w:after="0"/>
               <w:jc w:val="center"/>
+              <w:rPr>
+                <w:rFonts w:hint="eastAsia"/>
+              </w:rPr>
             </w:pPr>
             <w:r>
               <w:rPr>
@@ -6170,6 +6427,9 @@
             <w:pPr>
               <w:spacing w:after="0"/>
               <w:jc w:val="center"/>
+              <w:rPr>
+                <w:rFonts w:hint="eastAsia"/>
+              </w:rPr>
             </w:pPr>
             <w:r>
               <w:rPr>
@@ -6201,6 +6461,9 @@
             <w:pPr>
               <w:spacing w:after="0"/>
               <w:jc w:val="center"/>
+              <w:rPr>
+                <w:rFonts w:hint="eastAsia"/>
+              </w:rPr>
             </w:pPr>
             <w:r>
               <w:rPr>
@@ -6233,6 +6496,9 @@
             <w:pPr>
               <w:spacing w:after="0"/>
               <w:jc w:val="center"/>
+              <w:rPr>
+                <w:rFonts w:hint="eastAsia"/>
+              </w:rPr>
             </w:pPr>
             <w:r>
               <w:rPr>
@@ -6264,6 +6530,9 @@
             <w:pPr>
               <w:spacing w:after="0"/>
               <w:jc w:val="center"/>
+              <w:rPr>
+                <w:rFonts w:hint="eastAsia"/>
+              </w:rPr>
             </w:pPr>
             <w:r>
               <w:rPr>
@@ -6296,6 +6565,9 @@
             <w:pPr>
               <w:spacing w:after="0"/>
               <w:jc w:val="center"/>
+              <w:rPr>
+                <w:rFonts w:hint="eastAsia"/>
+              </w:rPr>
             </w:pPr>
             <w:r>
               <w:rPr>
@@ -6327,6 +6599,9 @@
             <w:pPr>
               <w:spacing w:after="0"/>
               <w:jc w:val="center"/>
+              <w:rPr>
+                <w:rFonts w:hint="eastAsia"/>
+              </w:rPr>
             </w:pPr>
             <w:r>
               <w:rPr>
@@ -6359,6 +6634,9 @@
             <w:pPr>
               <w:spacing w:after="0"/>
               <w:jc w:val="center"/>
+              <w:rPr>
+                <w:rFonts w:hint="eastAsia"/>
+              </w:rPr>
             </w:pPr>
             <w:r>
               <w:rPr>
@@ -6390,6 +6668,9 @@
             <w:pPr>
               <w:spacing w:after="0"/>
               <w:jc w:val="center"/>
+              <w:rPr>
+                <w:rFonts w:hint="eastAsia"/>
+              </w:rPr>
             </w:pPr>
             <w:r>
               <w:rPr>
@@ -6422,6 +6703,9 @@
             <w:pPr>
               <w:spacing w:after="0"/>
               <w:jc w:val="center"/>
+              <w:rPr>
+                <w:rFonts w:hint="eastAsia"/>
+              </w:rPr>
             </w:pPr>
             <w:r>
               <w:rPr>
@@ -6453,6 +6737,9 @@
             <w:pPr>
               <w:spacing w:after="0"/>
               <w:jc w:val="center"/>
+              <w:rPr>
+                <w:rFonts w:hint="eastAsia"/>
+              </w:rPr>
             </w:pPr>
             <w:r>
               <w:rPr>
@@ -6485,6 +6772,9 @@
             <w:pPr>
               <w:spacing w:after="0"/>
               <w:jc w:val="center"/>
+              <w:rPr>
+                <w:rFonts w:hint="eastAsia"/>
+              </w:rPr>
             </w:pPr>
             <w:r>
               <w:rPr>
@@ -6516,6 +6806,9 @@
             <w:pPr>
               <w:spacing w:after="0"/>
               <w:jc w:val="center"/>
+              <w:rPr>
+                <w:rFonts w:hint="eastAsia"/>
+              </w:rPr>
             </w:pPr>
             <w:r>
               <w:rPr>
@@ -6548,6 +6841,9 @@
             <w:pPr>
               <w:spacing w:after="0"/>
               <w:jc w:val="center"/>
+              <w:rPr>
+                <w:rFonts w:hint="eastAsia"/>
+              </w:rPr>
             </w:pPr>
             <w:r>
               <w:rPr>
@@ -6579,6 +6875,9 @@
             <w:pPr>
               <w:spacing w:after="0"/>
               <w:jc w:val="center"/>
+              <w:rPr>
+                <w:rFonts w:hint="eastAsia"/>
+              </w:rPr>
             </w:pPr>
             <w:r>
               <w:rPr>
@@ -6611,6 +6910,9 @@
             <w:pPr>
               <w:spacing w:after="0"/>
               <w:jc w:val="center"/>
+              <w:rPr>
+                <w:rFonts w:hint="eastAsia"/>
+              </w:rPr>
             </w:pPr>
             <w:r>
               <w:rPr>
@@ -6642,6 +6944,9 @@
             <w:pPr>
               <w:spacing w:after="0"/>
               <w:jc w:val="center"/>
+              <w:rPr>
+                <w:rFonts w:hint="eastAsia"/>
+              </w:rPr>
             </w:pPr>
             <w:r>
               <w:rPr>
@@ -6674,6 +6979,9 @@
             <w:pPr>
               <w:spacing w:after="0"/>
               <w:jc w:val="center"/>
+              <w:rPr>
+                <w:rFonts w:hint="eastAsia"/>
+              </w:rPr>
             </w:pPr>
             <w:r>
               <w:rPr>
@@ -6692,6 +7000,9 @@
       <w:pPr>
         <w:spacing w:line="360" w:lineRule="auto"/>
         <w:jc w:val="both"/>
+        <w:rPr>
+          <w:rFonts w:hint="eastAsia"/>
+        </w:rPr>
       </w:pPr>
     </w:p>
     <w:sectPr>
@@ -6705,9 +7016,14 @@
 </file>
 
 <file path=word/comments.xml><?xml version="1.0" encoding="utf-8"?>
-<w:comments xmlns:wpc="http://schemas.microsoft.com/office/word/2010/wordprocessingCanvas" xmlns:cx="http://schemas.microsoft.com/office/drawing/2014/chartex" xmlns:cx1="http://schemas.microsoft.com/office/drawing/2015/9/8/chartex" xmlns:cx2="http://schemas.microsoft.com/office/drawing/2015/10/21/chartex" xmlns:cx3="http://schemas.microsoft.com/office/drawing/2016/5/9/chartex" xmlns:cx4="http://schemas.microsoft.com/office/drawing/2016/5/10/chartex" xmlns:cx5="http://schemas.microsoft.com/office/drawing/2016/5/11/chartex" xmlns:cx6="http://schemas.microsoft.com/office/drawing/2016/5/12/chartex" xmlns:cx7="http://schemas.microsoft.com/office/drawing/2016/5/13/chartex" xmlns:cx8="http://schemas.microsoft.com/office/drawing/2016/5/14/chartex" xmlns:mc="http://schemas.openxmlformats.org/markup-compatibility/2006" xmlns:aink="http://schemas.microsoft.com/office/drawing/2016/ink" xmlns:am3d="http://schemas.microsoft.com/office/drawing/2017/model3d" xmlns:o="urn:schemas-microsoft-com:office:office" xmlns:r="http://schemas.openxmlformats.org/officeDocument/2006/relationships" xmlns:m="http://schemas.openxmlformats.org/officeDocument/2006/math" xmlns:v="urn:schemas-microsoft-com:vml" xmlns:wp14="http://schemas.microsoft.com/office/word/2010/wordprocessingDrawing" xmlns:wp="http://schemas.openxmlformats.org/drawingml/2006/wordprocessingDrawing" xmlns:w10="urn:schemas-microsoft-com:office:word" xmlns:w="http://schemas.openxmlformats.org/wordprocessingml/2006/main" xmlns:w14="http://schemas.microsoft.com/office/word/2010/wordml" xmlns:w15="http://schemas.microsoft.com/office/word/2012/wordml" xmlns:w16cex="http://schemas.microsoft.com/office/word/2018/wordml/cex" xmlns:w16cid="http://schemas.microsoft.com/office/word/2016/wordml/cid" xmlns:w16="http://schemas.microsoft.com/office/word/2018/wordml" xmlns:w16sdtdh="http://schemas.microsoft.com/office/word/2020/wordml/sdtdatahash" xmlns:w16se="http://schemas.microsoft.com/office/word/2015/wordml/symex" xmlns:wpg="http://schemas.microsoft.com/office/word/2010/wordprocessingGroup" xmlns:wpi="http://schemas.microsoft.com/office/word/2010/wordprocessingInk" xmlns:wne="http://schemas.microsoft.com/office/word/2006/wordml" xmlns:wps="http://schemas.microsoft.com/office/word/2010/wordprocessingShape" mc:Ignorable="w14 w15 w16se w16cid w16 w16cex w16sdtdh wp14">
+<w:comments xmlns:wpc="http://schemas.microsoft.com/office/word/2010/wordprocessingCanvas" xmlns:cx="http://schemas.microsoft.com/office/drawing/2014/chartex" xmlns:cx1="http://schemas.microsoft.com/office/drawing/2015/9/8/chartex" xmlns:cx2="http://schemas.microsoft.com/office/drawing/2015/10/21/chartex" xmlns:cx3="http://schemas.microsoft.com/office/drawing/2016/5/9/chartex" xmlns:cx4="http://schemas.microsoft.com/office/drawing/2016/5/10/chartex" xmlns:cx5="http://schemas.microsoft.com/office/drawing/2016/5/11/chartex" xmlns:cx6="http://schemas.microsoft.com/office/drawing/2016/5/12/chartex" xmlns:cx7="http://schemas.microsoft.com/office/drawing/2016/5/13/chartex" xmlns:cx8="http://schemas.microsoft.com/office/drawing/2016/5/14/chartex" xmlns:mc="http://schemas.openxmlformats.org/markup-compatibility/2006" xmlns:aink="http://schemas.microsoft.com/office/drawing/2016/ink" xmlns:am3d="http://schemas.microsoft.com/office/drawing/2017/model3d" xmlns:o="urn:schemas-microsoft-com:office:office" xmlns:oel="http://schemas.microsoft.com/office/2019/extlst" xmlns:r="http://schemas.openxmlformats.org/officeDocument/2006/relationships" xmlns:m="http://schemas.openxmlformats.org/officeDocument/2006/math" xmlns:v="urn:schemas-microsoft-com:vml" xmlns:wp14="http://schemas.microsoft.com/office/word/2010/wordprocessingDrawing" xmlns:wp="http://schemas.openxmlformats.org/drawingml/2006/wordprocessingDrawing" xmlns:w10="urn:schemas-microsoft-com:office:word" xmlns:w="http://schemas.openxmlformats.org/wordprocessingml/2006/main" xmlns:w14="http://schemas.microsoft.com/office/word/2010/wordml" xmlns:w15="http://schemas.microsoft.com/office/word/2012/wordml" xmlns:w16cex="http://schemas.microsoft.com/office/word/2018/wordml/cex" xmlns:w16cid="http://schemas.microsoft.com/office/word/2016/wordml/cid" xmlns:w16="http://schemas.microsoft.com/office/word/2018/wordml" xmlns:w16sdtdh="http://schemas.microsoft.com/office/word/2020/wordml/sdtdatahash" xmlns:w16se="http://schemas.microsoft.com/office/word/2015/wordml/symex" xmlns:wpg="http://schemas.microsoft.com/office/word/2010/wordprocessingGroup" xmlns:wpi="http://schemas.microsoft.com/office/word/2010/wordprocessingInk" xmlns:wne="http://schemas.microsoft.com/office/word/2006/wordml" xmlns:wps="http://schemas.microsoft.com/office/word/2010/wordprocessingShape" mc:Ignorable="w14 w15 w16se w16cid w16 w16cex w16sdtdh wp14">
   <w:comment w:id="0" w:author="MARCOS HIROSHI YOGI CARVALHO ." w:date="2026-02-26T08:52:00Z" w:initials="M.">
     <w:p>
+      <w:pPr>
+        <w:rPr>
+          <w:rFonts w:hint="eastAsia"/>
+        </w:rPr>
+      </w:pPr>
       <w:r>
         <w:annotationRef/>
       </w:r>
@@ -6720,10 +7036,21 @@
         <w:t xml:space="preserve"> correto, ELES atualizam seus anuncios em tempos reais</w:t>
       </w:r>
     </w:p>
-    <w:p/>
+    <w:p>
+      <w:pPr>
+        <w:rPr>
+          <w:rFonts w:hint="eastAsia"/>
+        </w:rPr>
+      </w:pPr>
+    </w:p>
   </w:comment>
   <w:comment w:id="1" w:author="MARCOS HIROSHI YOGI CARVALHO ." w:date="2026-02-26T08:55:00Z" w:initials="M.">
     <w:p>
+      <w:pPr>
+        <w:rPr>
+          <w:rFonts w:hint="eastAsia"/>
+        </w:rPr>
+      </w:pPr>
       <w:r>
         <w:annotationRef/>
       </w:r>
@@ -6731,10 +7058,21 @@
         <w:t>Elaborar mais sobre essa pesquisa, com fonte tendo que ser citada quando apresentamos os resultados dela</w:t>
       </w:r>
     </w:p>
-    <w:p/>
+    <w:p>
+      <w:pPr>
+        <w:rPr>
+          <w:rFonts w:hint="eastAsia"/>
+        </w:rPr>
+      </w:pPr>
+    </w:p>
   </w:comment>
   <w:comment w:id="2" w:author="MARCOS HIROSHI YOGI CARVALHO ." w:date="2026-02-26T09:03:00Z" w:initials="M.">
     <w:p>
+      <w:pPr>
+        <w:rPr>
+          <w:rFonts w:hint="eastAsia"/>
+        </w:rPr>
+      </w:pPr>
       <w:r>
         <w:annotationRef/>
       </w:r>
@@ -6753,6 +7091,11 @@
   </w:comment>
   <w:comment w:id="3" w:author="MARCOS HIROSHI YOGI CARVALHO ." w:date="2026-02-26T09:04:00Z" w:initials="M.">
     <w:p>
+      <w:pPr>
+        <w:rPr>
+          <w:rFonts w:hint="eastAsia"/>
+        </w:rPr>
+      </w:pPr>
       <w:r>
         <w:annotationRef/>
       </w:r>
@@ -6760,10 +7103,21 @@
         <w:t>ligar mais com aquilo que monitoramos</w:t>
       </w:r>
     </w:p>
-    <w:p/>
+    <w:p>
+      <w:pPr>
+        <w:rPr>
+          <w:rFonts w:hint="eastAsia"/>
+        </w:rPr>
+      </w:pPr>
+    </w:p>
   </w:comment>
   <w:comment w:id="4" w:author="MARCOS HIROSHI YOGI CARVALHO ." w:date="2026-02-26T09:06:00Z" w:initials="M.">
     <w:p>
+      <w:pPr>
+        <w:rPr>
+          <w:rFonts w:hint="eastAsia"/>
+        </w:rPr>
+      </w:pPr>
       <w:r>
         <w:annotationRef/>
       </w:r>
@@ -6776,6 +7130,11 @@
   </w:comment>
   <w:comment w:id="5" w:author="MARCOS HIROSHI YOGI CARVALHO ." w:date="2026-02-26T09:06:00Z" w:initials="M.">
     <w:p>
+      <w:pPr>
+        <w:rPr>
+          <w:rFonts w:hint="eastAsia"/>
+        </w:rPr>
+      </w:pPr>
       <w:r>
         <w:annotationRef/>
       </w:r>
@@ -6786,6 +7145,11 @@
   </w:comment>
   <w:comment w:id="6" w:author="MARCOS HIROSHI YOGI CARVALHO ." w:date="2026-02-26T09:10:00Z" w:initials="M.">
     <w:p>
+      <w:pPr>
+        <w:rPr>
+          <w:rFonts w:hint="eastAsia"/>
+        </w:rPr>
+      </w:pPr>
       <w:r>
         <w:annotationRef/>
       </w:r>
@@ -6795,13 +7159,19 @@
       </w:r>
       <w:proofErr w:type="spellEnd"/>
     </w:p>
-    <w:p/>
+    <w:p>
+      <w:pPr>
+        <w:rPr>
+          <w:rFonts w:hint="eastAsia"/>
+        </w:rPr>
+      </w:pPr>
+    </w:p>
   </w:comment>
 </w:comments>
 </file>
 
 <file path=word/commentsExtended.xml><?xml version="1.0" encoding="utf-8"?>
-<w15:commentsEx xmlns:wpc="http://schemas.microsoft.com/office/word/2010/wordprocessingCanvas" xmlns:cx="http://schemas.microsoft.com/office/drawing/2014/chartex" xmlns:cx1="http://schemas.microsoft.com/office/drawing/2015/9/8/chartex" xmlns:cx2="http://schemas.microsoft.com/office/drawing/2015/10/21/chartex" xmlns:cx3="http://schemas.microsoft.com/office/drawing/2016/5/9/chartex" xmlns:cx4="http://schemas.microsoft.com/office/drawing/2016/5/10/chartex" xmlns:cx5="http://schemas.microsoft.com/office/drawing/2016/5/11/chartex" xmlns:cx6="http://schemas.microsoft.com/office/drawing/2016/5/12/chartex" xmlns:cx7="http://schemas.microsoft.com/office/drawing/2016/5/13/chartex" xmlns:cx8="http://schemas.microsoft.com/office/drawing/2016/5/14/chartex" xmlns:mc="http://schemas.openxmlformats.org/markup-compatibility/2006" xmlns:aink="http://schemas.microsoft.com/office/drawing/2016/ink" xmlns:am3d="http://schemas.microsoft.com/office/drawing/2017/model3d" xmlns:o="urn:schemas-microsoft-com:office:office" xmlns:r="http://schemas.openxmlformats.org/officeDocument/2006/relationships" xmlns:m="http://schemas.openxmlformats.org/officeDocument/2006/math" xmlns:v="urn:schemas-microsoft-com:vml" xmlns:wp14="http://schemas.microsoft.com/office/word/2010/wordprocessingDrawing" xmlns:wp="http://schemas.openxmlformats.org/drawingml/2006/wordprocessingDrawing" xmlns:w10="urn:schemas-microsoft-com:office:word" xmlns:w="http://schemas.openxmlformats.org/wordprocessingml/2006/main" xmlns:w14="http://schemas.microsoft.com/office/word/2010/wordml" xmlns:w15="http://schemas.microsoft.com/office/word/2012/wordml" xmlns:w16cex="http://schemas.microsoft.com/office/word/2018/wordml/cex" xmlns:w16cid="http://schemas.microsoft.com/office/word/2016/wordml/cid" xmlns:w16="http://schemas.microsoft.com/office/word/2018/wordml" xmlns:w16sdtdh="http://schemas.microsoft.com/office/word/2020/wordml/sdtdatahash" xmlns:w16se="http://schemas.microsoft.com/office/word/2015/wordml/symex" xmlns:wpg="http://schemas.microsoft.com/office/word/2010/wordprocessingGroup" xmlns:wpi="http://schemas.microsoft.com/office/word/2010/wordprocessingInk" xmlns:wne="http://schemas.microsoft.com/office/word/2006/wordml" xmlns:wps="http://schemas.microsoft.com/office/word/2010/wordprocessingShape" mc:Ignorable="w14 w15 w16se w16cid w16 w16cex w16sdtdh wp14">
+<w15:commentsEx xmlns:wpc="http://schemas.microsoft.com/office/word/2010/wordprocessingCanvas" xmlns:cx="http://schemas.microsoft.com/office/drawing/2014/chartex" xmlns:cx1="http://schemas.microsoft.com/office/drawing/2015/9/8/chartex" xmlns:cx2="http://schemas.microsoft.com/office/drawing/2015/10/21/chartex" xmlns:cx3="http://schemas.microsoft.com/office/drawing/2016/5/9/chartex" xmlns:cx4="http://schemas.microsoft.com/office/drawing/2016/5/10/chartex" xmlns:cx5="http://schemas.microsoft.com/office/drawing/2016/5/11/chartex" xmlns:cx6="http://schemas.microsoft.com/office/drawing/2016/5/12/chartex" xmlns:cx7="http://schemas.microsoft.com/office/drawing/2016/5/13/chartex" xmlns:cx8="http://schemas.microsoft.com/office/drawing/2016/5/14/chartex" xmlns:mc="http://schemas.openxmlformats.org/markup-compatibility/2006" xmlns:aink="http://schemas.microsoft.com/office/drawing/2016/ink" xmlns:am3d="http://schemas.microsoft.com/office/drawing/2017/model3d" xmlns:o="urn:schemas-microsoft-com:office:office" xmlns:oel="http://schemas.microsoft.com/office/2019/extlst" xmlns:r="http://schemas.openxmlformats.org/officeDocument/2006/relationships" xmlns:m="http://schemas.openxmlformats.org/officeDocument/2006/math" xmlns:v="urn:schemas-microsoft-com:vml" xmlns:wp14="http://schemas.microsoft.com/office/word/2010/wordprocessingDrawing" xmlns:wp="http://schemas.openxmlformats.org/drawingml/2006/wordprocessingDrawing" xmlns:w10="urn:schemas-microsoft-com:office:word" xmlns:w="http://schemas.openxmlformats.org/wordprocessingml/2006/main" xmlns:w14="http://schemas.microsoft.com/office/word/2010/wordml" xmlns:w15="http://schemas.microsoft.com/office/word/2012/wordml" xmlns:w16cex="http://schemas.microsoft.com/office/word/2018/wordml/cex" xmlns:w16cid="http://schemas.microsoft.com/office/word/2016/wordml/cid" xmlns:w16="http://schemas.microsoft.com/office/word/2018/wordml" xmlns:w16sdtdh="http://schemas.microsoft.com/office/word/2020/wordml/sdtdatahash" xmlns:w16se="http://schemas.microsoft.com/office/word/2015/wordml/symex" xmlns:wpg="http://schemas.microsoft.com/office/word/2010/wordprocessingGroup" xmlns:wpi="http://schemas.microsoft.com/office/word/2010/wordprocessingInk" xmlns:wne="http://schemas.microsoft.com/office/word/2006/wordml" xmlns:wps="http://schemas.microsoft.com/office/word/2010/wordprocessingShape" mc:Ignorable="w14 w15 w16se w16cid w16 w16cex w16sdtdh wp14">
   <w15:commentEx w15:paraId="2A9F4321" w15:done="1"/>
   <w15:commentEx w15:paraId="113A44A9" w15:done="0"/>
   <w15:commentEx w15:paraId="21970BDB" w15:done="1"/>
@@ -6813,7 +7183,7 @@
 </file>
 
 <file path=word/commentsExtensible.xml><?xml version="1.0" encoding="utf-8"?>
-<w16cex:commentsExtensible xmlns:wpc="http://schemas.microsoft.com/office/word/2010/wordprocessingCanvas" xmlns:cx="http://schemas.microsoft.com/office/drawing/2014/chartex" xmlns:cx1="http://schemas.microsoft.com/office/drawing/2015/9/8/chartex" xmlns:cx2="http://schemas.microsoft.com/office/drawing/2015/10/21/chartex" xmlns:cx3="http://schemas.microsoft.com/office/drawing/2016/5/9/chartex" xmlns:cx4="http://schemas.microsoft.com/office/drawing/2016/5/10/chartex" xmlns:cx5="http://schemas.microsoft.com/office/drawing/2016/5/11/chartex" xmlns:cx6="http://schemas.microsoft.com/office/drawing/2016/5/12/chartex" xmlns:cx7="http://schemas.microsoft.com/office/drawing/2016/5/13/chartex" xmlns:cx8="http://schemas.microsoft.com/office/drawing/2016/5/14/chartex" xmlns:mc="http://schemas.openxmlformats.org/markup-compatibility/2006" xmlns:aink="http://schemas.microsoft.com/office/drawing/2016/ink" xmlns:am3d="http://schemas.microsoft.com/office/drawing/2017/model3d" xmlns:o="urn:schemas-microsoft-com:office:office" xmlns:r="http://schemas.openxmlformats.org/officeDocument/2006/relationships" xmlns:m="http://schemas.openxmlformats.org/officeDocument/2006/math" xmlns:v="urn:schemas-microsoft-com:vml" xmlns:wp14="http://schemas.microsoft.com/office/word/2010/wordprocessingDrawing" xmlns:wp="http://schemas.openxmlformats.org/drawingml/2006/wordprocessingDrawing" xmlns:w10="urn:schemas-microsoft-com:office:word" xmlns:w="http://schemas.openxmlformats.org/wordprocessingml/2006/main" xmlns:w14="http://schemas.microsoft.com/office/word/2010/wordml" xmlns:w15="http://schemas.microsoft.com/office/word/2012/wordml" xmlns:w16cex="http://schemas.microsoft.com/office/word/2018/wordml/cex" xmlns:w16cid="http://schemas.microsoft.com/office/word/2016/wordml/cid" xmlns:w16="http://schemas.microsoft.com/office/word/2018/wordml" xmlns:w16sdtdh="http://schemas.microsoft.com/office/word/2020/wordml/sdtdatahash" xmlns:w16se="http://schemas.microsoft.com/office/word/2015/wordml/symex" xmlns:wpg="http://schemas.microsoft.com/office/word/2010/wordprocessingGroup" xmlns:wpi="http://schemas.microsoft.com/office/word/2010/wordprocessingInk" xmlns:wne="http://schemas.microsoft.com/office/word/2006/wordml" xmlns:wps="http://schemas.microsoft.com/office/word/2010/wordprocessingShape" mc:Ignorable="w14 w15 w16se w16cid w16 w16cex w16sdtdh wp14">
+<w16cex:commentsExtensible xmlns:wpc="http://schemas.microsoft.com/office/word/2010/wordprocessingCanvas" xmlns:cx="http://schemas.microsoft.com/office/drawing/2014/chartex" xmlns:cx1="http://schemas.microsoft.com/office/drawing/2015/9/8/chartex" xmlns:cx2="http://schemas.microsoft.com/office/drawing/2015/10/21/chartex" xmlns:cx3="http://schemas.microsoft.com/office/drawing/2016/5/9/chartex" xmlns:cx4="http://schemas.microsoft.com/office/drawing/2016/5/10/chartex" xmlns:cx5="http://schemas.microsoft.com/office/drawing/2016/5/11/chartex" xmlns:cx6="http://schemas.microsoft.com/office/drawing/2016/5/12/chartex" xmlns:cx7="http://schemas.microsoft.com/office/drawing/2016/5/13/chartex" xmlns:cx8="http://schemas.microsoft.com/office/drawing/2016/5/14/chartex" xmlns:mc="http://schemas.openxmlformats.org/markup-compatibility/2006" xmlns:aink="http://schemas.microsoft.com/office/drawing/2016/ink" xmlns:am3d="http://schemas.microsoft.com/office/drawing/2017/model3d" xmlns:o="urn:schemas-microsoft-com:office:office" xmlns:oel="http://schemas.microsoft.com/office/2019/extlst" xmlns:r="http://schemas.openxmlformats.org/officeDocument/2006/relationships" xmlns:m="http://schemas.openxmlformats.org/officeDocument/2006/math" xmlns:v="urn:schemas-microsoft-com:vml" xmlns:wp14="http://schemas.microsoft.com/office/word/2010/wordprocessingDrawing" xmlns:wp="http://schemas.openxmlformats.org/drawingml/2006/wordprocessingDrawing" xmlns:w10="urn:schemas-microsoft-com:office:word" xmlns:w="http://schemas.openxmlformats.org/wordprocessingml/2006/main" xmlns:w14="http://schemas.microsoft.com/office/word/2010/wordml" xmlns:w15="http://schemas.microsoft.com/office/word/2012/wordml" xmlns:w16cex="http://schemas.microsoft.com/office/word/2018/wordml/cex" xmlns:w16cid="http://schemas.microsoft.com/office/word/2016/wordml/cid" xmlns:w16="http://schemas.microsoft.com/office/word/2018/wordml" xmlns:w16sdtdh="http://schemas.microsoft.com/office/word/2020/wordml/sdtdatahash" xmlns:w16se="http://schemas.microsoft.com/office/word/2015/wordml/symex" xmlns:wpg="http://schemas.microsoft.com/office/word/2010/wordprocessingGroup" xmlns:wpi="http://schemas.microsoft.com/office/word/2010/wordprocessingInk" xmlns:wne="http://schemas.microsoft.com/office/word/2006/wordml" xmlns:wps="http://schemas.microsoft.com/office/word/2010/wordprocessingShape" mc:Ignorable="w14 w15 w16se w16cid w16 w16cex w16sdtdh wp14">
   <w16cex:commentExtensible w16cex:durableId="521F6BDC" w16cex:dateUtc="2026-02-26T11:52:00Z"/>
   <w16cex:commentExtensible w16cex:durableId="3359E683" w16cex:dateUtc="2026-02-26T11:55:00Z"/>
   <w16cex:commentExtensible w16cex:durableId="14F55F0D" w16cex:dateUtc="2026-02-26T12:03:00Z"/>
@@ -6825,7 +7195,7 @@
 </file>
 
 <file path=word/commentsIds.xml><?xml version="1.0" encoding="utf-8"?>
-<w16cid:commentsIds xmlns:wpc="http://schemas.microsoft.com/office/word/2010/wordprocessingCanvas" xmlns:cx="http://schemas.microsoft.com/office/drawing/2014/chartex" xmlns:cx1="http://schemas.microsoft.com/office/drawing/2015/9/8/chartex" xmlns:cx2="http://schemas.microsoft.com/office/drawing/2015/10/21/chartex" xmlns:cx3="http://schemas.microsoft.com/office/drawing/2016/5/9/chartex" xmlns:cx4="http://schemas.microsoft.com/office/drawing/2016/5/10/chartex" xmlns:cx5="http://schemas.microsoft.com/office/drawing/2016/5/11/chartex" xmlns:cx6="http://schemas.microsoft.com/office/drawing/2016/5/12/chartex" xmlns:cx7="http://schemas.microsoft.com/office/drawing/2016/5/13/chartex" xmlns:cx8="http://schemas.microsoft.com/office/drawing/2016/5/14/chartex" xmlns:mc="http://schemas.openxmlformats.org/markup-compatibility/2006" xmlns:aink="http://schemas.microsoft.com/office/drawing/2016/ink" xmlns:am3d="http://schemas.microsoft.com/office/drawing/2017/model3d" xmlns:o="urn:schemas-microsoft-com:office:office" xmlns:r="http://schemas.openxmlformats.org/officeDocument/2006/relationships" xmlns:m="http://schemas.openxmlformats.org/officeDocument/2006/math" xmlns:v="urn:schemas-microsoft-com:vml" xmlns:wp14="http://schemas.microsoft.com/office/word/2010/wordprocessingDrawing" xmlns:wp="http://schemas.openxmlformats.org/drawingml/2006/wordprocessingDrawing" xmlns:w10="urn:schemas-microsoft-com:office:word" xmlns:w="http://schemas.openxmlformats.org/wordprocessingml/2006/main" xmlns:w14="http://schemas.microsoft.com/office/word/2010/wordml" xmlns:w15="http://schemas.microsoft.com/office/word/2012/wordml" xmlns:w16cex="http://schemas.microsoft.com/office/word/2018/wordml/cex" xmlns:w16cid="http://schemas.microsoft.com/office/word/2016/wordml/cid" xmlns:w16="http://schemas.microsoft.com/office/word/2018/wordml" xmlns:w16sdtdh="http://schemas.microsoft.com/office/word/2020/wordml/sdtdatahash" xmlns:w16se="http://schemas.microsoft.com/office/word/2015/wordml/symex" xmlns:wpg="http://schemas.microsoft.com/office/word/2010/wordprocessingGroup" xmlns:wpi="http://schemas.microsoft.com/office/word/2010/wordprocessingInk" xmlns:wne="http://schemas.microsoft.com/office/word/2006/wordml" xmlns:wps="http://schemas.microsoft.com/office/word/2010/wordprocessingShape" mc:Ignorable="w14 w15 w16se w16cid w16 w16cex w16sdtdh wp14">
+<w16cid:commentsIds xmlns:wpc="http://schemas.microsoft.com/office/word/2010/wordprocessingCanvas" xmlns:cx="http://schemas.microsoft.com/office/drawing/2014/chartex" xmlns:cx1="http://schemas.microsoft.com/office/drawing/2015/9/8/chartex" xmlns:cx2="http://schemas.microsoft.com/office/drawing/2015/10/21/chartex" xmlns:cx3="http://schemas.microsoft.com/office/drawing/2016/5/9/chartex" xmlns:cx4="http://schemas.microsoft.com/office/drawing/2016/5/10/chartex" xmlns:cx5="http://schemas.microsoft.com/office/drawing/2016/5/11/chartex" xmlns:cx6="http://schemas.microsoft.com/office/drawing/2016/5/12/chartex" xmlns:cx7="http://schemas.microsoft.com/office/drawing/2016/5/13/chartex" xmlns:cx8="http://schemas.microsoft.com/office/drawing/2016/5/14/chartex" xmlns:mc="http://schemas.openxmlformats.org/markup-compatibility/2006" xmlns:aink="http://schemas.microsoft.com/office/drawing/2016/ink" xmlns:am3d="http://schemas.microsoft.com/office/drawing/2017/model3d" xmlns:o="urn:schemas-microsoft-com:office:office" xmlns:oel="http://schemas.microsoft.com/office/2019/extlst" xmlns:r="http://schemas.openxmlformats.org/officeDocument/2006/relationships" xmlns:m="http://schemas.openxmlformats.org/officeDocument/2006/math" xmlns:v="urn:schemas-microsoft-com:vml" xmlns:wp14="http://schemas.microsoft.com/office/word/2010/wordprocessingDrawing" xmlns:wp="http://schemas.openxmlformats.org/drawingml/2006/wordprocessingDrawing" xmlns:w10="urn:schemas-microsoft-com:office:word" xmlns:w="http://schemas.openxmlformats.org/wordprocessingml/2006/main" xmlns:w14="http://schemas.microsoft.com/office/word/2010/wordml" xmlns:w15="http://schemas.microsoft.com/office/word/2012/wordml" xmlns:w16cex="http://schemas.microsoft.com/office/word/2018/wordml/cex" xmlns:w16cid="http://schemas.microsoft.com/office/word/2016/wordml/cid" xmlns:w16="http://schemas.microsoft.com/office/word/2018/wordml" xmlns:w16sdtdh="http://schemas.microsoft.com/office/word/2020/wordml/sdtdatahash" xmlns:w16se="http://schemas.microsoft.com/office/word/2015/wordml/symex" xmlns:wpg="http://schemas.microsoft.com/office/word/2010/wordprocessingGroup" xmlns:wpi="http://schemas.microsoft.com/office/word/2010/wordprocessingInk" xmlns:wne="http://schemas.microsoft.com/office/word/2006/wordml" xmlns:wps="http://schemas.microsoft.com/office/word/2010/wordprocessingShape" mc:Ignorable="w14 w15 w16se w16cid w16 w16cex w16sdtdh wp14">
   <w16cid:commentId w16cid:paraId="2A9F4321" w16cid:durableId="521F6BDC"/>
   <w16cid:commentId w16cid:paraId="113A44A9" w16cid:durableId="3359E683"/>
   <w16cid:commentId w16cid:paraId="21970BDB" w16cid:durableId="14F55F0D"/>
@@ -6852,7 +7222,7 @@
 </file>
 
 <file path=word/numbering.xml><?xml version="1.0" encoding="utf-8"?>
-<w:numbering xmlns:wpc="http://schemas.microsoft.com/office/word/2010/wordprocessingCanvas" xmlns:cx="http://schemas.microsoft.com/office/drawing/2014/chartex" xmlns:cx1="http://schemas.microsoft.com/office/drawing/2015/9/8/chartex" xmlns:cx2="http://schemas.microsoft.com/office/drawing/2015/10/21/chartex" xmlns:cx3="http://schemas.microsoft.com/office/drawing/2016/5/9/chartex" xmlns:cx4="http://schemas.microsoft.com/office/drawing/2016/5/10/chartex" xmlns:cx5="http://schemas.microsoft.com/office/drawing/2016/5/11/chartex" xmlns:cx6="http://schemas.microsoft.com/office/drawing/2016/5/12/chartex" xmlns:cx7="http://schemas.microsoft.com/office/drawing/2016/5/13/chartex" xmlns:cx8="http://schemas.microsoft.com/office/drawing/2016/5/14/chartex" xmlns:mc="http://schemas.openxmlformats.org/markup-compatibility/2006" xmlns:aink="http://schemas.microsoft.com/office/drawing/2016/ink" xmlns:am3d="http://schemas.microsoft.com/office/drawing/2017/model3d" xmlns:o="urn:schemas-microsoft-com:office:office" xmlns:r="http://schemas.openxmlformats.org/officeDocument/2006/relationships" xmlns:m="http://schemas.openxmlformats.org/officeDocument/2006/math" xmlns:v="urn:schemas-microsoft-com:vml" xmlns:wp14="http://schemas.microsoft.com/office/word/2010/wordprocessingDrawing" xmlns:wp="http://schemas.openxmlformats.org/drawingml/2006/wordprocessingDrawing" xmlns:w10="urn:schemas-microsoft-com:office:word" xmlns:w="http://schemas.openxmlformats.org/wordprocessingml/2006/main" xmlns:w14="http://schemas.microsoft.com/office/word/2010/wordml" xmlns:w15="http://schemas.microsoft.com/office/word/2012/wordml" xmlns:w16cex="http://schemas.microsoft.com/office/word/2018/wordml/cex" xmlns:w16cid="http://schemas.microsoft.com/office/word/2016/wordml/cid" xmlns:w16="http://schemas.microsoft.com/office/word/2018/wordml" xmlns:w16sdtdh="http://schemas.microsoft.com/office/word/2020/wordml/sdtdatahash" xmlns:w16se="http://schemas.microsoft.com/office/word/2015/wordml/symex" xmlns:wpg="http://schemas.microsoft.com/office/word/2010/wordprocessingGroup" xmlns:wpi="http://schemas.microsoft.com/office/word/2010/wordprocessingInk" xmlns:wne="http://schemas.microsoft.com/office/word/2006/wordml" xmlns:wps="http://schemas.microsoft.com/office/word/2010/wordprocessingShape" mc:Ignorable="w14 w15 w16se w16cid w16 w16cex w16sdtdh wp14">
+<w:numbering xmlns:wpc="http://schemas.microsoft.com/office/word/2010/wordprocessingCanvas" xmlns:cx="http://schemas.microsoft.com/office/drawing/2014/chartex" xmlns:cx1="http://schemas.microsoft.com/office/drawing/2015/9/8/chartex" xmlns:cx2="http://schemas.microsoft.com/office/drawing/2015/10/21/chartex" xmlns:cx3="http://schemas.microsoft.com/office/drawing/2016/5/9/chartex" xmlns:cx4="http://schemas.microsoft.com/office/drawing/2016/5/10/chartex" xmlns:cx5="http://schemas.microsoft.com/office/drawing/2016/5/11/chartex" xmlns:cx6="http://schemas.microsoft.com/office/drawing/2016/5/12/chartex" xmlns:cx7="http://schemas.microsoft.com/office/drawing/2016/5/13/chartex" xmlns:cx8="http://schemas.microsoft.com/office/drawing/2016/5/14/chartex" xmlns:mc="http://schemas.openxmlformats.org/markup-compatibility/2006" xmlns:aink="http://schemas.microsoft.com/office/drawing/2016/ink" xmlns:am3d="http://schemas.microsoft.com/office/drawing/2017/model3d" xmlns:o="urn:schemas-microsoft-com:office:office" xmlns:oel="http://schemas.microsoft.com/office/2019/extlst" xmlns:r="http://schemas.openxmlformats.org/officeDocument/2006/relationships" xmlns:m="http://schemas.openxmlformats.org/officeDocument/2006/math" xmlns:v="urn:schemas-microsoft-com:vml" xmlns:wp14="http://schemas.microsoft.com/office/word/2010/wordprocessingDrawing" xmlns:wp="http://schemas.openxmlformats.org/drawingml/2006/wordprocessingDrawing" xmlns:w10="urn:schemas-microsoft-com:office:word" xmlns:w="http://schemas.openxmlformats.org/wordprocessingml/2006/main" xmlns:w14="http://schemas.microsoft.com/office/word/2010/wordml" xmlns:w15="http://schemas.microsoft.com/office/word/2012/wordml" xmlns:w16cex="http://schemas.microsoft.com/office/word/2018/wordml/cex" xmlns:w16cid="http://schemas.microsoft.com/office/word/2016/wordml/cid" xmlns:w16="http://schemas.microsoft.com/office/word/2018/wordml" xmlns:w16sdtdh="http://schemas.microsoft.com/office/word/2020/wordml/sdtdatahash" xmlns:w16se="http://schemas.microsoft.com/office/word/2015/wordml/symex" xmlns:wpg="http://schemas.microsoft.com/office/word/2010/wordprocessingGroup" xmlns:wpi="http://schemas.microsoft.com/office/word/2010/wordprocessingInk" xmlns:wne="http://schemas.microsoft.com/office/word/2006/wordml" xmlns:wps="http://schemas.microsoft.com/office/word/2010/wordprocessingShape" mc:Ignorable="w14 w15 w16se w16cid w16 w16cex w16sdtdh wp14">
   <w:abstractNum w:abstractNumId="0" w15:restartNumberingAfterBreak="0">
     <w:nsid w:val="016A32AF"/>
     <w:multiLevelType w:val="hybridMultilevel"/>
@@ -10666,110 +11036,110 @@
       </w:rPr>
     </w:lvl>
   </w:abstractNum>
-  <w:num w:numId="1">
+  <w:num w:numId="1" w16cid:durableId="1667855516">
     <w:abstractNumId w:val="0"/>
   </w:num>
-  <w:num w:numId="2">
+  <w:num w:numId="2" w16cid:durableId="48039301">
     <w:abstractNumId w:val="4"/>
   </w:num>
-  <w:num w:numId="3">
+  <w:num w:numId="3" w16cid:durableId="1367170333">
     <w:abstractNumId w:val="14"/>
   </w:num>
-  <w:num w:numId="4">
+  <w:num w:numId="4" w16cid:durableId="452137016">
     <w:abstractNumId w:val="11"/>
   </w:num>
-  <w:num w:numId="5">
+  <w:num w:numId="5" w16cid:durableId="299044967">
     <w:abstractNumId w:val="21"/>
   </w:num>
-  <w:num w:numId="6">
+  <w:num w:numId="6" w16cid:durableId="437063252">
     <w:abstractNumId w:val="24"/>
   </w:num>
-  <w:num w:numId="7">
+  <w:num w:numId="7" w16cid:durableId="1890069143">
     <w:abstractNumId w:val="1"/>
   </w:num>
-  <w:num w:numId="8">
+  <w:num w:numId="8" w16cid:durableId="1200241984">
     <w:abstractNumId w:val="25"/>
   </w:num>
-  <w:num w:numId="9">
+  <w:num w:numId="9" w16cid:durableId="737435549">
     <w:abstractNumId w:val="27"/>
   </w:num>
-  <w:num w:numId="10">
+  <w:num w:numId="10" w16cid:durableId="468670509">
     <w:abstractNumId w:val="6"/>
   </w:num>
-  <w:num w:numId="11">
+  <w:num w:numId="11" w16cid:durableId="1088381254">
     <w:abstractNumId w:val="3"/>
   </w:num>
-  <w:num w:numId="12">
+  <w:num w:numId="12" w16cid:durableId="364061867">
     <w:abstractNumId w:val="28"/>
   </w:num>
-  <w:num w:numId="13">
+  <w:num w:numId="13" w16cid:durableId="1712411862">
     <w:abstractNumId w:val="20"/>
   </w:num>
-  <w:num w:numId="14">
+  <w:num w:numId="14" w16cid:durableId="872614139">
     <w:abstractNumId w:val="29"/>
   </w:num>
-  <w:num w:numId="15">
+  <w:num w:numId="15" w16cid:durableId="650403893">
     <w:abstractNumId w:val="16"/>
   </w:num>
-  <w:num w:numId="16">
+  <w:num w:numId="16" w16cid:durableId="1482192520">
     <w:abstractNumId w:val="30"/>
   </w:num>
-  <w:num w:numId="17">
+  <w:num w:numId="17" w16cid:durableId="1259676258">
     <w:abstractNumId w:val="8"/>
   </w:num>
-  <w:num w:numId="18">
+  <w:num w:numId="18" w16cid:durableId="264384131">
     <w:abstractNumId w:val="26"/>
   </w:num>
-  <w:num w:numId="19">
+  <w:num w:numId="19" w16cid:durableId="196746824">
     <w:abstractNumId w:val="31"/>
   </w:num>
-  <w:num w:numId="20">
+  <w:num w:numId="20" w16cid:durableId="612976524">
     <w:abstractNumId w:val="19"/>
   </w:num>
-  <w:num w:numId="21">
+  <w:num w:numId="21" w16cid:durableId="7030864">
     <w:abstractNumId w:val="18"/>
   </w:num>
-  <w:num w:numId="22">
+  <w:num w:numId="22" w16cid:durableId="1335692608">
     <w:abstractNumId w:val="23"/>
   </w:num>
-  <w:num w:numId="23">
+  <w:num w:numId="23" w16cid:durableId="926228624">
     <w:abstractNumId w:val="17"/>
   </w:num>
-  <w:num w:numId="24">
+  <w:num w:numId="24" w16cid:durableId="888691576">
     <w:abstractNumId w:val="5"/>
   </w:num>
-  <w:num w:numId="25">
+  <w:num w:numId="25" w16cid:durableId="1490360794">
     <w:abstractNumId w:val="10"/>
   </w:num>
-  <w:num w:numId="26">
+  <w:num w:numId="26" w16cid:durableId="2115397465">
     <w:abstractNumId w:val="15"/>
   </w:num>
-  <w:num w:numId="27">
+  <w:num w:numId="27" w16cid:durableId="1661882956">
     <w:abstractNumId w:val="13"/>
   </w:num>
-  <w:num w:numId="28">
+  <w:num w:numId="28" w16cid:durableId="1881046715">
     <w:abstractNumId w:val="9"/>
   </w:num>
-  <w:num w:numId="29">
+  <w:num w:numId="29" w16cid:durableId="1768193146">
     <w:abstractNumId w:val="32"/>
   </w:num>
-  <w:num w:numId="30">
+  <w:num w:numId="30" w16cid:durableId="642583470">
     <w:abstractNumId w:val="12"/>
   </w:num>
-  <w:num w:numId="31">
+  <w:num w:numId="31" w16cid:durableId="813567221">
     <w:abstractNumId w:val="22"/>
   </w:num>
-  <w:num w:numId="32">
+  <w:num w:numId="32" w16cid:durableId="152376237">
     <w:abstractNumId w:val="7"/>
   </w:num>
-  <w:num w:numId="33">
+  <w:num w:numId="33" w16cid:durableId="411588299">
     <w:abstractNumId w:val="2"/>
   </w:num>
 </w:numbering>
 </file>
 
 <file path=word/people.xml><?xml version="1.0" encoding="utf-8"?>
-<w15:people xmlns:wpc="http://schemas.microsoft.com/office/word/2010/wordprocessingCanvas" xmlns:cx="http://schemas.microsoft.com/office/drawing/2014/chartex" xmlns:cx1="http://schemas.microsoft.com/office/drawing/2015/9/8/chartex" xmlns:cx2="http://schemas.microsoft.com/office/drawing/2015/10/21/chartex" xmlns:cx3="http://schemas.microsoft.com/office/drawing/2016/5/9/chartex" xmlns:cx4="http://schemas.microsoft.com/office/drawing/2016/5/10/chartex" xmlns:cx5="http://schemas.microsoft.com/office/drawing/2016/5/11/chartex" xmlns:cx6="http://schemas.microsoft.com/office/drawing/2016/5/12/chartex" xmlns:cx7="http://schemas.microsoft.com/office/drawing/2016/5/13/chartex" xmlns:cx8="http://schemas.microsoft.com/office/drawing/2016/5/14/chartex" xmlns:mc="http://schemas.openxmlformats.org/markup-compatibility/2006" xmlns:aink="http://schemas.microsoft.com/office/drawing/2016/ink" xmlns:am3d="http://schemas.microsoft.com/office/drawing/2017/model3d" xmlns:o="urn:schemas-microsoft-com:office:office" xmlns:r="http://schemas.openxmlformats.org/officeDocument/2006/relationships" xmlns:m="http://schemas.openxmlformats.org/officeDocument/2006/math" xmlns:v="urn:schemas-microsoft-com:vml" xmlns:wp14="http://schemas.microsoft.com/office/word/2010/wordprocessingDrawing" xmlns:wp="http://schemas.openxmlformats.org/drawingml/2006/wordprocessingDrawing" xmlns:w10="urn:schemas-microsoft-com:office:word" xmlns:w="http://schemas.openxmlformats.org/wordprocessingml/2006/main" xmlns:w14="http://schemas.microsoft.com/office/word/2010/wordml" xmlns:w15="http://schemas.microsoft.com/office/word/2012/wordml" xmlns:w16cex="http://schemas.microsoft.com/office/word/2018/wordml/cex" xmlns:w16cid="http://schemas.microsoft.com/office/word/2016/wordml/cid" xmlns:w16="http://schemas.microsoft.com/office/word/2018/wordml" xmlns:w16sdtdh="http://schemas.microsoft.com/office/word/2020/wordml/sdtdatahash" xmlns:w16se="http://schemas.microsoft.com/office/word/2015/wordml/symex" xmlns:wpg="http://schemas.microsoft.com/office/word/2010/wordprocessingGroup" xmlns:wpi="http://schemas.microsoft.com/office/word/2010/wordprocessingInk" xmlns:wne="http://schemas.microsoft.com/office/word/2006/wordml" xmlns:wps="http://schemas.microsoft.com/office/word/2010/wordprocessingShape" mc:Ignorable="w14 w15 w16se w16cid w16 w16cex w16sdtdh wp14">
+<w15:people xmlns:wpc="http://schemas.microsoft.com/office/word/2010/wordprocessingCanvas" xmlns:cx="http://schemas.microsoft.com/office/drawing/2014/chartex" xmlns:cx1="http://schemas.microsoft.com/office/drawing/2015/9/8/chartex" xmlns:cx2="http://schemas.microsoft.com/office/drawing/2015/10/21/chartex" xmlns:cx3="http://schemas.microsoft.com/office/drawing/2016/5/9/chartex" xmlns:cx4="http://schemas.microsoft.com/office/drawing/2016/5/10/chartex" xmlns:cx5="http://schemas.microsoft.com/office/drawing/2016/5/11/chartex" xmlns:cx6="http://schemas.microsoft.com/office/drawing/2016/5/12/chartex" xmlns:cx7="http://schemas.microsoft.com/office/drawing/2016/5/13/chartex" xmlns:cx8="http://schemas.microsoft.com/office/drawing/2016/5/14/chartex" xmlns:mc="http://schemas.openxmlformats.org/markup-compatibility/2006" xmlns:aink="http://schemas.microsoft.com/office/drawing/2016/ink" xmlns:am3d="http://schemas.microsoft.com/office/drawing/2017/model3d" xmlns:o="urn:schemas-microsoft-com:office:office" xmlns:oel="http://schemas.microsoft.com/office/2019/extlst" xmlns:r="http://schemas.openxmlformats.org/officeDocument/2006/relationships" xmlns:m="http://schemas.openxmlformats.org/officeDocument/2006/math" xmlns:v="urn:schemas-microsoft-com:vml" xmlns:wp14="http://schemas.microsoft.com/office/word/2010/wordprocessingDrawing" xmlns:wp="http://schemas.openxmlformats.org/drawingml/2006/wordprocessingDrawing" xmlns:w10="urn:schemas-microsoft-com:office:word" xmlns:w="http://schemas.openxmlformats.org/wordprocessingml/2006/main" xmlns:w14="http://schemas.microsoft.com/office/word/2010/wordml" xmlns:w15="http://schemas.microsoft.com/office/word/2012/wordml" xmlns:w16cex="http://schemas.microsoft.com/office/word/2018/wordml/cex" xmlns:w16cid="http://schemas.microsoft.com/office/word/2016/wordml/cid" xmlns:w16="http://schemas.microsoft.com/office/word/2018/wordml" xmlns:w16sdtdh="http://schemas.microsoft.com/office/word/2020/wordml/sdtdatahash" xmlns:w16se="http://schemas.microsoft.com/office/word/2015/wordml/symex" xmlns:wpg="http://schemas.microsoft.com/office/word/2010/wordprocessingGroup" xmlns:wpi="http://schemas.microsoft.com/office/word/2010/wordprocessingInk" xmlns:wne="http://schemas.microsoft.com/office/word/2006/wordml" xmlns:wps="http://schemas.microsoft.com/office/word/2010/wordprocessingShape" mc:Ignorable="w14 w15 w16se w16cid w16 w16cex w16sdtdh wp14">
   <w15:person w15:author="MARCOS HIROSHI YOGI CARVALHO .">
     <w15:presenceInfo w15:providerId="AD" w15:userId="S::marcos.carvalho@sptech.school::52b8097f-0cb7-4037-b020-4a2829545f6c"/>
   </w15:person>

</xml_diff>